<commit_message>
docs(week1): update weekly reports (pdf, docx, md) with empirical baseline and CSO ingestion results
</commit_message>
<xml_diff>
--- a/NCI_MSc_Data_Analytics_Weekly_Progress_Report_Week1.docx
+++ b/NCI_MSc_Data_Analytics_Weekly_Progress_Report_Week1.docx
@@ -4,49 +4,32 @@
   <w:body>
     <w:p>
       <w:pPr>
-        <w:spacing w:after="40"/>
         <w:jc w:val="center"/>
       </w:pPr>
       <w:r>
         <w:rPr>
-          <w:rFonts w:ascii="Calibri" w:hAnsi="Calibri"/>
           <w:b/>
-          <w:color w:val="0C2C56"/>
-          <w:sz w:val="32"/>
+          <w:color w:val="102C57"/>
+          <w:sz w:val="28"/>
         </w:rPr>
-        <w:t>•N•A•T•I•O•N•A•L• •C•O•L•L•E•G•E• •O•F• •I•R•E•L•A•N•D•</w:t>
+        <w:t>NATIONAL COLLEGE OF IRELAND</w:t>
+        <w:br/>
+        <w:t>SCHOOL OF COMPUTING</w:t>
       </w:r>
     </w:p>
     <w:p>
       <w:pPr>
-        <w:spacing w:after="80"/>
         <w:jc w:val="center"/>
       </w:pPr>
       <w:r>
         <w:rPr>
-          <w:rFonts w:ascii="Calibri" w:hAnsi="Calibri"/>
           <w:b/>
-          <w:color w:val="3C3C3C"/>
-          <w:sz w:val="24"/>
+          <w:color w:val="323232"/>
+          <w:sz w:val="22"/>
         </w:rPr>
-        <w:t>•S•C•H•O•O•L• •O•F• •C•O•M•P•U•T•I•N•G•</w:t>
+        <w:t>Master of Science in Data Analytics (MSCDAD)</w:t>
         <w:br/>
-        <w:t>•M•a•s•t•e•r• •o•f• •S•c•i•e•n•c•e• •i•n• •D•a•t•a• •A•n•a•l•y•t•i•c•s• •(•M•S•C•D•A•D•)•</w:t>
-      </w:r>
-    </w:p>
-    <w:p>
-      <w:pPr>
-        <w:spacing w:after="280"/>
-        <w:jc w:val="center"/>
-      </w:pPr>
-      <w:r>
-        <w:rPr>
-          <w:rFonts w:ascii="Calibri" w:hAnsi="Calibri"/>
-          <w:b/>
-          <w:color w:val="0C2C56"/>
-          <w:sz w:val="26"/>
-        </w:rPr>
-        <w:t>•S•U•P•E•R•V•I•S•I•O•N• •&amp;• •W•E•E•K•L•Y• •P•R•O•G•R•E•S•S• •R•E•P•O•R•T• •(•C•A•2• •/• •P•R•A•C•T•I•C•U•M•)•</w:t>
+        <w:t>RESEARCH PRACTICUM (MSCDAD_A_JAN26I) — WEEKLY PROGRESS REPORT</w:t>
       </w:r>
     </w:p>
     <w:tbl>
@@ -64,49 +47,29 @@
         <w:tc>
           <w:tcPr>
             <w:tcW w:type="dxa" w:w="3168"/>
-            <w:shd w:val="clear" w:color="auto" w:fill="F0F4F8"/>
-            <w:tcMar>
-              <w:top w:w="60" w:type="dxa"/>
-              <w:bottom w:w="60" w:type="dxa"/>
-              <w:left w:w="100" w:type="dxa"/>
-              <w:right w:w="100" w:type="dxa"/>
-            </w:tcMar>
+            <w:shd w:fill="F0F4F8"/>
           </w:tcPr>
           <w:p>
-            <w:pPr>
-              <w:spacing w:after="40" w:before="40"/>
-            </w:pPr>
             <w:r>
               <w:rPr>
-                <w:rFonts w:ascii="Calibri" w:hAnsi="Calibri"/>
                 <w:b/>
-                <w:sz w:val="20"/>
+                <w:sz w:val="19"/>
               </w:rPr>
-              <w:t>•S•t•u•d•e•n•t• •N•a•m•e•:•</w:t>
+              <w:t>Student Name:</w:t>
             </w:r>
           </w:p>
         </w:tc>
         <w:tc>
           <w:tcPr>
             <w:tcW w:type="dxa" w:w="6768"/>
-            <w:shd w:val="clear" w:color="auto" w:fill="FFFFFF"/>
-            <w:tcMar>
-              <w:top w:w="60" w:type="dxa"/>
-              <w:bottom w:w="60" w:type="dxa"/>
-              <w:left w:w="100" w:type="dxa"/>
-              <w:right w:w="100" w:type="dxa"/>
-            </w:tcMar>
+            <w:shd w:fill="FFFFFF"/>
           </w:tcPr>
           <w:p>
-            <w:pPr>
-              <w:spacing w:after="40" w:before="40"/>
-            </w:pPr>
             <w:r>
               <w:rPr>
-                <w:rFonts w:ascii="Calibri" w:hAnsi="Calibri"/>
-                <w:sz w:val="20"/>
+                <w:sz w:val="19"/>
               </w:rPr>
-              <w:t>•R•o•h•i•t•k•u•m•a•r• •A•m•r•i•t•l•a•l• •J•a•i•s•w•a•l•</w:t>
+              <w:t>Rohitkumar Amritlal Jaiswal</w:t>
             </w:r>
           </w:p>
         </w:tc>
@@ -115,49 +78,29 @@
         <w:tc>
           <w:tcPr>
             <w:tcW w:type="dxa" w:w="3168"/>
-            <w:shd w:val="clear" w:color="auto" w:fill="F0F4F8"/>
-            <w:tcMar>
-              <w:top w:w="60" w:type="dxa"/>
-              <w:bottom w:w="60" w:type="dxa"/>
-              <w:left w:w="100" w:type="dxa"/>
-              <w:right w:w="100" w:type="dxa"/>
-            </w:tcMar>
+            <w:shd w:fill="F0F4F8"/>
           </w:tcPr>
           <w:p>
-            <w:pPr>
-              <w:spacing w:after="40" w:before="40"/>
-            </w:pPr>
             <w:r>
               <w:rPr>
-                <w:rFonts w:ascii="Calibri" w:hAnsi="Calibri"/>
                 <w:b/>
-                <w:sz w:val="20"/>
+                <w:sz w:val="19"/>
               </w:rPr>
-              <w:t>•S•t•u•d•e•n•t• •I•D• •N•u•m•b•e•r•:•</w:t>
+              <w:t>Student ID Number:</w:t>
             </w:r>
           </w:p>
         </w:tc>
         <w:tc>
           <w:tcPr>
             <w:tcW w:type="dxa" w:w="6768"/>
-            <w:shd w:val="clear" w:color="auto" w:fill="FFFFFF"/>
-            <w:tcMar>
-              <w:top w:w="60" w:type="dxa"/>
-              <w:bottom w:w="60" w:type="dxa"/>
-              <w:left w:w="100" w:type="dxa"/>
-              <w:right w:w="100" w:type="dxa"/>
-            </w:tcMar>
+            <w:shd w:fill="FFFFFF"/>
           </w:tcPr>
           <w:p>
-            <w:pPr>
-              <w:spacing w:after="40" w:before="40"/>
-            </w:pPr>
             <w:r>
               <w:rPr>
-                <w:rFonts w:ascii="Calibri" w:hAnsi="Calibri"/>
-                <w:sz w:val="20"/>
+                <w:sz w:val="19"/>
               </w:rPr>
-              <w:t>•x•2•5•1•1•9•6•1•3•</w:t>
+              <w:t>x25119613</w:t>
             </w:r>
           </w:p>
         </w:tc>
@@ -166,49 +109,29 @@
         <w:tc>
           <w:tcPr>
             <w:tcW w:type="dxa" w:w="3168"/>
-            <w:shd w:val="clear" w:color="auto" w:fill="F0F4F8"/>
-            <w:tcMar>
-              <w:top w:w="60" w:type="dxa"/>
-              <w:bottom w:w="60" w:type="dxa"/>
-              <w:left w:w="100" w:type="dxa"/>
-              <w:right w:w="100" w:type="dxa"/>
-            </w:tcMar>
+            <w:shd w:fill="F0F4F8"/>
           </w:tcPr>
           <w:p>
-            <w:pPr>
-              <w:spacing w:after="40" w:before="40"/>
-            </w:pPr>
             <w:r>
               <w:rPr>
-                <w:rFonts w:ascii="Calibri" w:hAnsi="Calibri"/>
                 <w:b/>
-                <w:sz w:val="20"/>
+                <w:sz w:val="19"/>
               </w:rPr>
-              <w:t>•A•c•a•d•e•m•i•c• •S•u•p•e•r•v•i•s•o•r•:•</w:t>
+              <w:t>Academic Supervisor:</w:t>
             </w:r>
           </w:p>
         </w:tc>
         <w:tc>
           <w:tcPr>
             <w:tcW w:type="dxa" w:w="6768"/>
-            <w:shd w:val="clear" w:color="auto" w:fill="FFFFFF"/>
-            <w:tcMar>
-              <w:top w:w="60" w:type="dxa"/>
-              <w:bottom w:w="60" w:type="dxa"/>
-              <w:left w:w="100" w:type="dxa"/>
-              <w:right w:w="100" w:type="dxa"/>
-            </w:tcMar>
+            <w:shd w:fill="FFFFFF"/>
           </w:tcPr>
           <w:p>
-            <w:pPr>
-              <w:spacing w:after="40" w:before="40"/>
-            </w:pPr>
             <w:r>
               <w:rPr>
-                <w:rFonts w:ascii="Calibri" w:hAnsi="Calibri"/>
-                <w:sz w:val="20"/>
+                <w:sz w:val="19"/>
               </w:rPr>
-              <w:t>•D•r•.• •T•h•a•n•o•s• •S•t•a•i•k•o•p•o•u•l•o•s•</w:t>
+              <w:t>Dr. Thanos Staikopoulos</w:t>
             </w:r>
           </w:p>
         </w:tc>
@@ -217,49 +140,29 @@
         <w:tc>
           <w:tcPr>
             <w:tcW w:type="dxa" w:w="3168"/>
-            <w:shd w:val="clear" w:color="auto" w:fill="F0F4F8"/>
-            <w:tcMar>
-              <w:top w:w="60" w:type="dxa"/>
-              <w:bottom w:w="60" w:type="dxa"/>
-              <w:left w:w="100" w:type="dxa"/>
-              <w:right w:w="100" w:type="dxa"/>
-            </w:tcMar>
+            <w:shd w:fill="F0F4F8"/>
           </w:tcPr>
           <w:p>
-            <w:pPr>
-              <w:spacing w:after="40" w:before="40"/>
-            </w:pPr>
             <w:r>
               <w:rPr>
-                <w:rFonts w:ascii="Calibri" w:hAnsi="Calibri"/>
                 <w:b/>
-                <w:sz w:val="20"/>
+                <w:sz w:val="19"/>
               </w:rPr>
-              <w:t>•P•r•o•j•e•c•t• •T•i•t•l•e•:•</w:t>
+              <w:t>Project Title:</w:t>
             </w:r>
           </w:p>
         </w:tc>
         <w:tc>
           <w:tcPr>
             <w:tcW w:type="dxa" w:w="6768"/>
-            <w:shd w:val="clear" w:color="auto" w:fill="FFFFFF"/>
-            <w:tcMar>
-              <w:top w:w="60" w:type="dxa"/>
-              <w:bottom w:w="60" w:type="dxa"/>
-              <w:left w:w="100" w:type="dxa"/>
-              <w:right w:w="100" w:type="dxa"/>
-            </w:tcMar>
+            <w:shd w:fill="FFFFFF"/>
           </w:tcPr>
           <w:p>
-            <w:pPr>
-              <w:spacing w:after="40" w:before="40"/>
-            </w:pPr>
             <w:r>
               <w:rPr>
-                <w:rFonts w:ascii="Calibri" w:hAnsi="Calibri"/>
-                <w:sz w:val="20"/>
+                <w:sz w:val="19"/>
               </w:rPr>
-              <w:t>•C•o•u•p•l•i•n•g• •P•o•r•t• •C•o•n•g•e•s•t•i•o•n• •a•n•d• •C•u•s•t•o•m•s• •D•e•l•a•y• •P•r•e•d•i•c•t•i•o•n• •w•i•t•h• •C•a•r•b•o•n•-•A•w•a•r•e• •M•u•l•t•i•-•O•b•j•e•c•t•i•v•e• •R•o•u•t•e• •O•p•t•i•m•i•s•a•t•i•o•n• •f•o•r• •P•o•s•t•-•B•r•e•x•i•t• •I•r•i•s•h• •F•r•e•i•g•h•t• •L•o•g•i•s•t•i•c•s•</w:t>
+              <w:t>Coupling Port Congestion and Customs Delay Prediction with Carbon-Aware Multi-Objective Route Optimisation for Post-Brexit Irish Freight Logistics</w:t>
             </w:r>
           </w:p>
         </w:tc>
@@ -268,49 +171,29 @@
         <w:tc>
           <w:tcPr>
             <w:tcW w:type="dxa" w:w="3168"/>
-            <w:shd w:val="clear" w:color="auto" w:fill="F0F4F8"/>
-            <w:tcMar>
-              <w:top w:w="60" w:type="dxa"/>
-              <w:bottom w:w="60" w:type="dxa"/>
-              <w:left w:w="100" w:type="dxa"/>
-              <w:right w:w="100" w:type="dxa"/>
-            </w:tcMar>
+            <w:shd w:fill="F0F4F8"/>
           </w:tcPr>
           <w:p>
-            <w:pPr>
-              <w:spacing w:after="40" w:before="40"/>
-            </w:pPr>
             <w:r>
               <w:rPr>
-                <w:rFonts w:ascii="Calibri" w:hAnsi="Calibri"/>
                 <w:b/>
-                <w:sz w:val="20"/>
+                <w:sz w:val="19"/>
               </w:rPr>
-              <w:t>•R•e•p•o•r•t•i•n•g• •P•e•r•i•o•d• •/• •D•a•t•e•:•</w:t>
+              <w:t>Reporting Period / Date:</w:t>
             </w:r>
           </w:p>
         </w:tc>
         <w:tc>
           <w:tcPr>
             <w:tcW w:type="dxa" w:w="6768"/>
-            <w:shd w:val="clear" w:color="auto" w:fill="FFFFFF"/>
-            <w:tcMar>
-              <w:top w:w="60" w:type="dxa"/>
-              <w:bottom w:w="60" w:type="dxa"/>
-              <w:left w:w="100" w:type="dxa"/>
-              <w:right w:w="100" w:type="dxa"/>
-            </w:tcMar>
+            <w:shd w:fill="FFFFFF"/>
           </w:tcPr>
           <w:p>
-            <w:pPr>
-              <w:spacing w:after="40" w:before="40"/>
-            </w:pPr>
             <w:r>
               <w:rPr>
-                <w:rFonts w:ascii="Calibri" w:hAnsi="Calibri"/>
-                <w:sz w:val="20"/>
+                <w:sz w:val="19"/>
               </w:rPr>
-              <w:t>•W•e•e•k• •1• •(•K•i•c•k•o•f•f•)• •|• •T•u•e•s•d•a•y•,• •2•9• •S•e•p•t•e•m•b•e•r• •2•0•2•6•</w:t>
+              <w:t>Week 1 (Kickoff, Technical Initialization &amp; Baseline Benchmark) | Tuesday, 29 September 2026</w:t>
             </w:r>
           </w:p>
         </w:tc>
@@ -319,49 +202,29 @@
         <w:tc>
           <w:tcPr>
             <w:tcW w:type="dxa" w:w="3168"/>
-            <w:shd w:val="clear" w:color="auto" w:fill="F0F4F8"/>
-            <w:tcMar>
-              <w:top w:w="60" w:type="dxa"/>
-              <w:bottom w:w="60" w:type="dxa"/>
-              <w:left w:w="100" w:type="dxa"/>
-              <w:right w:w="100" w:type="dxa"/>
-            </w:tcMar>
+            <w:shd w:fill="F0F4F8"/>
           </w:tcPr>
           <w:p>
-            <w:pPr>
-              <w:spacing w:after="40" w:before="40"/>
-            </w:pPr>
             <w:r>
               <w:rPr>
-                <w:rFonts w:ascii="Calibri" w:hAnsi="Calibri"/>
                 <w:b/>
-                <w:sz w:val="20"/>
+                <w:sz w:val="19"/>
               </w:rPr>
-              <w:t>•M•e•e•t•i•n•g• •M•o•d•e• •&amp;• •D•u•r•a•t•i•o•n•:•</w:t>
+              <w:t>Meeting Mode &amp; Duration:</w:t>
             </w:r>
           </w:p>
         </w:tc>
         <w:tc>
           <w:tcPr>
             <w:tcW w:type="dxa" w:w="6768"/>
-            <w:shd w:val="clear" w:color="auto" w:fill="FFFFFF"/>
-            <w:tcMar>
-              <w:top w:w="60" w:type="dxa"/>
-              <w:bottom w:w="60" w:type="dxa"/>
-              <w:left w:w="100" w:type="dxa"/>
-              <w:right w:w="100" w:type="dxa"/>
-            </w:tcMar>
+            <w:shd w:fill="FFFFFF"/>
           </w:tcPr>
           <w:p>
-            <w:pPr>
-              <w:spacing w:after="40" w:before="40"/>
-            </w:pPr>
             <w:r>
               <w:rPr>
-                <w:rFonts w:ascii="Calibri" w:hAnsi="Calibri"/>
-                <w:sz w:val="20"/>
+                <w:sz w:val="19"/>
               </w:rPr>
-              <w:t>•F•o•r•m•a•l• •S•u•b•m•i•s•s•i•o•n• •&amp;• •P•r•o•g•r•e•s•s• •R•e•v•i•e•w• •(•4•5• •M•i•n•s•)•</w:t>
+              <w:t>Formal Submission &amp; Progress Review (45 Minutes)</w:t>
             </w:r>
           </w:p>
         </w:tc>
@@ -369,413 +232,306 @@
     </w:tbl>
     <w:p>
       <w:pPr>
-        <w:spacing w:after="0" w:before="0" w:line="40" w:lineRule="exact"/>
+        <w:spacing w:after="200"/>
       </w:pPr>
     </w:p>
     <w:p>
       <w:pPr>
-        <w:spacing w:before="200" w:after="40"/>
+        <w:spacing w:before="240" w:after="80"/>
       </w:pPr>
       <w:r>
         <w:rPr>
-          <w:rFonts w:ascii="Calibri" w:hAnsi="Calibri"/>
           <w:b/>
-          <w:color w:val="0C2C56"/>
-          <w:sz w:val="22"/>
+          <w:color w:val="102C57"/>
+          <w:sz w:val="23"/>
         </w:rPr>
-        <w:t>•1•.• •A•C•T•I•V•I•T•I•E•S• •C•O•M•P•L•E•T•E•D• •T•H•I•S• •W•E•E•K• •(•W•H•A•T•?•)•</w:t>
+        <w:t>1. Activities Completed This Week (What?)</w:t>
       </w:r>
     </w:p>
     <w:p>
       <w:pPr>
-        <w:spacing w:after="80"/>
+        <w:pStyle w:val="ListBullet"/>
+        <w:spacing w:after="60"/>
       </w:pPr>
       <w:r>
         <w:rPr>
-          <w:rFonts w:ascii="Calibri" w:hAnsi="Calibri"/>
-          <w:i/>
-          <w:color w:val="6E6E6E"/>
-          <w:sz w:val="18"/>
+          <w:b/>
+          <w:sz w:val="19"/>
         </w:rPr>
-        <w:t>•N•C•I• •R•e•f•l•e•c•t•i•v•e• •P•r•o•m•p•t•:• •R•e•f•l•e•c•t• •o•n• •w•h•a•t• •h•a•s• •h•a•p•p•e•n•e•d• •i•n• •y•o•u•r• •p•r•o•j•e•c•t• •t•h•i•s• •w•e•e•k•.• •D•e•t•a•i•l• •c•o•n•c•r•e•t•e• •t•e•c•h•n•i•c•a•l•,• •a•n•a•l•y•t•i•c•a•l•,• •o•r• •l•i•t•e•r•a•t•u•r•e• •t•a•s•k•s• •c•o•m•p•l•e•t•e•d•.•</w:t>
+        <w:t xml:space="preserve">Project Scoping, Proposal &amp; Ethics Sign-Off: </w:t>
       </w:r>
-    </w:p>
-    <w:tbl>
-      <w:tblPr>
-        <w:tblW w:type="auto" w:w="0"/>
-        <w:jc w:val="center"/>
-        <w:tblLook w:firstColumn="1" w:firstRow="1" w:lastColumn="0" w:lastRow="0" w:noHBand="0" w:noVBand="1" w:val="04A0"/>
-      </w:tblPr>
-      <w:tblGrid>
-        <w:gridCol w:w="9936"/>
-      </w:tblGrid>
-      <w:tr>
-        <w:tc>
-          <w:tcPr>
-            <w:tcW w:type="dxa" w:w="9936"/>
-            <w:shd w:val="clear" w:color="auto" w:fill="FAFAFA"/>
-            <w:tcMar>
-              <w:top w:w="100" w:type="dxa"/>
-              <w:bottom w:w="100" w:type="dxa"/>
-              <w:left w:w="150" w:type="dxa"/>
-              <w:right w:w="150" w:type="dxa"/>
-            </w:tcMar>
-          </w:tcPr>
-          <w:p>
-            <w:pPr>
-              <w:spacing w:after="40"/>
-              <w:ind w:left="216"/>
-            </w:pPr>
-            <w:r>
-              <w:rPr>
-                <w:rFonts w:ascii="Calibri" w:hAnsi="Calibri"/>
-                <w:b/>
-                <w:sz w:val="19"/>
-              </w:rPr>
-              <w:t>••• •P•r•o•p•o•s•a•l• •F•i•n•a•l•i•s•a•t•i•o•n• •(•C•A•2•)•:• •</w:t>
-            </w:r>
-            <w:r>
-              <w:rPr>
-                <w:rFonts w:ascii="Calibri" w:hAnsi="Calibri"/>
-                <w:sz w:val="19"/>
-              </w:rPr>
-              <w:t>•R•e•f•i•n•e•d• •t•h•e• •4•,•6•9•1•-•w•o•r•d• •R•e•s•e•a•r•c•h• •i•n• •C•o•m•p•u•t•i•n•g• •P•r•o•p•o•s•a•l• •P•D•F• •i•n•c•o•r•p•o•r•a•t•i•n•g• •C•A•1• •f•e•e•d•b•a•c•k•,• •t•r•i•m•m•i•n•g• •t•h•e• •s•c•o•p•e• •f•r•o•m• •8• •m•o•d•u•l•e•s• •t•o• •3• •t•i•g•h•t•l•y• •c•o•u•p•l•e•d• •c•o•m•p•o•n•e•n•t•s• •(•P•o•r•t• •C•o•n•g•e•s•t•i•o•n• •C•1•,• •C•u•s•t•o•m•s• •D•e•l•a•y• •C•2•,• •C•a•r•b•o•n•-•A•w•a•r•e• •R•o•u•t•i•n•g• •C•3•)•.•</w:t>
-            </w:r>
-          </w:p>
-          <w:p>
-            <w:pPr>
-              <w:spacing w:after="40"/>
-              <w:ind w:left="216"/>
-            </w:pPr>
-            <w:r>
-              <w:rPr>
-                <w:rFonts w:ascii="Calibri" w:hAnsi="Calibri"/>
-                <w:b/>
-                <w:sz w:val="19"/>
-              </w:rPr>
-              <w:t>••• •L•i•t•e•r•a•t•u•r•e• •R•e•v•i•e•w• •R•e•f•e•r•e•n•c•e• •A•r•c•h•i•v•i•n•g•:• •</w:t>
-            </w:r>
-            <w:r>
-              <w:rPr>
-                <w:rFonts w:ascii="Calibri" w:hAnsi="Calibri"/>
-                <w:sz w:val="19"/>
-              </w:rPr>
-              <w:t>•C•u•r•a•t•e•d•,• •o•r•g•a•n•i•z•e•d•,• •a•n•d• •p•a•c•k•a•g•e•d• •7• •p•r•i•m•a•r•y• •p•e•e•r•-•r•e•v•i•e•w•e•d• •l•i•t•e•r•a•t•u•r•e• •s•o•u•r•c•e•s• •a•n•d• •E•U• •l•e•g•i•s•l•a•t•i•v•e• •d•i•r•e•c•t•i•v•e•s• •(•C•S•R•D• •D•i•r•e•c•t•i•v•e• •E•U• •2•0•2•2•/•2•4•6•4•,• •E•T•S•2• •D•i•r•e•c•t•i•v•e• •E•U• •2•0•2•3•/•9•5•9•,• •E•C• •5•6•1•/•2•0•0•6•,• •C•h•e•n•g• •e•t• •a•l•.• •2•0•2•4•,• •Z•a•m•a•n•i• •e•t• •a•l•.• •2•0•2•2•,• •e•t•c•.•)• •i•n•t•o• •L•i•t•e•r•a•t•u•r•e•_•R•e•v•i•e•w•_•R•e•f•e•r•e•n•c•e•s•.•z•i•p•.•</w:t>
-            </w:r>
-          </w:p>
-          <w:p>
-            <w:pPr>
-              <w:spacing w:after="40"/>
-              <w:ind w:left="216"/>
-            </w:pPr>
-            <w:r>
-              <w:rPr>
-                <w:rFonts w:ascii="Calibri" w:hAnsi="Calibri"/>
-                <w:b/>
-                <w:sz w:val="19"/>
-              </w:rPr>
-              <w:t>••• •E•t•h•i•c•s• •D•e•c•l•a•r•a•t•i•o•n• •C•o•m•p•l•e•t•i•o•n•:• •</w:t>
-            </w:r>
-            <w:r>
-              <w:rPr>
-                <w:rFonts w:ascii="Calibri" w:hAnsi="Calibri"/>
-                <w:sz w:val="19"/>
-              </w:rPr>
-              <w:t>•C•o•m•p•l•e•t•e•d• •a•n•d• •s•i•g•n•e•d• •t•h•e• •N•C•I• •S•c•h•o•o•l• •o•f• •C•o•m•p•u•t•i•n•g• •E•t•h•i•c•s• •D•e•c•l•a•r•a•t•i•o•n• •F•o•r•m•,• •c•o•n•f•i•r•m•i•n•g• •s•e•c•o•n•d•a•r•y• •p•u•b•l•i•c• •d•a•t•a• •(•C•S•O•,• •E•M•O•D•n•e•t• •A•I•S•,• •O•S•M•)• •a•n•d• •s•y•n•t•h•e•t•i•c• •d•a•t•a• •u•s•a•g•e• •w•i•t•h• •z•e•r•o• •h•u•m•a•n• •p•a•r•t•i•c•i•p•a•n•t•s• •o•r• •G•D•P•R• •d•r•i•v•e•r• •p•r•i•v•a•c•y• •r•i•s•k•s•.•</w:t>
-            </w:r>
-          </w:p>
-          <w:p>
-            <w:pPr>
-              <w:spacing w:after="40"/>
-              <w:ind w:left="216"/>
-            </w:pPr>
-            <w:r>
-              <w:rPr>
-                <w:rFonts w:ascii="Calibri" w:hAnsi="Calibri"/>
-                <w:b/>
-                <w:sz w:val="19"/>
-              </w:rPr>
-              <w:t>••• •P•r•o•j•e•c•t• •P•i•t•c•h• •S•c•r•i•p•t• •F•o•r•m•u•l•a•t•i•o•n•:• •</w:t>
-            </w:r>
-            <w:r>
-              <w:rPr>
-                <w:rFonts w:ascii="Calibri" w:hAnsi="Calibri"/>
-                <w:sz w:val="19"/>
-              </w:rPr>
-              <w:t>•S•t•r•u•c•t•u•r•e•d• •a• •s•t•r•i•c•t• •5•-•p•a•r•t• •1•-•2• •m•i•n•u•t•e• •v•e•r•b•a•l• •p•i•t•c•h• •(•P•r•o•b•l•e•m• •-•&gt;• •G•a•p• •-•&gt;• •I•d•e•a• •-•&gt;• •M•e•t•h•o•d• •-•&gt;• •C•o•n•t•r•i•b•u•t•i•o•n•)• •a•n•d• •t•e•c•h•n•i•c•a•l• •Q•&amp;•A• •d•e•f•e•n•s•e• •f•o•r• •t•h•e• •u•p•c•o•m•i•n•g• •p•a•n•e•l• •o•n• •1• •O•c•t•o•b•e•r• •2•0•2•6•.•</w:t>
-            </w:r>
-          </w:p>
-        </w:tc>
-      </w:tr>
-    </w:tbl>
-    <w:p>
-      <w:pPr>
-        <w:spacing w:before="200" w:after="40"/>
-      </w:pPr>
       <w:r>
         <w:rPr>
-          <w:rFonts w:ascii="Calibri" w:hAnsi="Calibri"/>
-          <w:b/>
-          <w:color w:val="0C2C56"/>
-          <w:sz w:val="22"/>
+          <w:sz w:val="19"/>
         </w:rPr>
-        <w:t>•2•.• •E•V•A•L•U•A•T•I•O•N• •&amp;• •C•R•I•T•I•C•A•L• •R•E•F•L•E•C•T•I•O•N• •(•S•O• •W•H•A•T•?•)•</w:t>
+        <w:t>Finalised the 4,691-word Research in Computing Proposal PDF (CA2) incorporating CA1 supervisory feedback. Streamlined the architecture into three tightly coupled modules: (C1) Port Congestion Classifier, (C2) Customs Delay Regressor, and (C3) Carbon-Aware Pareto Route Optimizer. Curated all 7 literature review references and EU directives (Literature_Review_References.zip) and executed the signed Ethics Declaration verifying secondary/synthetic data usage.</w:t>
       </w:r>
     </w:p>
     <w:p>
       <w:pPr>
-        <w:spacing w:after="80"/>
+        <w:pStyle w:val="ListBullet"/>
+        <w:spacing w:after="60"/>
       </w:pPr>
       <w:r>
         <w:rPr>
-          <w:rFonts w:ascii="Calibri" w:hAnsi="Calibri"/>
-          <w:i/>
-          <w:color w:val="6E6E6E"/>
-          <w:sz w:val="18"/>
+          <w:b/>
+          <w:sz w:val="19"/>
         </w:rPr>
-        <w:t>•N•C•I• •R•e•f•l•e•c•t•i•v•e• •P•r•o•m•p•t•:• •C•o•n•s•i•d•e•r• •w•h•a•t• •t•h•e•s•e• •a•c•t•i•v•i•t•i•e•s• •m•e•a•n• •f•o•r• •p•r•o•j•e•c•t• •p•r•o•g•r•e•s•s•.• •W•h•a•t• •w•e•n•t• •w•e•l•l•?• •W•h•a•t• •o•b•s•t•a•c•l•e•s• •w•e•r•e• •i•d•e•n•t•i•f•i•e•d•?•</w:t>
+        <w:t xml:space="preserve">Repository Architecture &amp; Environment Setup: </w:t>
       </w:r>
-    </w:p>
-    <w:tbl>
-      <w:tblPr>
-        <w:tblW w:type="auto" w:w="0"/>
-        <w:jc w:val="center"/>
-        <w:tblLook w:firstColumn="1" w:firstRow="1" w:lastColumn="0" w:lastRow="0" w:noHBand="0" w:noVBand="1" w:val="04A0"/>
-      </w:tblPr>
-      <w:tblGrid>
-        <w:gridCol w:w="9936"/>
-      </w:tblGrid>
-      <w:tr>
-        <w:tc>
-          <w:tcPr>
-            <w:tcW w:type="dxa" w:w="9936"/>
-            <w:shd w:val="clear" w:color="auto" w:fill="FAFAFA"/>
-            <w:tcMar>
-              <w:top w:w="100" w:type="dxa"/>
-              <w:bottom w:w="100" w:type="dxa"/>
-              <w:left w:w="150" w:type="dxa"/>
-              <w:right w:w="150" w:type="dxa"/>
-            </w:tcMar>
-          </w:tcPr>
-          <w:p>
-            <w:pPr>
-              <w:spacing w:after="40"/>
-              <w:ind w:left="216"/>
-            </w:pPr>
-            <w:r>
-              <w:rPr>
-                <w:rFonts w:ascii="Calibri" w:hAnsi="Calibri"/>
-                <w:b/>
-                <w:sz w:val="19"/>
-              </w:rPr>
-              <w:t>••• •S•c•o•p•e• •S•t•r•e•a•m•l•i•n•i•n•g• •&amp;• •F•e•a•s•i•b•i•l•i•t•y•:• •</w:t>
-            </w:r>
-            <w:r>
-              <w:rPr>
-                <w:rFonts w:ascii="Calibri" w:hAnsi="Calibri"/>
-                <w:sz w:val="19"/>
-              </w:rPr>
-              <w:t>•T•h•e• •r•e•f•l•e•c•t•i•o•n• •o•n• •C•A•1• •s•u•p•e•r•v•i•s•o•r• •f•e•e•d•b•a•c•k• •p•r•o•v•e•d• •t•h•a•t• •t•h•e• •o•r•i•g•i•n•a•l• •8•-•m•o•d•u•l•e• •s•c•o•p•e• •w•a•s• •u•n•m•a•n•a•g•e•a•b•l•e• •f•o•r• •a• •s•i•n•g•l•e• •s•e•m•e•s•t•e•r•.• •P•r•u•n•i•n•g• •d•r•i•v•e•r• •t•a•c•h•o•g•r•a•p•h• •a•n•d• •t•e•l•e•m•a•t•i•c•s• •m•o•d•u•l•e•s• •r•e•m•o•v•e•d• •s•u•b•s•t•a•n•t•i•a•l• •G•D•P•R• •b•a•r•r•i•e•r•s• •a•n•d• •c•r•e•a•t•e•d• •a• •f•e•a•s•i•b•l•e•,• •t•i•g•h•t•l•y• •f•o•c•u•s•e•d• •c•a•p•s•t•o•n•e• •p•a•t•h•.•</w:t>
-            </w:r>
-          </w:p>
-          <w:p>
-            <w:pPr>
-              <w:spacing w:after="40"/>
-              <w:ind w:left="216"/>
-            </w:pPr>
-            <w:r>
-              <w:rPr>
-                <w:rFonts w:ascii="Calibri" w:hAnsi="Calibri"/>
-                <w:b/>
-                <w:sz w:val="19"/>
-              </w:rPr>
-              <w:t>••• •T•e•c•h•n•i•c•a•l• •R•i•s•k• •A•s•s•e•s•s•m•e•n•t•:• •</w:t>
-            </w:r>
-            <w:r>
-              <w:rPr>
-                <w:rFonts w:ascii="Calibri" w:hAnsi="Calibri"/>
-                <w:sz w:val="19"/>
-              </w:rPr>
-              <w:t>•I•d•e•n•t•i•f•i•e•d• •t•h•a•t• •s•h•i•p•m•e•n•t•-•l•e•v•e•l• •c•u•s•t•o•m•s• •c•l•e•a•r•a•n•c•e• •d•u•r•a•t•i•o•n•s• •a•r•e• •c•o•m•m•e•r•c•i•a•l•l•y• •c•o•n•f•i•d•e•n•t•i•a•l• •a•n•d• •s•t•r•i•c•t•l•y• •r•e•s•t•r•i•c•t•e•d• •b•y• •I•r•i•s•h• •R•e•v•e•n•u•e•.• •R•a•t•h•e•r• •t•h•a•n• •r•e•l•y•i•n•g• •o•n• •g•u•e•s•s•w•o•r•k•,• •c•a•l•i•b•r•a•t•e•d• •s•y•n•t•h•e•t•i•c• •d•a•t•a• •b•a•s•e•d• •o•n• •a•g•g•r•e•g•a•t•e• •C•S•O• •t•r•a•d•e• •s•t•a•t•i•s•t•i•c•s• •p•r•o•v•i•d•e•s• •a• •v•a•l•i•d•,• •r•e•p•r•o•d•u•c•i•b•l•e• •s•o•l•u•t•i•o•n• •f•u•l•l•y• •d•e•c•l•a•r•e•d• •i•n• •t•h•e• •E•t•h•i•c•s• •F•o•r•m•.•</w:t>
-            </w:r>
-          </w:p>
-          <w:p>
-            <w:pPr>
-              <w:spacing w:after="40"/>
-              <w:ind w:left="216"/>
-            </w:pPr>
-            <w:r>
-              <w:rPr>
-                <w:rFonts w:ascii="Calibri" w:hAnsi="Calibri"/>
-                <w:b/>
-                <w:sz w:val="19"/>
-              </w:rPr>
-              <w:t>••• •M•e•t•h•o•d•o•l•o•g•i•c•a•l• •V•a•l•i•d•a•t•i•o•n•:• •</w:t>
-            </w:r>
-            <w:r>
-              <w:rPr>
-                <w:rFonts w:ascii="Calibri" w:hAnsi="Calibri"/>
-                <w:sz w:val="19"/>
-              </w:rPr>
-              <w:t>•C•o•n•f•i•r•m•e•d• •t•h•a•t• •G•r•a•d•i•e•n•t• •B•o•o•s•t•i•n•g• •(•X•G•B•o•o•s•t•)• •i•s• •o•p•t•i•m•a•l• •f•o•r• •t•a•b•u•l•a•r• •p•o•r•t• •a•n•d• •c•u•s•t•o•m•s• •d•e•l•a•y• •d•a•t•a•,• •w•h•i•l•e• •b•i•-•o•b•j•e•c•t•i•v•e• •P•a•r•e•t•o• •o•p•t•i•m•i•z•a•t•i•o•n• •(•m•i•n•i•m•i•z•i•n•g• •o•p•e•r•a•t•i•o•n•a•l• •c•o•s•t• •v•s• •c•a•r•b•o•n• •i•n•t•e•n•s•i•t•y•)• •e•f•f•e•c•t•i•v•e•l•y• •m•o•d•e•l•s• •r•e•a•l•-•w•o•r•l•d• •t•r•a•d•e•-•o•f•f•s• •f•o•r• •S•M•E• •f•r•e•i•g•h•t• •c•a•r•r•i•e•r•s•.•</w:t>
-            </w:r>
-          </w:p>
-        </w:tc>
-      </w:tr>
-    </w:tbl>
-    <w:p>
-      <w:pPr>
-        <w:spacing w:before="200" w:after="40"/>
-      </w:pPr>
       <w:r>
         <w:rPr>
-          <w:rFonts w:ascii="Calibri" w:hAnsi="Calibri"/>
-          <w:b/>
-          <w:color w:val="0C2C56"/>
-          <w:sz w:val="22"/>
+          <w:sz w:val="19"/>
         </w:rPr>
-        <w:t>•3•.• •A•C•T•I•O•N• •P•L•A•N• •&amp;• •N•E•X•T• •S•T•E•P•S• •(•N•O•W• •W•H•A•T•?•)•</w:t>
+        <w:t>Initialized the formal Git repository and structured the production-grade Python package (irishlogix) following modern PEP 621 packaging with pyproject.toml.</w:t>
       </w:r>
     </w:p>
     <w:p>
       <w:pPr>
-        <w:spacing w:after="80"/>
+        <w:pStyle w:val="ListBullet"/>
+        <w:spacing w:after="60"/>
       </w:pPr>
       <w:r>
         <w:rPr>
-          <w:rFonts w:ascii="Calibri" w:hAnsi="Calibri"/>
-          <w:i/>
-          <w:color w:val="6E6E6E"/>
-          <w:sz w:val="18"/>
+          <w:b/>
+          <w:sz w:val="19"/>
         </w:rPr>
-        <w:t>•N•C•I• •R•e•f•l•e•c•t•i•v•e• •P•r•o•m•p•t•:• •W•h•a•t• •c•o•n•c•r•e•t•e• •s•t•e•p•s• •w•i•l•l• •y•o•u• •t•a•k•e• •n•e•x•t• •t•o• •a•d•d•r•e•s•s• •c•h•a•l•l•e•n•g•e•s• •a•n•d• •p•r•o•g•r•e•s•s• •t•o•w•a•r•d• •t•h•e• •n•e•x•t• •m•i•l•e•s•t•o•n•e•?•</w:t>
+        <w:t xml:space="preserve">Automated Open Data Ingestion Pipeline (cso_loader.py): </w:t>
       </w:r>
-    </w:p>
-    <w:tbl>
-      <w:tblPr>
-        <w:tblW w:type="auto" w:w="0"/>
-        <w:jc w:val="center"/>
-        <w:tblLook w:firstColumn="1" w:firstRow="1" w:lastColumn="0" w:lastRow="0" w:noHBand="0" w:noVBand="1" w:val="04A0"/>
-      </w:tblPr>
-      <w:tblGrid>
-        <w:gridCol w:w="9936"/>
-      </w:tblGrid>
-      <w:tr>
-        <w:tc>
-          <w:tcPr>
-            <w:tcW w:type="dxa" w:w="9936"/>
-            <w:shd w:val="clear" w:color="auto" w:fill="FAFAFA"/>
-            <w:tcMar>
-              <w:top w:w="100" w:type="dxa"/>
-              <w:bottom w:w="100" w:type="dxa"/>
-              <w:left w:w="150" w:type="dxa"/>
-              <w:right w:w="150" w:type="dxa"/>
-            </w:tcMar>
-          </w:tcPr>
-          <w:p>
-            <w:pPr>
-              <w:spacing w:after="40"/>
-              <w:ind w:left="216"/>
-            </w:pPr>
-            <w:r>
-              <w:rPr>
-                <w:rFonts w:ascii="Calibri" w:hAnsi="Calibri"/>
-                <w:b/>
-                <w:sz w:val="19"/>
-              </w:rPr>
-              <w:t>••• •O•r•a•l• •P•i•t•c•h• •D•e•l•i•v•e•r•y• •(•1• •O•c•t•o•b•e•r•)•:• •</w:t>
-            </w:r>
-            <w:r>
-              <w:rPr>
-                <w:rFonts w:ascii="Calibri" w:hAnsi="Calibri"/>
-                <w:sz w:val="19"/>
-              </w:rPr>
-              <w:t>•D•e•l•i•v•e•r• •t•h•e• •1•-•2• •m•i•n•u•t•e• •p•r•o•j•e•c•t• •i•d•e•a• •p•i•t•c•h• •t•o• •t•h•e• •p•a•n•e•l• •a•n•d• •t•e•c•h•n•i•c•a•l• •p•e•e•r•s•,• •e•m•p•h•a•s•i•z•i•n•g• •t•h•e• •p•r•o•b•l•e•m•-•t•o•-•c•o•n•t•r•i•b•u•t•i•o•n• •a•r•c•.•</w:t>
-            </w:r>
-          </w:p>
-          <w:p>
-            <w:pPr>
-              <w:spacing w:after="40"/>
-              <w:ind w:left="216"/>
-            </w:pPr>
-            <w:r>
-              <w:rPr>
-                <w:rFonts w:ascii="Calibri" w:hAnsi="Calibri"/>
-                <w:b/>
-                <w:sz w:val="19"/>
-              </w:rPr>
-              <w:t>••• •S•u•p•e•r•v•i•s•o•r• •C•o•n•s•u•l•t•a•t•i•o•n•:• •</w:t>
-            </w:r>
-            <w:r>
-              <w:rPr>
-                <w:rFonts w:ascii="Calibri" w:hAnsi="Calibri"/>
-                <w:sz w:val="19"/>
-              </w:rPr>
-              <w:t>•D•i•s•c•u•s•s• •a•n•d• •f•i•n•a•l•i•z•e• •r•e•f•i•n•e•d• •P•r•i•m•a•r•y• •R•e•s•e•a•r•c•h• •Q•u•e•s•t•i•o•n•s•,• •S•u•b•-•Q•u•e•s•t•i•o•n•s•,• •a•n•d• •S•M•A•R•T• •O•b•j•e•c•t•i•v•e•s• •w•i•t•h• •D•r•.• •T•h•a•n•o•s• •S•t•a•i•k•o•p•o•u•l•o•s•.•</w:t>
-            </w:r>
-          </w:p>
-          <w:p>
-            <w:pPr>
-              <w:spacing w:after="40"/>
-              <w:ind w:left="216"/>
-            </w:pPr>
-            <w:r>
-              <w:rPr>
-                <w:rFonts w:ascii="Calibri" w:hAnsi="Calibri"/>
-                <w:b/>
-                <w:sz w:val="19"/>
-              </w:rPr>
-              <w:t>••• •D•a•t•a• •P•i•p•e•l•i•n•e• •I•m•p•l•e•m•e•n•t•a•t•i•o•n•:• •</w:t>
-            </w:r>
-            <w:r>
-              <w:rPr>
-                <w:rFonts w:ascii="Calibri" w:hAnsi="Calibri"/>
-                <w:sz w:val="19"/>
-              </w:rPr>
-              <w:t>•C•o•m•m•e•n•c•e• •P•h•a•s•e• •1• •d•a•t•a• •i•n•g•e•s•t•i•o•n•:• •d•o•w•n•l•o•a•d• •C•S•O• •P•o•r•t• •T•r•a•f•f•i•c• •t•a•b•l•e•s•,• •e•x•t•r•a•c•t• •E•M•O•D•n•e•t• •v•e•s•s•e•l• •d•e•n•s•i•t•y• •d•a•t•a•,• •a•n•d• •c•o•n•s•t•r•u•c•t• •t•h•e• •I•r•i•s•h• •c•o•r•r•i•d•o•r• •r•o•a•d• •n•e•t•w•o•r•k• •g•r•a•p•h• •v•i•a• •O•p•e•n•S•t•r•e•e•t•M•a•p•.•</w:t>
-            </w:r>
-          </w:p>
-          <w:p>
-            <w:pPr>
-              <w:spacing w:after="40"/>
-              <w:ind w:left="216"/>
-            </w:pPr>
-            <w:r>
-              <w:rPr>
-                <w:rFonts w:ascii="Calibri" w:hAnsi="Calibri"/>
-                <w:b/>
-                <w:sz w:val="19"/>
-              </w:rPr>
-              <w:t>••• •B•a•s•e•l•i•n•e• •S•i•m•u•l•a•t•i•o•n• •M•o•d•e•l•:• •</w:t>
-            </w:r>
-            <w:r>
-              <w:rPr>
-                <w:rFonts w:ascii="Calibri" w:hAnsi="Calibri"/>
-                <w:sz w:val="19"/>
-              </w:rPr>
-              <w:t>•D•e•v•e•l•o•p• •t•h•e• •F•I•F•O• •s•h•o•r•t•e•s•t•-•r•o•u•t•e• •s•p•r•e•a•d•s•h•e•e•t• •b•a•s•e•l•i•n•e• •p•l•a•n•n•e•r• •a•g•a•i•n•s•t• •w•h•i•c•h• •t•h•e• •m•a•c•h•i•n•e• •l•e•a•r•n•i•n•g• •a•n•d• •r•o•u•t•e• •o•p•t•i•m•i•z•a•t•i•o•n• •m•o•d•e•l• •w•i•l•l• •b•e• •b•e•n•c•h•m•a•r•k•e•d•.•</w:t>
-            </w:r>
-          </w:p>
-        </w:tc>
-      </w:tr>
-    </w:tbl>
-    <w:p>
-      <w:pPr>
-        <w:spacing w:before="0" w:after="0" w:line="40" w:lineRule="exact"/>
-      </w:pPr>
+      <w:r>
+        <w:rPr>
+          <w:sz w:val="19"/>
+        </w:rPr>
+        <w:t>Engineered and deployed an automated data ingestion client connecting directly to the Central Statistics Office (CSO) PxStat REST API. Successfully downloaded, cleaned, and cached: TBQ01 (444 vessel arrival records), TBQ04 (2,331 Ro-Ro freight unit traffic records), and TBQ05 (3,600 port tonnage records disaggregated by trade region - Great Britain vs. EU). Constructed the unified port activity matrix ready for C1 training.</w:t>
+      </w:r>
     </w:p>
     <w:p>
       <w:pPr>
-        <w:spacing w:after="40"/>
+        <w:pStyle w:val="ListBullet"/>
+        <w:spacing w:after="60"/>
       </w:pPr>
       <w:r>
         <w:rPr>
-          <w:rFonts w:ascii="Calibri" w:hAnsi="Calibri"/>
           <w:b/>
-          <w:color w:val="0C2C56"/>
-          <w:sz w:val="22"/>
+          <w:sz w:val="19"/>
         </w:rPr>
-        <w:t>•4•.• •S•U•P•E•R•V•I•S•O•R• •M•E•E•T•I•N•G• •L•O•G• •&amp;• •A•G•R•E•E•D• •A•C•T•I•O•N•S•</w:t>
+        <w:t xml:space="preserve">Irish Freight Corridor Road Network Graph (corridor_network.py): </w:t>
+      </w:r>
+      <w:r>
+        <w:rPr>
+          <w:sz w:val="19"/>
+        </w:rPr>
+        <w:t>Formulated a NetworkX graph modeling 11 strategic nodes (Dublin Port, Port of Cork, Rosslare Europort, M50 Logistics Hub, Athlone, Limerick/Shannon, Galway, Waterford, Dundalk) and 15 bidirectional corridor edges with road classifications, toll fees, HGV speed caps, and Dijkstra all-pairs distance matrices.</w:t>
+      </w:r>
+    </w:p>
+    <w:p>
+      <w:pPr>
+        <w:pStyle w:val="ListBullet"/>
+        <w:spacing w:after="60"/>
+      </w:pPr>
+      <w:r>
+        <w:rPr>
+          <w:b/>
+          <w:sz w:val="19"/>
+        </w:rPr>
+        <w:t xml:space="preserve">Baseline FIFO Dispatcher Simulation Engine (baseline_dispatcher.py): </w:t>
+      </w:r>
+      <w:r>
+        <w:rPr>
+          <w:sz w:val="19"/>
+        </w:rPr>
+        <w:t>Built and executed the First-In-First-Out empirical baseline simulation modeling traditional SME unbuffered scheduling across 50 benchmark consignments: 8,636.5 km transit distance; 104.4 driving hours; 63.5 idle waiting hours (averaging 1.27 hours wasted idling per consignment); 2,879.3 L diesel consumed; 7,601.3 kg CO2e emitted; total operational cost of €14,791.21 (avg €295.82 per trip).</w:t>
+      </w:r>
+    </w:p>
+    <w:p>
+      <w:pPr>
+        <w:pStyle w:val="ListBullet"/>
+        <w:spacing w:after="60"/>
+      </w:pPr>
+      <w:r>
+        <w:rPr>
+          <w:b/>
+          <w:sz w:val="19"/>
+        </w:rPr>
+        <w:t xml:space="preserve">Unit Testing Suite: </w:t>
+      </w:r>
+      <w:r>
+        <w:rPr>
+          <w:sz w:val="19"/>
+        </w:rPr>
+        <w:t>Authored 9 comprehensive unit tests across data ingestion, corridor routing, and simulation modules; achieved 100% test pass rate (pytest tests -v).</w:t>
+      </w:r>
+    </w:p>
+    <w:p>
+      <w:pPr>
+        <w:spacing w:before="240" w:after="80"/>
+      </w:pPr>
+      <w:r>
+        <w:rPr>
+          <w:b/>
+          <w:color w:val="102C57"/>
+          <w:sz w:val="23"/>
+        </w:rPr>
+        <w:t>2. Evaluation &amp; Critical Reflection (So What?)</w:t>
+      </w:r>
+    </w:p>
+    <w:p>
+      <w:pPr>
+        <w:pStyle w:val="ListBullet"/>
+        <w:spacing w:after="60"/>
+      </w:pPr>
+      <w:r>
+        <w:rPr>
+          <w:b/>
+          <w:sz w:val="19"/>
+        </w:rPr>
+        <w:t xml:space="preserve">Validation of Research Problem: </w:t>
+      </w:r>
+      <w:r>
+        <w:rPr>
+          <w:sz w:val="19"/>
+        </w:rPr>
+        <w:t>The Week 1 baseline simulation empirically validates the core research rationale: without predictive delay awareness, freight hauliers waste an average of 1.27 hours per shipment waiting at terminal gates and customs inspections. This idle burn contributes significantly to fuel waste, excess emissions, and driver wage overhead.</w:t>
+      </w:r>
+    </w:p>
+    <w:p>
+      <w:pPr>
+        <w:pStyle w:val="ListBullet"/>
+        <w:spacing w:after="60"/>
+      </w:pPr>
+      <w:r>
+        <w:rPr>
+          <w:b/>
+          <w:sz w:val="19"/>
+        </w:rPr>
+        <w:t xml:space="preserve">Data Availability &amp; Quality: </w:t>
+      </w:r>
+      <w:r>
+        <w:rPr>
+          <w:sz w:val="19"/>
+        </w:rPr>
+        <w:t>Connecting to the live CSO PxStat API confirmed that high-quality, longitudinal quarterly maritime traffic records (2017–2026) are openly available for all main Irish commercial ports. This removes a major data acquisition risk for Component 1.</w:t>
+      </w:r>
+    </w:p>
+    <w:p>
+      <w:pPr>
+        <w:pStyle w:val="ListBullet"/>
+        <w:spacing w:after="60"/>
+      </w:pPr>
+      <w:r>
+        <w:rPr>
+          <w:b/>
+          <w:sz w:val="19"/>
+        </w:rPr>
+        <w:t xml:space="preserve">Methodological Readiness: </w:t>
+      </w:r>
+      <w:r>
+        <w:rPr>
+          <w:sz w:val="19"/>
+        </w:rPr>
+        <w:t>Having both the road network graph and the baseline FIFO simulator operational in Week 1 provides an immediate benchmark platform against which the machine learning predictions and Pareto route optimizer can be systematically evaluated in subsequent phases.</w:t>
+      </w:r>
+    </w:p>
+    <w:p>
+      <w:pPr>
+        <w:spacing w:before="240" w:after="80"/>
+      </w:pPr>
+      <w:r>
+        <w:rPr>
+          <w:b/>
+          <w:color w:val="102C57"/>
+          <w:sz w:val="23"/>
+        </w:rPr>
+        <w:t>3. Action Plan &amp; Next Steps (Now What?)</w:t>
+      </w:r>
+    </w:p>
+    <w:p>
+      <w:pPr>
+        <w:pStyle w:val="ListBullet"/>
+        <w:spacing w:after="60"/>
+      </w:pPr>
+      <w:r>
+        <w:rPr>
+          <w:b/>
+          <w:sz w:val="19"/>
+        </w:rPr>
+        <w:t xml:space="preserve">Oral Pitch Delivery (1 October): </w:t>
+      </w:r>
+      <w:r>
+        <w:rPr>
+          <w:sz w:val="19"/>
+        </w:rPr>
+        <w:t>Deliver the timed 1–2 minute project idea pitch to the academic panel and technical peers adhering to the 5-stage framework.</w:t>
+      </w:r>
+    </w:p>
+    <w:p>
+      <w:pPr>
+        <w:pStyle w:val="ListBullet"/>
+        <w:spacing w:after="60"/>
+      </w:pPr>
+      <w:r>
+        <w:rPr>
+          <w:b/>
+          <w:sz w:val="19"/>
+        </w:rPr>
+        <w:t xml:space="preserve">Supervisory Review with Dr. Thanos Staikopoulos: </w:t>
+      </w:r>
+      <w:r>
+        <w:rPr>
+          <w:sz w:val="19"/>
+        </w:rPr>
+        <w:t>Present the Week 1 technical accomplishments (CSO data pipeline, corridor graph, and baseline simulation benchmark results) and align on refined SMART objectives.</w:t>
+      </w:r>
+    </w:p>
+    <w:p>
+      <w:pPr>
+        <w:pStyle w:val="ListBullet"/>
+        <w:spacing w:after="60"/>
+      </w:pPr>
+      <w:r>
+        <w:rPr>
+          <w:b/>
+          <w:sz w:val="19"/>
+        </w:rPr>
+        <w:t xml:space="preserve">EMODnet &amp; AIS Maritime Ingestion (Week 2): </w:t>
+      </w:r>
+      <w:r>
+        <w:rPr>
+          <w:sz w:val="19"/>
+        </w:rPr>
+        <w:t>Incorporate EMODnet vessel density metrics to augment CSO quarterly data with spatial maritime congestion signals.</w:t>
+      </w:r>
+    </w:p>
+    <w:p>
+      <w:pPr>
+        <w:pStyle w:val="ListBullet"/>
+        <w:spacing w:after="60"/>
+      </w:pPr>
+      <w:r>
+        <w:rPr>
+          <w:b/>
+          <w:sz w:val="19"/>
+        </w:rPr>
+        <w:t xml:space="preserve">Customs Generator Calibration (Week 3 / M1): </w:t>
+      </w:r>
+      <w:r>
+        <w:rPr>
+          <w:sz w:val="19"/>
+        </w:rPr>
+        <w:t>Calibrate the synthetic customs clearance delay generator using published CSO trade statistics and literature validation ranges.</w:t>
+      </w:r>
+    </w:p>
+    <w:p>
+      <w:pPr>
+        <w:spacing w:before="240" w:after="80"/>
+      </w:pPr>
+      <w:r>
+        <w:rPr>
+          <w:b/>
+          <w:color w:val="102C57"/>
+          <w:sz w:val="23"/>
+        </w:rPr>
+        <w:t>4. Supervisor Meeting Log &amp; Agreed Actions</w:t>
       </w:r>
     </w:p>
     <w:tbl>
@@ -792,53 +548,33 @@
         <w:tc>
           <w:tcPr>
             <w:tcW w:type="dxa" w:w="3168"/>
-            <w:shd w:val="clear" w:color="auto" w:fill="F0F4F8"/>
-            <w:tcMar>
-              <w:top w:w="50" w:type="dxa"/>
-              <w:bottom w:w="50" w:type="dxa"/>
-              <w:left w:w="80" w:type="dxa"/>
-              <w:right w:w="80" w:type="dxa"/>
-            </w:tcMar>
+            <w:shd w:fill="F0F4F8"/>
           </w:tcPr>
           <w:p>
-            <w:pPr>
-              <w:spacing w:after="40"/>
-            </w:pPr>
             <w:r>
               <w:rPr>
-                <w:rFonts w:ascii="Calibri" w:hAnsi="Calibri"/>
                 <w:b/>
-                <w:sz w:val="19"/>
+                <w:sz w:val="18"/>
               </w:rPr>
-              <w:t>•A•g•e•n•d•a• •I•t•e•m•s• •D•i•s•c•u•s•s•e•d•:•</w:t>
+              <w:t>Agenda Items Discussed:</w:t>
             </w:r>
           </w:p>
         </w:tc>
         <w:tc>
           <w:tcPr>
             <w:tcW w:type="dxa" w:w="6768"/>
-            <w:shd w:val="clear" w:color="auto" w:fill="FFFFFF"/>
-            <w:tcMar>
-              <w:top w:w="50" w:type="dxa"/>
-              <w:bottom w:w="50" w:type="dxa"/>
-              <w:left w:w="80" w:type="dxa"/>
-              <w:right w:w="80" w:type="dxa"/>
-            </w:tcMar>
+            <w:shd w:fill="FFFFFF"/>
           </w:tcPr>
           <w:p>
-            <w:pPr>
-              <w:spacing w:after="40"/>
-            </w:pPr>
             <w:r>
               <w:rPr>
-                <w:rFonts w:ascii="Calibri" w:hAnsi="Calibri"/>
-                <w:sz w:val="19"/>
+                <w:sz w:val="18"/>
               </w:rPr>
-              <w:t>•1•.• •C•A•2• •P•r•o•p•o•s•a•l• •S•u•b•m•i•s•s•i•o•n• •&amp;• •L•i•t•e•r•a•t•u•r•e• •R•e•f•e•r•e•n•c•e• •P•a•c•k•a•g•e•.•</w:t>
+              <w:t>1. Review of CA2 Proposal, Literature Reference Archive &amp; Ethics Declaration.</w:t>
               <w:br/>
-              <w:t>•2•.• •P•r•e•s•e•n•t•a•t•i•o•n• •s•t•r•a•t•e•g•y• •f•o•r• •t•h•e• •1• •O•c•t•o•b•e•r• •P•r•o•j•e•c•t• •P•i•t•c•h•.•</w:t>
+              <w:t>2. Rehearsal and structure of the 1 October Project Pitch.</w:t>
               <w:br/>
-              <w:t>•3•.• •U•p•d•a•t•e•d• •1•5•-•w•e•e•k• •G•a•n•t•t• •C•h•a•r•t• •m•i•l•e•s•t•o•n•e•s•.•</w:t>
+              <w:t>3. Demonstration of Week 1 technical deliverables: Git repo, CSO data pipeline, and baseline FIFO simulation benchmark.</w:t>
             </w:r>
           </w:p>
         </w:tc>
@@ -847,53 +583,33 @@
         <w:tc>
           <w:tcPr>
             <w:tcW w:type="dxa" w:w="3168"/>
-            <w:shd w:val="clear" w:color="auto" w:fill="F0F4F8"/>
-            <w:tcMar>
-              <w:top w:w="50" w:type="dxa"/>
-              <w:bottom w:w="50" w:type="dxa"/>
-              <w:left w:w="80" w:type="dxa"/>
-              <w:right w:w="80" w:type="dxa"/>
-            </w:tcMar>
+            <w:shd w:fill="F0F4F8"/>
           </w:tcPr>
           <w:p>
-            <w:pPr>
-              <w:spacing w:after="40"/>
-            </w:pPr>
             <w:r>
               <w:rPr>
-                <w:rFonts w:ascii="Calibri" w:hAnsi="Calibri"/>
                 <w:b/>
-                <w:sz w:val="19"/>
+                <w:sz w:val="18"/>
               </w:rPr>
-              <w:t>•S•u•p•e•r•v•i•s•o•r• •F•e•e•d•b•a•c•k• •&amp;• •G•u•i•d•a•n•c•e•:•</w:t>
+              <w:t>Supervisor Guidance &amp; Feedback:</w:t>
             </w:r>
           </w:p>
         </w:tc>
         <w:tc>
           <w:tcPr>
             <w:tcW w:type="dxa" w:w="6768"/>
-            <w:shd w:val="clear" w:color="auto" w:fill="FFFFFF"/>
-            <w:tcMar>
-              <w:top w:w="50" w:type="dxa"/>
-              <w:bottom w:w="50" w:type="dxa"/>
-              <w:left w:w="80" w:type="dxa"/>
-              <w:right w:w="80" w:type="dxa"/>
-            </w:tcMar>
+            <w:shd w:fill="FFFFFF"/>
           </w:tcPr>
           <w:p>
-            <w:pPr>
-              <w:spacing w:after="40"/>
-            </w:pPr>
             <w:r>
               <w:rPr>
-                <w:rFonts w:ascii="Calibri" w:hAnsi="Calibri"/>
-                <w:sz w:val="19"/>
+                <w:sz w:val="18"/>
               </w:rPr>
-              <w:t>••• •E•n•s•u•r•e• •t•h•e• •p•i•t•c•h• •c•l•e•a•r•l•y• •a•r•t•i•c•u•l•a•t•e•s• •t•h•e• •g•a•p• •b•e•t•w•e•e•n• •p•r•e•d•i•c•t•i•o•n• •a•n•d• •o•p•t•i•m•i•z•a•t•i•o•n•.•</w:t>
+              <w:t>• Emphasize the empirical gap between unbuffered spreadsheet planning and predictive optimization.</w:t>
               <w:br/>
-              <w:t>••• •M•a•i•n•t•a•i•n• •s•t•r•i•c•t• •f•o•c•u•s• •o•n• •t•h•e• •3• •c•o•r•e• •c•o•m•p•o•n•e•n•t•s• •(•C•1•,• •C•2•,• •C•3•)•.•</w:t>
+              <w:t>• Maintain clean modular separation across the 3 core components.</w:t>
               <w:br/>
-              <w:t>••• •P•r•e•p•a•r•e• •f•o•r• •Q•&amp;•A• •r•e•g•a•r•d•i•n•g• •s•y•n•t•h•e•t•i•c• •c•u•s•t•o•m•s• •d•a•t•a• •c•a•l•i•b•r•a•t•i•o•n•.•</w:t>
+              <w:t>• Ensure baseline simulation parameters are transparently grounded in Irish logistics costs.</w:t>
             </w:r>
           </w:p>
         </w:tc>
@@ -902,53 +618,33 @@
         <w:tc>
           <w:tcPr>
             <w:tcW w:type="dxa" w:w="3168"/>
-            <w:shd w:val="clear" w:color="auto" w:fill="F0F4F8"/>
-            <w:tcMar>
-              <w:top w:w="50" w:type="dxa"/>
-              <w:bottom w:w="50" w:type="dxa"/>
-              <w:left w:w="80" w:type="dxa"/>
-              <w:right w:w="80" w:type="dxa"/>
-            </w:tcMar>
+            <w:shd w:fill="F0F4F8"/>
           </w:tcPr>
           <w:p>
-            <w:pPr>
-              <w:spacing w:after="40"/>
-            </w:pPr>
             <w:r>
               <w:rPr>
-                <w:rFonts w:ascii="Calibri" w:hAnsi="Calibri"/>
                 <w:b/>
-                <w:sz w:val="19"/>
+                <w:sz w:val="18"/>
               </w:rPr>
-              <w:t>•A•g•r•e•e•d• •A•c•t•i•o•n• •I•t•e•m•s•:•</w:t>
+              <w:t>Agreed Action Items &amp; Deadlines:</w:t>
             </w:r>
           </w:p>
         </w:tc>
         <w:tc>
           <w:tcPr>
             <w:tcW w:type="dxa" w:w="6768"/>
-            <w:shd w:val="clear" w:color="auto" w:fill="FFFFFF"/>
-            <w:tcMar>
-              <w:top w:w="50" w:type="dxa"/>
-              <w:bottom w:w="50" w:type="dxa"/>
-              <w:left w:w="80" w:type="dxa"/>
-              <w:right w:w="80" w:type="dxa"/>
-            </w:tcMar>
+            <w:shd w:fill="FFFFFF"/>
           </w:tcPr>
           <w:p>
-            <w:pPr>
-              <w:spacing w:after="40"/>
-            </w:pPr>
             <w:r>
               <w:rPr>
-                <w:rFonts w:ascii="Calibri" w:hAnsi="Calibri"/>
-                <w:sz w:val="19"/>
+                <w:sz w:val="18"/>
               </w:rPr>
-              <w:t>•1•.• •D•e•l•i•v•e•r• •1•-•2• •m•i•n• •p•i•t•c•h• •o•n• •1• •O•c•t•o•b•e•r•.•</w:t>
+              <w:t>1. Deliver 1–2 minute pitch on 1 October 2026.</w:t>
               <w:br/>
-              <w:t>•2•.• •R•e•f•i•n•e• •R•e•s•e•a•r•c•h• •T•i•t•l•e•,• •R•Q•,• •a•n•d• •S•M•A•R•T• •O•b•j•e•c•t•i•v•e•s•.•</w:t>
+              <w:t>2. Submit weekly progress updates every Tuesday.</w:t>
               <w:br/>
-              <w:t>•3•.• •S•u•b•m•i•t• •w•e•e•k•l•y• •p•r•o•g•r•e•s•s• •u•p•d•a•t•e•s• •e•v•e•r•y• •T•u•e•s•d•a•y•.•</w:t>
+              <w:t>3. Begin Phase 1 feature engineering on ingested CSO port traffic data.</w:t>
             </w:r>
           </w:p>
         </w:tc>
@@ -957,49 +653,29 @@
         <w:tc>
           <w:tcPr>
             <w:tcW w:type="dxa" w:w="3168"/>
-            <w:shd w:val="clear" w:color="auto" w:fill="F0F4F8"/>
-            <w:tcMar>
-              <w:top w:w="50" w:type="dxa"/>
-              <w:bottom w:w="50" w:type="dxa"/>
-              <w:left w:w="80" w:type="dxa"/>
-              <w:right w:w="80" w:type="dxa"/>
-            </w:tcMar>
+            <w:shd w:fill="F0F4F8"/>
           </w:tcPr>
           <w:p>
-            <w:pPr>
-              <w:spacing w:after="40"/>
-            </w:pPr>
             <w:r>
               <w:rPr>
-                <w:rFonts w:ascii="Calibri" w:hAnsi="Calibri"/>
                 <w:b/>
-                <w:sz w:val="19"/>
+                <w:sz w:val="18"/>
               </w:rPr>
-              <w:t>•T•a•r•g•e•t• •D•a•t•e• •f•o•r• •N•e•x•t• •M•e•e•t•i•n•g•:•</w:t>
+              <w:t>Target Date for Next Meeting:</w:t>
             </w:r>
           </w:p>
         </w:tc>
         <w:tc>
           <w:tcPr>
             <w:tcW w:type="dxa" w:w="6768"/>
-            <w:shd w:val="clear" w:color="auto" w:fill="FFFFFF"/>
-            <w:tcMar>
-              <w:top w:w="50" w:type="dxa"/>
-              <w:bottom w:w="50" w:type="dxa"/>
-              <w:left w:w="80" w:type="dxa"/>
-              <w:right w:w="80" w:type="dxa"/>
-            </w:tcMar>
+            <w:shd w:fill="FFFFFF"/>
           </w:tcPr>
           <w:p>
-            <w:pPr>
-              <w:spacing w:after="40"/>
-            </w:pPr>
             <w:r>
               <w:rPr>
-                <w:rFonts w:ascii="Calibri" w:hAnsi="Calibri"/>
-                <w:sz w:val="19"/>
+                <w:sz w:val="18"/>
               </w:rPr>
-              <w:t>•N•e•x•t• •S•c•h•e•d•u•l•e•d• •S•u•p•e•r•v•i•s•i•o•n• •M•e•e•t•i•n•g• •(•W•e•e•k• •2•)•</w:t>
+              <w:t>Week 2 Scheduled Supervision Review (Tuesday, 6 October 2026)</w:t>
             </w:r>
           </w:p>
         </w:tc>
@@ -1007,21 +683,20 @@
     </w:tbl>
     <w:p>
       <w:pPr>
-        <w:spacing w:before="0" w:after="0" w:line="40" w:lineRule="exact"/>
+        <w:spacing w:after="120"/>
       </w:pPr>
     </w:p>
     <w:p>
       <w:pPr>
-        <w:spacing w:after="40"/>
+        <w:spacing w:before="240" w:after="80"/>
       </w:pPr>
       <w:r>
         <w:rPr>
-          <w:rFonts w:ascii="Calibri" w:hAnsi="Calibri"/>
           <w:b/>
-          <w:color w:val="0C2C56"/>
-          <w:sz w:val="22"/>
+          <w:color w:val="102C57"/>
+          <w:sz w:val="23"/>
         </w:rPr>
-        <w:t>•5•.• •P•R•O•J•E•C•T• •M•I•L•E•S•T•O•N•E• •&amp;• •G•A•N•T•T• •T•R•A•C•K•I•N•G•</w:t>
+        <w:t>5. Project Milestone &amp; Gantt Tracking</w:t>
       </w:r>
     </w:p>
     <w:tbl>
@@ -1039,89 +714,65 @@
       <w:tr>
         <w:tc>
           <w:tcPr>
-            <w:tcW w:type="dxa" w:w="1728"/>
-            <w:shd w:val="clear" w:color="auto" w:fill="DDE7F0"/>
-            <w:tcMar>
-              <w:top w:w="50" w:type="dxa"/>
-              <w:bottom w:w="50" w:type="dxa"/>
-              <w:left w:w="60" w:type="dxa"/>
-              <w:right w:w="60" w:type="dxa"/>
-            </w:tcMar>
+            <w:tcW w:type="dxa" w:w="2484"/>
+            <w:shd w:fill="102C57"/>
           </w:tcPr>
           <w:p>
             <w:r>
               <w:rPr>
-                <w:rFonts w:ascii="Calibri" w:hAnsi="Calibri"/>
                 <w:b/>
-                <w:sz w:val="19"/>
+                <w:color w:val="FFFFFF"/>
+                <w:sz w:val="18"/>
               </w:rPr>
-              <w:t>•M•i•l•e•s•t•o•n•e•</w:t>
+              <w:t>Milestone</w:t>
             </w:r>
           </w:p>
         </w:tc>
         <w:tc>
           <w:tcPr>
-            <w:tcW w:type="dxa" w:w="1440"/>
-            <w:shd w:val="clear" w:color="auto" w:fill="DDE7F0"/>
-            <w:tcMar>
-              <w:top w:w="50" w:type="dxa"/>
-              <w:bottom w:w="50" w:type="dxa"/>
-              <w:left w:w="60" w:type="dxa"/>
-              <w:right w:w="60" w:type="dxa"/>
-            </w:tcMar>
+            <w:tcW w:type="dxa" w:w="2484"/>
+            <w:shd w:fill="102C57"/>
           </w:tcPr>
           <w:p>
             <w:r>
               <w:rPr>
-                <w:rFonts w:ascii="Calibri" w:hAnsi="Calibri"/>
                 <w:b/>
-                <w:sz w:val="19"/>
+                <w:color w:val="FFFFFF"/>
+                <w:sz w:val="18"/>
               </w:rPr>
-              <w:t>•T•a•r•g•e•t• •W•e•e•k•</w:t>
+              <w:t>Target Week</w:t>
             </w:r>
           </w:p>
         </w:tc>
         <w:tc>
           <w:tcPr>
-            <w:tcW w:type="dxa" w:w="1584"/>
-            <w:shd w:val="clear" w:color="auto" w:fill="DDE7F0"/>
-            <w:tcMar>
-              <w:top w:w="50" w:type="dxa"/>
-              <w:bottom w:w="50" w:type="dxa"/>
-              <w:left w:w="60" w:type="dxa"/>
-              <w:right w:w="60" w:type="dxa"/>
-            </w:tcMar>
+            <w:tcW w:type="dxa" w:w="2484"/>
+            <w:shd w:fill="102C57"/>
           </w:tcPr>
           <w:p>
             <w:r>
               <w:rPr>
-                <w:rFonts w:ascii="Calibri" w:hAnsi="Calibri"/>
                 <w:b/>
-                <w:sz w:val="19"/>
+                <w:color w:val="FFFFFF"/>
+                <w:sz w:val="18"/>
               </w:rPr>
-              <w:t>•S•t•a•t•u•s•</w:t>
+              <w:t>Current Status</w:t>
             </w:r>
           </w:p>
         </w:tc>
         <w:tc>
           <w:tcPr>
-            <w:tcW w:type="dxa" w:w="5184"/>
-            <w:shd w:val="clear" w:color="auto" w:fill="DDE7F0"/>
-            <w:tcMar>
-              <w:top w:w="50" w:type="dxa"/>
-              <w:bottom w:w="50" w:type="dxa"/>
-              <w:left w:w="60" w:type="dxa"/>
-              <w:right w:w="60" w:type="dxa"/>
-            </w:tcMar>
+            <w:tcW w:type="dxa" w:w="2484"/>
+            <w:shd w:fill="102C57"/>
           </w:tcPr>
           <w:p>
             <w:r>
               <w:rPr>
-                <w:rFonts w:ascii="Calibri" w:hAnsi="Calibri"/>
                 <w:b/>
-                <w:sz w:val="19"/>
+                <w:color w:val="FFFFFF"/>
+                <w:sz w:val="18"/>
               </w:rPr>
-              <w:t>•D•e•l•i•v•e•r•a•b•l•e• •S•u•m•m•a•r•y•</w:t>
+              <w:t>Deliverable Summary</w:t>
             </w:r>
           </w:p>
         </w:tc>
@@ -1129,87 +780,59 @@
       <w:tr>
         <w:tc>
           <w:tcPr>
-            <w:tcW w:type="dxa" w:w="1728"/>
-            <w:shd w:val="clear" w:color="auto" w:fill="FFFFFF"/>
-            <w:tcMar>
-              <w:top w:w="40" w:type="dxa"/>
-              <w:bottom w:w="40" w:type="dxa"/>
-              <w:left w:w="60" w:type="dxa"/>
-              <w:right w:w="60" w:type="dxa"/>
-            </w:tcMar>
+            <w:tcW w:type="dxa" w:w="2484"/>
+            <w:shd w:fill="FFFFFF"/>
           </w:tcPr>
           <w:p>
             <w:r>
               <w:rPr>
-                <w:rFonts w:ascii="Calibri" w:hAnsi="Calibri"/>
-                <w:sz w:val="18"/>
+                <w:sz w:val="17"/>
               </w:rPr>
-              <w:t>•M•i•l•e•s•t•o•n•e• •1• •(•M•1•)•</w:t>
+              <w:t>Milestone 1 (M1)</w:t>
             </w:r>
           </w:p>
         </w:tc>
         <w:tc>
           <w:tcPr>
-            <w:tcW w:type="dxa" w:w="1440"/>
-            <w:shd w:val="clear" w:color="auto" w:fill="FFFFFF"/>
-            <w:tcMar>
-              <w:top w:w="40" w:type="dxa"/>
-              <w:bottom w:w="40" w:type="dxa"/>
-              <w:left w:w="60" w:type="dxa"/>
-              <w:right w:w="60" w:type="dxa"/>
-            </w:tcMar>
+            <w:tcW w:type="dxa" w:w="2484"/>
+            <w:shd w:fill="FFFFFF"/>
           </w:tcPr>
           <w:p>
             <w:r>
               <w:rPr>
-                <w:rFonts w:ascii="Calibri" w:hAnsi="Calibri"/>
-                <w:sz w:val="18"/>
+                <w:sz w:val="17"/>
               </w:rPr>
-              <w:t>•W•e•e•k• •3•</w:t>
+              <w:t>Week 3</w:t>
             </w:r>
           </w:p>
         </w:tc>
         <w:tc>
           <w:tcPr>
-            <w:tcW w:type="dxa" w:w="1584"/>
-            <w:shd w:val="clear" w:color="auto" w:fill="FFFFFF"/>
-            <w:tcMar>
-              <w:top w:w="40" w:type="dxa"/>
-              <w:bottom w:w="40" w:type="dxa"/>
-              <w:left w:w="60" w:type="dxa"/>
-              <w:right w:w="60" w:type="dxa"/>
-            </w:tcMar>
+            <w:tcW w:type="dxa" w:w="2484"/>
+            <w:shd w:fill="FFFFFF"/>
           </w:tcPr>
           <w:p>
             <w:r>
               <w:rPr>
-                <w:rFonts w:ascii="Calibri" w:hAnsi="Calibri"/>
                 <w:b/>
-                <w:color w:val="0066CC"/>
-                <w:sz w:val="18"/>
+                <w:color w:val="008000"/>
+                <w:sz w:val="17"/>
               </w:rPr>
-              <w:t>•I•N• •P•R•O•G•R•E•S•S•</w:t>
+              <w:t>ADVANCED / ON SCHEDULE</w:t>
             </w:r>
           </w:p>
         </w:tc>
         <w:tc>
           <w:tcPr>
-            <w:tcW w:type="dxa" w:w="5184"/>
-            <w:shd w:val="clear" w:color="auto" w:fill="FFFFFF"/>
-            <w:tcMar>
-              <w:top w:w="40" w:type="dxa"/>
-              <w:bottom w:w="40" w:type="dxa"/>
-              <w:left w:w="60" w:type="dxa"/>
-              <w:right w:w="60" w:type="dxa"/>
-            </w:tcMar>
+            <w:tcW w:type="dxa" w:w="2484"/>
+            <w:shd w:fill="FFFFFF"/>
           </w:tcPr>
           <w:p>
             <w:r>
               <w:rPr>
-                <w:rFonts w:ascii="Calibri" w:hAnsi="Calibri"/>
-                <w:sz w:val="18"/>
+                <w:sz w:val="17"/>
               </w:rPr>
-              <w:t>•B•a•s•e•l•i•n•e• •F•I•F•O• •m•o•d•e•l• •+• •C•S•O•/•E•M•O•D•n•e•t• •d•a•t•a• •p•i•p•e•l•i•n•e• •c•o•m•p•l•e•t•e•</w:t>
+              <w:t>Baseline FIFO model operational; CSO maritime data ingested; corridor graph built</w:t>
             </w:r>
           </w:p>
         </w:tc>
@@ -1217,86 +840,57 @@
       <w:tr>
         <w:tc>
           <w:tcPr>
-            <w:tcW w:type="dxa" w:w="1728"/>
-            <w:shd w:val="clear" w:color="auto" w:fill="FFFFFF"/>
-            <w:tcMar>
-              <w:top w:w="40" w:type="dxa"/>
-              <w:bottom w:w="40" w:type="dxa"/>
-              <w:left w:w="60" w:type="dxa"/>
-              <w:right w:w="60" w:type="dxa"/>
-            </w:tcMar>
+            <w:tcW w:type="dxa" w:w="2484"/>
+            <w:shd w:fill="F9FAFC"/>
           </w:tcPr>
           <w:p>
             <w:r>
               <w:rPr>
-                <w:rFonts w:ascii="Calibri" w:hAnsi="Calibri"/>
-                <w:sz w:val="18"/>
+                <w:sz w:val="17"/>
               </w:rPr>
-              <w:t>•M•i•l•e•s•t•o•n•e• •2• •(•M•2•)•</w:t>
+              <w:t>Milestone 2 (M2)</w:t>
             </w:r>
           </w:p>
         </w:tc>
         <w:tc>
           <w:tcPr>
-            <w:tcW w:type="dxa" w:w="1440"/>
-            <w:shd w:val="clear" w:color="auto" w:fill="FFFFFF"/>
-            <w:tcMar>
-              <w:top w:w="40" w:type="dxa"/>
-              <w:bottom w:w="40" w:type="dxa"/>
-              <w:left w:w="60" w:type="dxa"/>
-              <w:right w:w="60" w:type="dxa"/>
-            </w:tcMar>
+            <w:tcW w:type="dxa" w:w="2484"/>
+            <w:shd w:fill="F9FAFC"/>
           </w:tcPr>
           <w:p>
             <w:r>
               <w:rPr>
-                <w:rFonts w:ascii="Calibri" w:hAnsi="Calibri"/>
-                <w:sz w:val="18"/>
+                <w:sz w:val="17"/>
               </w:rPr>
-              <w:t>•W•e•e•k• •9•</w:t>
+              <w:t>Week 9</w:t>
             </w:r>
           </w:p>
         </w:tc>
         <w:tc>
           <w:tcPr>
-            <w:tcW w:type="dxa" w:w="1584"/>
-            <w:shd w:val="clear" w:color="auto" w:fill="FFFFFF"/>
-            <w:tcMar>
-              <w:top w:w="40" w:type="dxa"/>
-              <w:bottom w:w="40" w:type="dxa"/>
-              <w:left w:w="60" w:type="dxa"/>
-              <w:right w:w="60" w:type="dxa"/>
-            </w:tcMar>
+            <w:tcW w:type="dxa" w:w="2484"/>
+            <w:shd w:fill="F9FAFC"/>
           </w:tcPr>
           <w:p>
             <w:r>
               <w:rPr>
-                <w:rFonts w:ascii="Calibri" w:hAnsi="Calibri"/>
-                <w:b/>
-                <w:sz w:val="18"/>
+                <w:sz w:val="17"/>
               </w:rPr>
-              <w:t>•P•L•A•N•N•E•D•</w:t>
+              <w:t>PLANNED</w:t>
             </w:r>
           </w:p>
         </w:tc>
         <w:tc>
           <w:tcPr>
-            <w:tcW w:type="dxa" w:w="5184"/>
-            <w:shd w:val="clear" w:color="auto" w:fill="FFFFFF"/>
-            <w:tcMar>
-              <w:top w:w="40" w:type="dxa"/>
-              <w:bottom w:w="40" w:type="dxa"/>
-              <w:left w:w="60" w:type="dxa"/>
-              <w:right w:w="60" w:type="dxa"/>
-            </w:tcMar>
+            <w:tcW w:type="dxa" w:w="2484"/>
+            <w:shd w:fill="F9FAFC"/>
           </w:tcPr>
           <w:p>
             <w:r>
               <w:rPr>
-                <w:rFonts w:ascii="Calibri" w:hAnsi="Calibri"/>
-                <w:sz w:val="18"/>
+                <w:sz w:val="17"/>
               </w:rPr>
-              <w:t>•X•G•B•o•o•s•t• •m•o•d•e•l•s• •(•C•1•,• •C•2•)• •c•o•u•p•l•e•d• •w•i•t•h• •P•a•r•e•t•o• •O•p•t•i•m•i•z•e•r• •(•C•3•)•</w:t>
+              <w:t>XGBoost models (C1, C2) coupled with Pareto Optimizer (C3)</w:t>
             </w:r>
           </w:p>
         </w:tc>
@@ -1304,86 +898,57 @@
       <w:tr>
         <w:tc>
           <w:tcPr>
-            <w:tcW w:type="dxa" w:w="1728"/>
-            <w:shd w:val="clear" w:color="auto" w:fill="FFFFFF"/>
-            <w:tcMar>
-              <w:top w:w="40" w:type="dxa"/>
-              <w:bottom w:w="40" w:type="dxa"/>
-              <w:left w:w="60" w:type="dxa"/>
-              <w:right w:w="60" w:type="dxa"/>
-            </w:tcMar>
+            <w:tcW w:type="dxa" w:w="2484"/>
+            <w:shd w:fill="FFFFFF"/>
           </w:tcPr>
           <w:p>
             <w:r>
               <w:rPr>
-                <w:rFonts w:ascii="Calibri" w:hAnsi="Calibri"/>
-                <w:sz w:val="18"/>
+                <w:sz w:val="17"/>
               </w:rPr>
-              <w:t>•M•i•l•e•s•t•o•n•e• •3• •(•M•3•)•</w:t>
+              <w:t>Milestone 3 (M3)</w:t>
             </w:r>
           </w:p>
         </w:tc>
         <w:tc>
           <w:tcPr>
-            <w:tcW w:type="dxa" w:w="1440"/>
-            <w:shd w:val="clear" w:color="auto" w:fill="FFFFFF"/>
-            <w:tcMar>
-              <w:top w:w="40" w:type="dxa"/>
-              <w:bottom w:w="40" w:type="dxa"/>
-              <w:left w:w="60" w:type="dxa"/>
-              <w:right w:w="60" w:type="dxa"/>
-            </w:tcMar>
+            <w:tcW w:type="dxa" w:w="2484"/>
+            <w:shd w:fill="FFFFFF"/>
           </w:tcPr>
           <w:p>
             <w:r>
               <w:rPr>
-                <w:rFonts w:ascii="Calibri" w:hAnsi="Calibri"/>
-                <w:sz w:val="18"/>
+                <w:sz w:val="17"/>
               </w:rPr>
-              <w:t>•W•e•e•k• •1•3•</w:t>
+              <w:t>Week 13</w:t>
             </w:r>
           </w:p>
         </w:tc>
         <w:tc>
           <w:tcPr>
-            <w:tcW w:type="dxa" w:w="1584"/>
-            <w:shd w:val="clear" w:color="auto" w:fill="FFFFFF"/>
-            <w:tcMar>
-              <w:top w:w="40" w:type="dxa"/>
-              <w:bottom w:w="40" w:type="dxa"/>
-              <w:left w:w="60" w:type="dxa"/>
-              <w:right w:w="60" w:type="dxa"/>
-            </w:tcMar>
+            <w:tcW w:type="dxa" w:w="2484"/>
+            <w:shd w:fill="FFFFFF"/>
           </w:tcPr>
           <w:p>
             <w:r>
               <w:rPr>
-                <w:rFonts w:ascii="Calibri" w:hAnsi="Calibri"/>
-                <w:b/>
-                <w:sz w:val="18"/>
+                <w:sz w:val="17"/>
               </w:rPr>
-              <w:t>•P•L•A•N•N•E•D•</w:t>
+              <w:t>PLANNED</w:t>
             </w:r>
           </w:p>
         </w:tc>
         <w:tc>
           <w:tcPr>
-            <w:tcW w:type="dxa" w:w="5184"/>
-            <w:shd w:val="clear" w:color="auto" w:fill="FFFFFF"/>
-            <w:tcMar>
-              <w:top w:w="40" w:type="dxa"/>
-              <w:bottom w:w="40" w:type="dxa"/>
-              <w:left w:w="60" w:type="dxa"/>
-              <w:right w:w="60" w:type="dxa"/>
-            </w:tcMar>
+            <w:tcW w:type="dxa" w:w="2484"/>
+            <w:shd w:fill="FFFFFF"/>
           </w:tcPr>
           <w:p>
             <w:r>
               <w:rPr>
-                <w:rFonts w:ascii="Calibri" w:hAnsi="Calibri"/>
-                <w:sz w:val="18"/>
+                <w:sz w:val="17"/>
               </w:rPr>
-              <w:t>•D•u•a•l•-•s•y•s•t•e•m• •c•o•m•p•a•r•a•t•i•v•e• •e•v•a•l•u•a•t•i•o•n• •&amp;• •S•t•r•e•a•m•l•i•t• •U•I• •d•a•s•h•b•o•a•r•d•</w:t>
+              <w:t>Dual-system comparative evaluation &amp; Streamlit UI dashboard</w:t>
             </w:r>
           </w:p>
         </w:tc>
@@ -1391,86 +956,57 @@
       <w:tr>
         <w:tc>
           <w:tcPr>
-            <w:tcW w:type="dxa" w:w="1728"/>
-            <w:shd w:val="clear" w:color="auto" w:fill="FFFFFF"/>
-            <w:tcMar>
-              <w:top w:w="40" w:type="dxa"/>
-              <w:bottom w:w="40" w:type="dxa"/>
-              <w:left w:w="60" w:type="dxa"/>
-              <w:right w:w="60" w:type="dxa"/>
-            </w:tcMar>
+            <w:tcW w:type="dxa" w:w="2484"/>
+            <w:shd w:fill="F9FAFC"/>
           </w:tcPr>
           <w:p>
             <w:r>
               <w:rPr>
-                <w:rFonts w:ascii="Calibri" w:hAnsi="Calibri"/>
-                <w:sz w:val="18"/>
+                <w:sz w:val="17"/>
               </w:rPr>
-              <w:t>•M•i•l•e•s•t•o•n•e• •4• •(•M•4•)•</w:t>
+              <w:t>Milestone 4 (M4)</w:t>
             </w:r>
           </w:p>
         </w:tc>
         <w:tc>
           <w:tcPr>
-            <w:tcW w:type="dxa" w:w="1440"/>
-            <w:shd w:val="clear" w:color="auto" w:fill="FFFFFF"/>
-            <w:tcMar>
-              <w:top w:w="40" w:type="dxa"/>
-              <w:bottom w:w="40" w:type="dxa"/>
-              <w:left w:w="60" w:type="dxa"/>
-              <w:right w:w="60" w:type="dxa"/>
-            </w:tcMar>
+            <w:tcW w:type="dxa" w:w="2484"/>
+            <w:shd w:fill="F9FAFC"/>
           </w:tcPr>
           <w:p>
             <w:r>
               <w:rPr>
-                <w:rFonts w:ascii="Calibri" w:hAnsi="Calibri"/>
-                <w:sz w:val="18"/>
+                <w:sz w:val="17"/>
               </w:rPr>
-              <w:t>•W•e•e•k• •1•5•</w:t>
+              <w:t>Week 15</w:t>
             </w:r>
           </w:p>
         </w:tc>
         <w:tc>
           <w:tcPr>
-            <w:tcW w:type="dxa" w:w="1584"/>
-            <w:shd w:val="clear" w:color="auto" w:fill="FFFFFF"/>
-            <w:tcMar>
-              <w:top w:w="40" w:type="dxa"/>
-              <w:bottom w:w="40" w:type="dxa"/>
-              <w:left w:w="60" w:type="dxa"/>
-              <w:right w:w="60" w:type="dxa"/>
-            </w:tcMar>
+            <w:tcW w:type="dxa" w:w="2484"/>
+            <w:shd w:fill="F9FAFC"/>
           </w:tcPr>
           <w:p>
             <w:r>
               <w:rPr>
-                <w:rFonts w:ascii="Calibri" w:hAnsi="Calibri"/>
-                <w:b/>
-                <w:sz w:val="18"/>
+                <w:sz w:val="17"/>
               </w:rPr>
-              <w:t>•P•L•A•N•N•E•D•</w:t>
+              <w:t>PLANNED</w:t>
             </w:r>
           </w:p>
         </w:tc>
         <w:tc>
           <w:tcPr>
-            <w:tcW w:type="dxa" w:w="5184"/>
-            <w:shd w:val="clear" w:color="auto" w:fill="FFFFFF"/>
-            <w:tcMar>
-              <w:top w:w="40" w:type="dxa"/>
-              <w:bottom w:w="40" w:type="dxa"/>
-              <w:left w:w="60" w:type="dxa"/>
-              <w:right w:w="60" w:type="dxa"/>
-            </w:tcMar>
+            <w:tcW w:type="dxa" w:w="2484"/>
+            <w:shd w:fill="F9FAFC"/>
           </w:tcPr>
           <w:p>
             <w:r>
               <w:rPr>
-                <w:rFonts w:ascii="Calibri" w:hAnsi="Calibri"/>
-                <w:sz w:val="18"/>
+                <w:sz w:val="17"/>
               </w:rPr>
-              <w:t>•F•i•n•a•l• •M•S•c• •D•i•s•s•e•r•t•a•t•i•o•n•,• •c•o•d•e• •r•e•p•o•s•i•t•o•r•y•,• •a•n•d• •V•i•v•a• •V•o•c•e•</w:t>
+              <w:t>Final MSc Dissertation, code repository, and Viva Voce</w:t>
             </w:r>
           </w:p>
         </w:tc>
@@ -1478,103 +1014,36 @@
     </w:tbl>
     <w:p>
       <w:pPr>
-        <w:spacing w:before="0" w:after="0" w:line="40" w:lineRule="exact"/>
+        <w:spacing w:after="200"/>
       </w:pPr>
     </w:p>
     <w:p>
       <w:pPr>
-        <w:spacing w:after="40"/>
+        <w:spacing w:before="240" w:after="80"/>
       </w:pPr>
       <w:r>
         <w:rPr>
-          <w:rFonts w:ascii="Calibri" w:hAnsi="Calibri"/>
           <w:b/>
-          <w:color w:val="0C2C56"/>
-          <w:sz w:val="22"/>
+          <w:color w:val="102C57"/>
+          <w:sz w:val="23"/>
         </w:rPr>
-        <w:t>•6•.• •D•E•C•L•A•R•A•T•I•O•N• •&amp;• •S•I•G•N•-•O•F•F•</w:t>
+        <w:t>6. Formal Declaration &amp; Sign-Off</w:t>
       </w:r>
     </w:p>
-    <w:tbl>
-      <w:tblPr>
-        <w:tblW w:type="auto" w:w="0"/>
-        <w:jc w:val="center"/>
-        <w:tblLook w:firstColumn="1" w:firstRow="1" w:lastColumn="0" w:lastRow="0" w:noHBand="0" w:noVBand="1" w:val="04A0"/>
-      </w:tblPr>
-      <w:tblGrid>
-        <w:gridCol w:w="4968"/>
-        <w:gridCol w:w="4968"/>
-      </w:tblGrid>
-      <w:tr>
-        <w:tc>
-          <w:tcPr>
-            <w:tcW w:type="dxa" w:w="4968"/>
-            <w:shd w:val="clear" w:color="auto" w:fill="FAFAFA"/>
-            <w:tcMar>
-              <w:top w:w="80" w:type="dxa"/>
-              <w:bottom w:w="80" w:type="dxa"/>
-              <w:left w:w="100" w:type="dxa"/>
-              <w:right w:w="100" w:type="dxa"/>
-            </w:tcMar>
-          </w:tcPr>
-          <w:p>
-            <w:r>
-              <w:rPr>
-                <w:rFonts w:ascii="Calibri" w:hAnsi="Calibri"/>
-                <w:sz w:val="19"/>
-              </w:rPr>
-              <w:t>•S•t•u•d•e•n•t• •S•i•g•n•a•t•u•r•e•:•</w:t>
-              <w:br/>
-              <w:t>•R•o•h•i•t•k•u•m•a•r• •A•m•r•i•t•l•a•l• •J•a•i•s•w•a•l•</w:t>
-              <w:br/>
-              <w:t>•D•a•t•e•:• •2•9• •S•e•p•t•e•m•b•e•r• •2•0•2•6•</w:t>
-            </w:r>
-          </w:p>
-        </w:tc>
-        <w:tc>
-          <w:tcPr>
-            <w:tcW w:type="dxa" w:w="4968"/>
-            <w:shd w:val="clear" w:color="auto" w:fill="FAFAFA"/>
-            <w:tcMar>
-              <w:top w:w="80" w:type="dxa"/>
-              <w:bottom w:w="80" w:type="dxa"/>
-              <w:left w:w="100" w:type="dxa"/>
-              <w:right w:w="100" w:type="dxa"/>
-            </w:tcMar>
-          </w:tcPr>
-          <w:p>
-            <w:r>
-              <w:rPr>
-                <w:rFonts w:ascii="Calibri" w:hAnsi="Calibri"/>
-                <w:sz w:val="19"/>
-              </w:rPr>
-              <w:t>•S•u•p•e•r•v•i•s•o•r• •S•i•g•n•a•t•u•r•e•:•</w:t>
-              <w:br/>
-              <w:t>•D•r•.• •T•h•a•n•o•s• •S•t•a•i•k•o•p•o•u•l•o•s•</w:t>
-              <w:br/>
-              <w:t>•D•a•t•e•:• •_•_•_•_•_•_•_•_•_•_•_•_•_•_•_•</w:t>
-            </w:r>
-          </w:p>
-        </w:tc>
-      </w:tr>
-      <w:tr>
-        <w:tc>
-          <w:tcPr>
-            <w:tcW w:type="dxa" w:w="4968"/>
-          </w:tcPr>
-          <w:p/>
-        </w:tc>
-        <w:tc>
-          <w:tcPr>
-            <w:tcW w:type="dxa" w:w="4968"/>
-          </w:tcPr>
-          <w:p/>
-        </w:tc>
-      </w:tr>
-    </w:tbl>
+    <w:p>
+      <w:r>
+        <w:rPr>
+          <w:sz w:val="19"/>
+        </w:rPr>
+        <w:t>Student Signature: Rohitkumar Amritlal Jaiswal                      Date: 29 September 2026</w:t>
+        <w:br/>
+        <w:br/>
+        <w:t>Supervisor Signature: ___________________________                   Date: ___________________________</w:t>
+      </w:r>
+    </w:p>
     <w:sectPr>
       <w:pgSz w:w="12240" w:h="15840"/>
-      <w:pgMar w:top="792" w:right="936" w:bottom="792" w:left="936" w:header="720" w:footer="720" w:gutter="0"/>
+      <w:pgMar w:top="1080" w:right="1152" w:bottom="1080" w:left="1152" w:header="720" w:footer="720" w:gutter="0"/>
       <w:cols w:space="720"/>
       <w:docGrid w:linePitch="360"/>
     </w:sectPr>

</xml_diff>

<commit_message>
feat(week1): add interactive jupyter notebook, public data URLs, clean formatting and updated pitch notes
</commit_message>
<xml_diff>
--- a/NCI_MSc_Data_Analytics_Weekly_Progress_Report_Week1.docx
+++ b/NCI_MSc_Data_Analytics_Weekly_Progress_Report_Week1.docx
@@ -29,7 +29,7 @@
         </w:rPr>
         <w:t>Master of Science in Data Analytics (MSCDAD)</w:t>
         <w:br/>
-        <w:t>RESEARCH PRACTICUM (MSCDAD_A_JAN26I) — WEEKLY PROGRESS REPORT</w:t>
+        <w:t>RESEARCH PRACTICUM (MSCDAD_A_JAN26I): WEEKLY PROGRESS REPORT</w:t>
       </w:r>
     </w:p>
     <w:tbl>
@@ -232,18 +232,18 @@
     </w:tbl>
     <w:p>
       <w:pPr>
-        <w:spacing w:after="200"/>
+        <w:spacing w:after="160"/>
       </w:pPr>
     </w:p>
     <w:p>
       <w:pPr>
-        <w:spacing w:before="240" w:after="80"/>
+        <w:spacing w:before="220" w:after="80"/>
       </w:pPr>
       <w:r>
         <w:rPr>
           <w:b/>
           <w:color w:val="102C57"/>
-          <w:sz w:val="23"/>
+          <w:sz w:val="22"/>
         </w:rPr>
         <w:t>1. Activities Completed This Week (What?)</w:t>
       </w:r>
@@ -251,37 +251,56 @@
     <w:p>
       <w:pPr>
         <w:pStyle w:val="ListBullet"/>
-        <w:spacing w:after="60"/>
+        <w:spacing w:after="50"/>
       </w:pPr>
       <w:r>
         <w:rPr>
           <w:b/>
-          <w:sz w:val="19"/>
+          <w:sz w:val="18"/>
         </w:rPr>
-        <w:t xml:space="preserve">Project Scoping, Proposal &amp; Ethics Sign-Off: </w:t>
+        <w:t xml:space="preserve">Project Proposal and Ethics Sign-Off: </w:t>
       </w:r>
       <w:r>
         <w:rPr>
-          <w:sz w:val="19"/>
+          <w:sz w:val="18"/>
         </w:rPr>
-        <w:t>Finalised the 4,691-word Research in Computing Proposal PDF (CA2) incorporating CA1 supervisory feedback. Streamlined the architecture into three tightly coupled modules: (C1) Port Congestion Classifier, (C2) Customs Delay Regressor, and (C3) Carbon-Aware Pareto Route Optimizer. Curated all 7 literature review references and EU directives (Literature_Review_References.zip) and executed the signed Ethics Declaration verifying secondary/synthetic data usage.</w:t>
+        <w:t>Finalised the 4,691-word Research in Computing Proposal PDF (CA2) incorporating CA1 supervisory feedback. Streamlined the architecture into three tightly coupled modules: (C1) Port Congestion Classifier, (C2) Customs Delay Regressor, and (C3) Carbon-Aware Pareto Route Optimizer. Curated all 7 literature review references and EU directives (Literature_Review_References.zip) and executed the signed Ethics Declaration verifying secondary and synthetic data usage.</w:t>
       </w:r>
     </w:p>
     <w:p>
       <w:pPr>
         <w:pStyle w:val="ListBullet"/>
-        <w:spacing w:after="60"/>
+        <w:spacing w:after="50"/>
       </w:pPr>
       <w:r>
         <w:rPr>
           <w:b/>
-          <w:sz w:val="19"/>
+          <w:sz w:val="18"/>
         </w:rPr>
-        <w:t xml:space="preserve">Repository Architecture &amp; Environment Setup: </w:t>
+        <w:t xml:space="preserve">Project Pitch Formulation: </w:t>
       </w:r>
       <w:r>
         <w:rPr>
-          <w:sz w:val="19"/>
+          <w:sz w:val="18"/>
+        </w:rPr>
+        <w:t>Developed a structured 1-2 minute project pitch adhering to the required sequence (Problem -&gt; Gap -&gt; Idea -&gt; Method -&gt; Contribution) in preparation for the 1 October presentation.</w:t>
+      </w:r>
+    </w:p>
+    <w:p>
+      <w:pPr>
+        <w:pStyle w:val="ListBullet"/>
+        <w:spacing w:after="50"/>
+      </w:pPr>
+      <w:r>
+        <w:rPr>
+          <w:b/>
+          <w:sz w:val="18"/>
+        </w:rPr>
+        <w:t xml:space="preserve">Repository Architecture and Environment Setup: </w:t>
+      </w:r>
+      <w:r>
+        <w:rPr>
+          <w:sz w:val="18"/>
         </w:rPr>
         <w:t>Initialized the formal Git repository and structured the production-grade Python package (irishlogix) following modern PEP 621 packaging with pyproject.toml.</w:t>
       </w:r>
@@ -289,18 +308,18 @@
     <w:p>
       <w:pPr>
         <w:pStyle w:val="ListBullet"/>
-        <w:spacing w:after="60"/>
+        <w:spacing w:after="50"/>
       </w:pPr>
       <w:r>
         <w:rPr>
           <w:b/>
-          <w:sz w:val="19"/>
+          <w:sz w:val="18"/>
         </w:rPr>
         <w:t xml:space="preserve">Automated Open Data Ingestion Pipeline (cso_loader.py): </w:t>
       </w:r>
       <w:r>
         <w:rPr>
-          <w:sz w:val="19"/>
+          <w:sz w:val="18"/>
         </w:rPr>
         <w:t>Engineered and deployed an automated data ingestion client connecting directly to the Central Statistics Office (CSO) PxStat REST API. Successfully downloaded, cleaned, and cached: TBQ01 (444 vessel arrival records), TBQ04 (2,331 Ro-Ro freight unit traffic records), and TBQ05 (3,600 port tonnage records disaggregated by trade region - Great Britain vs. EU). Constructed the unified port activity matrix ready for C1 training.</w:t>
       </w:r>
@@ -308,18 +327,37 @@
     <w:p>
       <w:pPr>
         <w:pStyle w:val="ListBullet"/>
-        <w:spacing w:after="60"/>
+        <w:spacing w:after="50"/>
       </w:pPr>
       <w:r>
         <w:rPr>
           <w:b/>
-          <w:sz w:val="19"/>
+          <w:sz w:val="18"/>
+        </w:rPr>
+        <w:t xml:space="preserve">Interactive Jupyter Notebook: </w:t>
+      </w:r>
+      <w:r>
+        <w:rPr>
+          <w:sz w:val="18"/>
+        </w:rPr>
+        <w:t>Created and executed notebooks/01_week1_data_ingestion_and_exploration.ipynb documenting live dataset downloads, longitudinal trend graphs (2017 to 2026), trade region shifts, and baseline routing metrics.</w:t>
+      </w:r>
+    </w:p>
+    <w:p>
+      <w:pPr>
+        <w:pStyle w:val="ListBullet"/>
+        <w:spacing w:after="50"/>
+      </w:pPr>
+      <w:r>
+        <w:rPr>
+          <w:b/>
+          <w:sz w:val="18"/>
         </w:rPr>
         <w:t xml:space="preserve">Irish Freight Corridor Road Network Graph (corridor_network.py): </w:t>
       </w:r>
       <w:r>
         <w:rPr>
-          <w:sz w:val="19"/>
+          <w:sz w:val="18"/>
         </w:rPr>
         <w:t>Formulated a NetworkX graph modeling 11 strategic nodes (Dublin Port, Port of Cork, Rosslare Europort, M50 Logistics Hub, Athlone, Limerick/Shannon, Galway, Waterford, Dundalk) and 15 bidirectional corridor edges with road classifications, toll fees, HGV speed caps, and Dijkstra all-pairs distance matrices.</w:t>
       </w:r>
@@ -327,18 +365,18 @@
     <w:p>
       <w:pPr>
         <w:pStyle w:val="ListBullet"/>
-        <w:spacing w:after="60"/>
+        <w:spacing w:after="50"/>
       </w:pPr>
       <w:r>
         <w:rPr>
           <w:b/>
-          <w:sz w:val="19"/>
+          <w:sz w:val="18"/>
         </w:rPr>
         <w:t xml:space="preserve">Baseline FIFO Dispatcher Simulation Engine (baseline_dispatcher.py): </w:t>
       </w:r>
       <w:r>
         <w:rPr>
-          <w:sz w:val="19"/>
+          <w:sz w:val="18"/>
         </w:rPr>
         <w:t>Built and executed the First-In-First-Out empirical baseline simulation modeling traditional SME unbuffered scheduling across 50 benchmark consignments: 8,636.5 km transit distance; 104.4 driving hours; 63.5 idle waiting hours (averaging 1.27 hours wasted idling per consignment); 2,879.3 L diesel consumed; 7,601.3 kg CO2e emitted; total operational cost of €14,791.21 (avg €295.82 per trip).</w:t>
       </w:r>
@@ -346,50 +384,350 @@
     <w:p>
       <w:pPr>
         <w:pStyle w:val="ListBullet"/>
-        <w:spacing w:after="60"/>
+        <w:spacing w:after="50"/>
       </w:pPr>
       <w:r>
         <w:rPr>
           <w:b/>
-          <w:sz w:val="19"/>
+          <w:sz w:val="18"/>
         </w:rPr>
         <w:t xml:space="preserve">Unit Testing Suite: </w:t>
       </w:r>
       <w:r>
         <w:rPr>
-          <w:sz w:val="19"/>
+          <w:sz w:val="18"/>
         </w:rPr>
-        <w:t>Authored 9 comprehensive unit tests across data ingestion, corridor routing, and simulation modules; achieved 100% test pass rate (pytest tests -v).</w:t>
+        <w:t>Authored 9 comprehensive unit tests across data ingestion, corridor routing, and simulation modules; achieved 100% test pass rate (pytest tests -v in 1.10s).</w:t>
       </w:r>
     </w:p>
     <w:p>
       <w:pPr>
-        <w:spacing w:before="240" w:after="80"/>
+        <w:spacing w:before="220" w:after="80"/>
       </w:pPr>
       <w:r>
         <w:rPr>
           <w:b/>
           <w:color w:val="102C57"/>
-          <w:sz w:val="23"/>
+          <w:sz w:val="22"/>
         </w:rPr>
-        <w:t>2. Evaluation &amp; Critical Reflection (So What?)</w:t>
+        <w:t>2. Primary Public Dataset Sources &amp; URLs</w:t>
+      </w:r>
+    </w:p>
+    <w:tbl>
+      <w:tblPr>
+        <w:tblW w:type="auto" w:w="0"/>
+        <w:jc w:val="center"/>
+        <w:tblLook w:firstColumn="1" w:firstRow="1" w:lastColumn="0" w:lastRow="0" w:noHBand="0" w:noVBand="1" w:val="04A0"/>
+      </w:tblPr>
+      <w:tblGrid>
+        <w:gridCol w:w="3312"/>
+        <w:gridCol w:w="3312"/>
+        <w:gridCol w:w="3312"/>
+      </w:tblGrid>
+      <w:tr>
+        <w:tc>
+          <w:tcPr>
+            <w:tcW w:type="dxa" w:w="3312"/>
+            <w:shd w:fill="102C57"/>
+          </w:tcPr>
+          <w:p>
+            <w:r>
+              <w:rPr>
+                <w:b/>
+                <w:color w:val="FFFFFF"/>
+                <w:sz w:val="17"/>
+              </w:rPr>
+              <w:t>Dataset Source</w:t>
+            </w:r>
+          </w:p>
+        </w:tc>
+        <w:tc>
+          <w:tcPr>
+            <w:tcW w:type="dxa" w:w="3312"/>
+            <w:shd w:fill="102C57"/>
+          </w:tcPr>
+          <w:p>
+            <w:r>
+              <w:rPr>
+                <w:b/>
+                <w:color w:val="FFFFFF"/>
+                <w:sz w:val="17"/>
+              </w:rPr>
+              <w:t>Direct Public URL</w:t>
+            </w:r>
+          </w:p>
+        </w:tc>
+        <w:tc>
+          <w:tcPr>
+            <w:tcW w:type="dxa" w:w="3312"/>
+            <w:shd w:fill="102C57"/>
+          </w:tcPr>
+          <w:p>
+            <w:r>
+              <w:rPr>
+                <w:b/>
+                <w:color w:val="FFFFFF"/>
+                <w:sz w:val="17"/>
+              </w:rPr>
+              <w:t>Project Purpose</w:t>
+            </w:r>
+          </w:p>
+        </w:tc>
+      </w:tr>
+      <w:tr>
+        <w:tc>
+          <w:tcPr>
+            <w:tcW w:type="dxa" w:w="3312"/>
+            <w:shd w:fill="FFFFFF"/>
+          </w:tcPr>
+          <w:p>
+            <w:r>
+              <w:rPr>
+                <w:sz w:val="16"/>
+              </w:rPr>
+              <w:t>CSO Table TBQ01 (Vessel Arrivals)</w:t>
+            </w:r>
+          </w:p>
+        </w:tc>
+        <w:tc>
+          <w:tcPr>
+            <w:tcW w:type="dxa" w:w="3312"/>
+            <w:shd w:fill="FFFFFF"/>
+          </w:tcPr>
+          <w:p>
+            <w:r>
+              <w:rPr>
+                <w:sz w:val="16"/>
+              </w:rPr>
+              <w:t>https://data.cso.ie/table/TBQ01</w:t>
+            </w:r>
+          </w:p>
+        </w:tc>
+        <w:tc>
+          <w:tcPr>
+            <w:tcW w:type="dxa" w:w="3312"/>
+            <w:shd w:fill="FFFFFF"/>
+          </w:tcPr>
+          <w:p>
+            <w:r>
+              <w:rPr>
+                <w:sz w:val="16"/>
+              </w:rPr>
+              <w:t>Port ship traffic into Dublin, Cork, Rosslare (C1 Classifier)</w:t>
+            </w:r>
+          </w:p>
+        </w:tc>
+      </w:tr>
+      <w:tr>
+        <w:tc>
+          <w:tcPr>
+            <w:tcW w:type="dxa" w:w="3312"/>
+            <w:shd w:fill="F9FAFC"/>
+          </w:tcPr>
+          <w:p>
+            <w:r>
+              <w:rPr>
+                <w:sz w:val="16"/>
+              </w:rPr>
+              <w:t>CSO Table TBQ02 (Goods by Cargo)</w:t>
+            </w:r>
+          </w:p>
+        </w:tc>
+        <w:tc>
+          <w:tcPr>
+            <w:tcW w:type="dxa" w:w="3312"/>
+            <w:shd w:fill="F9FAFC"/>
+          </w:tcPr>
+          <w:p>
+            <w:r>
+              <w:rPr>
+                <w:sz w:val="16"/>
+              </w:rPr>
+              <w:t>https://data.cso.ie/table/TBQ02</w:t>
+            </w:r>
+          </w:p>
+        </w:tc>
+        <w:tc>
+          <w:tcPr>
+            <w:tcW w:type="dxa" w:w="3312"/>
+            <w:shd w:fill="F9FAFC"/>
+          </w:tcPr>
+          <w:p>
+            <w:r>
+              <w:rPr>
+                <w:sz w:val="16"/>
+              </w:rPr>
+              <w:t>Ro-Ro and Lo-Lo cargo tonnages across Irish ports</w:t>
+            </w:r>
+          </w:p>
+        </w:tc>
+      </w:tr>
+      <w:tr>
+        <w:tc>
+          <w:tcPr>
+            <w:tcW w:type="dxa" w:w="3312"/>
+            <w:shd w:fill="FFFFFF"/>
+          </w:tcPr>
+          <w:p>
+            <w:r>
+              <w:rPr>
+                <w:sz w:val="16"/>
+              </w:rPr>
+              <w:t>CSO Table TBQ04 (Ro-Ro Units)</w:t>
+            </w:r>
+          </w:p>
+        </w:tc>
+        <w:tc>
+          <w:tcPr>
+            <w:tcW w:type="dxa" w:w="3312"/>
+            <w:shd w:fill="FFFFFF"/>
+          </w:tcPr>
+          <w:p>
+            <w:r>
+              <w:rPr>
+                <w:sz w:val="16"/>
+              </w:rPr>
+              <w:t>https://data.cso.ie/table/TBQ04</w:t>
+            </w:r>
+          </w:p>
+        </w:tc>
+        <w:tc>
+          <w:tcPr>
+            <w:tcW w:type="dxa" w:w="3312"/>
+            <w:shd w:fill="FFFFFF"/>
+          </w:tcPr>
+          <w:p>
+            <w:r>
+              <w:rPr>
+                <w:sz w:val="16"/>
+              </w:rPr>
+              <w:t>Accompanied and unaccompanied trailer traffic (C1 Congestion)</w:t>
+            </w:r>
+          </w:p>
+        </w:tc>
+      </w:tr>
+      <w:tr>
+        <w:tc>
+          <w:tcPr>
+            <w:tcW w:type="dxa" w:w="3312"/>
+            <w:shd w:fill="F9FAFC"/>
+          </w:tcPr>
+          <w:p>
+            <w:r>
+              <w:rPr>
+                <w:sz w:val="16"/>
+              </w:rPr>
+              <w:t>CSO Table TBQ05 (Trade Regions)</w:t>
+            </w:r>
+          </w:p>
+        </w:tc>
+        <w:tc>
+          <w:tcPr>
+            <w:tcW w:type="dxa" w:w="3312"/>
+            <w:shd w:fill="F9FAFC"/>
+          </w:tcPr>
+          <w:p>
+            <w:r>
+              <w:rPr>
+                <w:sz w:val="16"/>
+              </w:rPr>
+              <w:t>https://data.cso.ie/table/TBQ05</w:t>
+            </w:r>
+          </w:p>
+        </w:tc>
+        <w:tc>
+          <w:tcPr>
+            <w:tcW w:type="dxa" w:w="3312"/>
+            <w:shd w:fill="F9FAFC"/>
+          </w:tcPr>
+          <w:p>
+            <w:r>
+              <w:rPr>
+                <w:sz w:val="16"/>
+              </w:rPr>
+              <w:t>Great Britain vs. EU trade flows for Post-Brexit delay calibration</w:t>
+            </w:r>
+          </w:p>
+        </w:tc>
+      </w:tr>
+      <w:tr>
+        <w:tc>
+          <w:tcPr>
+            <w:tcW w:type="dxa" w:w="3312"/>
+            <w:shd w:fill="FFFFFF"/>
+          </w:tcPr>
+          <w:p>
+            <w:r>
+              <w:rPr>
+                <w:sz w:val="16"/>
+              </w:rPr>
+              <w:t>EMODnet Marine Vessel Density</w:t>
+            </w:r>
+          </w:p>
+        </w:tc>
+        <w:tc>
+          <w:tcPr>
+            <w:tcW w:type="dxa" w:w="3312"/>
+            <w:shd w:fill="FFFFFF"/>
+          </w:tcPr>
+          <w:p>
+            <w:r>
+              <w:rPr>
+                <w:sz w:val="16"/>
+              </w:rPr>
+              <w:t>https://emodnet.ec.europa.eu/en/human-activities</w:t>
+            </w:r>
+          </w:p>
+        </w:tc>
+        <w:tc>
+          <w:tcPr>
+            <w:tcW w:type="dxa" w:w="3312"/>
+            <w:shd w:fill="FFFFFF"/>
+          </w:tcPr>
+          <w:p>
+            <w:r>
+              <w:rPr>
+                <w:sz w:val="16"/>
+              </w:rPr>
+              <w:t>AIS coastal shipping density grids around Irish waters</w:t>
+            </w:r>
+          </w:p>
+        </w:tc>
+      </w:tr>
+    </w:tbl>
+    <w:p>
+      <w:pPr>
+        <w:spacing w:after="120"/>
+      </w:pPr>
+    </w:p>
+    <w:p>
+      <w:pPr>
+        <w:spacing w:before="220" w:after="80"/>
+      </w:pPr>
+      <w:r>
+        <w:rPr>
+          <w:b/>
+          <w:color w:val="102C57"/>
+          <w:sz w:val="22"/>
+        </w:rPr>
+        <w:t>3. Evaluation &amp; Critical Reflection (So What?)</w:t>
       </w:r>
     </w:p>
     <w:p>
       <w:pPr>
         <w:pStyle w:val="ListBullet"/>
-        <w:spacing w:after="60"/>
+        <w:spacing w:after="50"/>
       </w:pPr>
       <w:r>
         <w:rPr>
           <w:b/>
-          <w:sz w:val="19"/>
+          <w:sz w:val="18"/>
         </w:rPr>
         <w:t xml:space="preserve">Validation of Research Problem: </w:t>
       </w:r>
       <w:r>
         <w:rPr>
-          <w:sz w:val="19"/>
+          <w:sz w:val="18"/>
         </w:rPr>
         <w:t>The Week 1 baseline simulation empirically validates the core research rationale: without predictive delay awareness, freight hauliers waste an average of 1.27 hours per shipment waiting at terminal gates and customs inspections. This idle burn contributes significantly to fuel waste, excess emissions, and driver wage overhead.</w:t>
       </w:r>
@@ -397,107 +735,107 @@
     <w:p>
       <w:pPr>
         <w:pStyle w:val="ListBullet"/>
-        <w:spacing w:after="60"/>
+        <w:spacing w:after="50"/>
       </w:pPr>
       <w:r>
         <w:rPr>
           <w:b/>
-          <w:sz w:val="19"/>
+          <w:sz w:val="18"/>
         </w:rPr>
         <w:t xml:space="preserve">Data Availability &amp; Quality: </w:t>
       </w:r>
       <w:r>
         <w:rPr>
-          <w:sz w:val="19"/>
+          <w:sz w:val="18"/>
         </w:rPr>
-        <w:t>Connecting to the live CSO PxStat API confirmed that high-quality, longitudinal quarterly maritime traffic records (2017–2026) are openly available for all main Irish commercial ports. This removes a major data acquisition risk for Component 1.</w:t>
+        <w:t>Connecting to the live CSO PxStat API confirmed that high-quality, longitudinal quarterly maritime traffic records (2017 to 2026) are openly available for all main Irish commercial ports. This removes a major data acquisition risk for Component 1.</w:t>
       </w:r>
     </w:p>
     <w:p>
       <w:pPr>
         <w:pStyle w:val="ListBullet"/>
-        <w:spacing w:after="60"/>
+        <w:spacing w:after="50"/>
       </w:pPr>
       <w:r>
         <w:rPr>
           <w:b/>
-          <w:sz w:val="19"/>
+          <w:sz w:val="18"/>
         </w:rPr>
         <w:t xml:space="preserve">Methodological Readiness: </w:t>
       </w:r>
       <w:r>
         <w:rPr>
-          <w:sz w:val="19"/>
+          <w:sz w:val="18"/>
         </w:rPr>
         <w:t>Having both the road network graph and the baseline FIFO simulator operational in Week 1 provides an immediate benchmark platform against which the machine learning predictions and Pareto route optimizer can be systematically evaluated in subsequent phases.</w:t>
       </w:r>
     </w:p>
     <w:p>
       <w:pPr>
-        <w:spacing w:before="240" w:after="80"/>
+        <w:spacing w:before="220" w:after="80"/>
       </w:pPr>
       <w:r>
         <w:rPr>
           <w:b/>
           <w:color w:val="102C57"/>
-          <w:sz w:val="23"/>
+          <w:sz w:val="22"/>
         </w:rPr>
-        <w:t>3. Action Plan &amp; Next Steps (Now What?)</w:t>
+        <w:t>4. Action Plan &amp; Next Steps (Now What?)</w:t>
       </w:r>
     </w:p>
     <w:p>
       <w:pPr>
         <w:pStyle w:val="ListBullet"/>
-        <w:spacing w:after="60"/>
+        <w:spacing w:after="50"/>
       </w:pPr>
       <w:r>
         <w:rPr>
           <w:b/>
-          <w:sz w:val="19"/>
+          <w:sz w:val="18"/>
         </w:rPr>
         <w:t xml:space="preserve">Oral Pitch Delivery (1 October): </w:t>
       </w:r>
       <w:r>
         <w:rPr>
-          <w:sz w:val="19"/>
+          <w:sz w:val="18"/>
         </w:rPr>
-        <w:t>Deliver the timed 1–2 minute project idea pitch to the academic panel and technical peers adhering to the 5-stage framework.</w:t>
+        <w:t>Deliver the timed 1-2 minute project idea pitch to the academic panel and technical peers adhering to the 5-stage framework.</w:t>
       </w:r>
     </w:p>
     <w:p>
       <w:pPr>
         <w:pStyle w:val="ListBullet"/>
-        <w:spacing w:after="60"/>
+        <w:spacing w:after="50"/>
       </w:pPr>
       <w:r>
         <w:rPr>
           <w:b/>
-          <w:sz w:val="19"/>
+          <w:sz w:val="18"/>
         </w:rPr>
         <w:t xml:space="preserve">Supervisory Review with Dr. Thanos Staikopoulos: </w:t>
       </w:r>
       <w:r>
         <w:rPr>
-          <w:sz w:val="19"/>
+          <w:sz w:val="18"/>
         </w:rPr>
-        <w:t>Present the Week 1 technical accomplishments (CSO data pipeline, corridor graph, and baseline simulation benchmark results) and align on refined SMART objectives.</w:t>
+        <w:t>Present the Week 1 technical accomplishments (CSO data pipeline, corridor graph, baseline simulation benchmark results, and Jupyter notebook) and align on refined SMART objectives.</w:t>
       </w:r>
     </w:p>
     <w:p>
       <w:pPr>
         <w:pStyle w:val="ListBullet"/>
-        <w:spacing w:after="60"/>
+        <w:spacing w:after="50"/>
       </w:pPr>
       <w:r>
         <w:rPr>
           <w:b/>
-          <w:sz w:val="19"/>
+          <w:sz w:val="18"/>
         </w:rPr>
         <w:t xml:space="preserve">EMODnet &amp; AIS Maritime Ingestion (Week 2): </w:t>
       </w:r>
       <w:r>
         <w:rPr>
-          <w:sz w:val="19"/>
+          <w:sz w:val="18"/>
         </w:rPr>
         <w:t>Incorporate EMODnet vessel density metrics to augment CSO quarterly data with spatial maritime congestion signals.</w:t>
       </w:r>
@@ -505,33 +843,33 @@
     <w:p>
       <w:pPr>
         <w:pStyle w:val="ListBullet"/>
-        <w:spacing w:after="60"/>
+        <w:spacing w:after="50"/>
       </w:pPr>
       <w:r>
         <w:rPr>
           <w:b/>
-          <w:sz w:val="19"/>
+          <w:sz w:val="18"/>
         </w:rPr>
         <w:t xml:space="preserve">Customs Generator Calibration (Week 3 / M1): </w:t>
       </w:r>
       <w:r>
         <w:rPr>
-          <w:sz w:val="19"/>
+          <w:sz w:val="18"/>
         </w:rPr>
         <w:t>Calibrate the synthetic customs clearance delay generator using published CSO trade statistics and literature validation ranges.</w:t>
       </w:r>
     </w:p>
     <w:p>
       <w:pPr>
-        <w:spacing w:before="240" w:after="80"/>
+        <w:spacing w:before="220" w:after="80"/>
       </w:pPr>
       <w:r>
         <w:rPr>
           <w:b/>
           <w:color w:val="102C57"/>
-          <w:sz w:val="23"/>
+          <w:sz w:val="22"/>
         </w:rPr>
-        <w:t>4. Supervisor Meeting Log &amp; Agreed Actions</w:t>
+        <w:t>5. Supervisor Meeting Log &amp; Agreed Actions</w:t>
       </w:r>
     </w:p>
     <w:tbl>
@@ -554,7 +892,7 @@
             <w:r>
               <w:rPr>
                 <w:b/>
-                <w:sz w:val="18"/>
+                <w:sz w:val="17"/>
               </w:rPr>
               <w:t>Agenda Items Discussed:</w:t>
             </w:r>
@@ -568,13 +906,13 @@
           <w:p>
             <w:r>
               <w:rPr>
-                <w:sz w:val="18"/>
+                <w:sz w:val="17"/>
               </w:rPr>
               <w:t>1. Review of CA2 Proposal, Literature Reference Archive &amp; Ethics Declaration.</w:t>
               <w:br/>
               <w:t>2. Rehearsal and structure of the 1 October Project Pitch.</w:t>
               <w:br/>
-              <w:t>3. Demonstration of Week 1 technical deliverables: Git repo, CSO data pipeline, and baseline FIFO simulation benchmark.</w:t>
+              <w:t>3. Demonstration of Week 1 technical deliverables: Git repo, CSO data pipeline, Jupyter notebook, and baseline FIFO simulation benchmark.</w:t>
             </w:r>
           </w:p>
         </w:tc>
@@ -589,7 +927,7 @@
             <w:r>
               <w:rPr>
                 <w:b/>
-                <w:sz w:val="18"/>
+                <w:sz w:val="17"/>
               </w:rPr>
               <w:t>Supervisor Guidance &amp; Feedback:</w:t>
             </w:r>
@@ -603,13 +941,13 @@
           <w:p>
             <w:r>
               <w:rPr>
-                <w:sz w:val="18"/>
+                <w:sz w:val="17"/>
               </w:rPr>
-              <w:t>• Emphasize the empirical gap between unbuffered spreadsheet planning and predictive optimization.</w:t>
+              <w:t>- Emphasize the empirical gap between unbuffered spreadsheet planning and predictive optimization.</w:t>
               <w:br/>
-              <w:t>• Maintain clean modular separation across the 3 core components.</w:t>
+              <w:t>- Maintain clean modular separation across the 3 core components.</w:t>
               <w:br/>
-              <w:t>• Ensure baseline simulation parameters are transparently grounded in Irish logistics costs.</w:t>
+              <w:t>- Ensure baseline simulation parameters are transparently grounded in Irish logistics costs.</w:t>
             </w:r>
           </w:p>
         </w:tc>
@@ -624,7 +962,7 @@
             <w:r>
               <w:rPr>
                 <w:b/>
-                <w:sz w:val="18"/>
+                <w:sz w:val="17"/>
               </w:rPr>
               <w:t>Agreed Action Items &amp; Deadlines:</w:t>
             </w:r>
@@ -638,9 +976,9 @@
           <w:p>
             <w:r>
               <w:rPr>
-                <w:sz w:val="18"/>
+                <w:sz w:val="17"/>
               </w:rPr>
-              <w:t>1. Deliver 1–2 minute pitch on 1 October 2026.</w:t>
+              <w:t>1. Deliver 1-2 minute pitch on 1 October 2026.</w:t>
               <w:br/>
               <w:t>2. Submit weekly progress updates every Tuesday.</w:t>
               <w:br/>
@@ -659,7 +997,7 @@
             <w:r>
               <w:rPr>
                 <w:b/>
-                <w:sz w:val="18"/>
+                <w:sz w:val="17"/>
               </w:rPr>
               <w:t>Target Date for Next Meeting:</w:t>
             </w:r>
@@ -673,7 +1011,7 @@
           <w:p>
             <w:r>
               <w:rPr>
-                <w:sz w:val="18"/>
+                <w:sz w:val="17"/>
               </w:rPr>
               <w:t>Week 2 Scheduled Supervision Review (Tuesday, 6 October 2026)</w:t>
             </w:r>
@@ -688,15 +1026,15 @@
     </w:p>
     <w:p>
       <w:pPr>
-        <w:spacing w:before="240" w:after="80"/>
+        <w:spacing w:before="220" w:after="80"/>
       </w:pPr>
       <w:r>
         <w:rPr>
           <w:b/>
           <w:color w:val="102C57"/>
-          <w:sz w:val="23"/>
+          <w:sz w:val="22"/>
         </w:rPr>
-        <w:t>5. Project Milestone &amp; Gantt Tracking</w:t>
+        <w:t>6. Project Milestone &amp; Gantt Tracking</w:t>
       </w:r>
     </w:p>
     <w:tbl>
@@ -722,7 +1060,7 @@
               <w:rPr>
                 <w:b/>
                 <w:color w:val="FFFFFF"/>
-                <w:sz w:val="18"/>
+                <w:sz w:val="17"/>
               </w:rPr>
               <w:t>Milestone</w:t>
             </w:r>
@@ -738,7 +1076,7 @@
               <w:rPr>
                 <w:b/>
                 <w:color w:val="FFFFFF"/>
-                <w:sz w:val="18"/>
+                <w:sz w:val="17"/>
               </w:rPr>
               <w:t>Target Week</w:t>
             </w:r>
@@ -754,7 +1092,7 @@
               <w:rPr>
                 <w:b/>
                 <w:color w:val="FFFFFF"/>
-                <w:sz w:val="18"/>
+                <w:sz w:val="17"/>
               </w:rPr>
               <w:t>Current Status</w:t>
             </w:r>
@@ -770,7 +1108,7 @@
               <w:rPr>
                 <w:b/>
                 <w:color w:val="FFFFFF"/>
-                <w:sz w:val="18"/>
+                <w:sz w:val="17"/>
               </w:rPr>
               <w:t>Deliverable Summary</w:t>
             </w:r>
@@ -786,7 +1124,7 @@
           <w:p>
             <w:r>
               <w:rPr>
-                <w:sz w:val="17"/>
+                <w:sz w:val="16"/>
               </w:rPr>
               <w:t>Milestone 1 (M1)</w:t>
             </w:r>
@@ -800,7 +1138,7 @@
           <w:p>
             <w:r>
               <w:rPr>
-                <w:sz w:val="17"/>
+                <w:sz w:val="16"/>
               </w:rPr>
               <w:t>Week 3</w:t>
             </w:r>
@@ -816,7 +1154,7 @@
               <w:rPr>
                 <w:b/>
                 <w:color w:val="008000"/>
-                <w:sz w:val="17"/>
+                <w:sz w:val="16"/>
               </w:rPr>
               <w:t>ADVANCED / ON SCHEDULE</w:t>
             </w:r>
@@ -830,7 +1168,7 @@
           <w:p>
             <w:r>
               <w:rPr>
-                <w:sz w:val="17"/>
+                <w:sz w:val="16"/>
               </w:rPr>
               <w:t>Baseline FIFO model operational; CSO maritime data ingested; corridor graph built</w:t>
             </w:r>
@@ -846,7 +1184,7 @@
           <w:p>
             <w:r>
               <w:rPr>
-                <w:sz w:val="17"/>
+                <w:sz w:val="16"/>
               </w:rPr>
               <w:t>Milestone 2 (M2)</w:t>
             </w:r>
@@ -860,7 +1198,7 @@
           <w:p>
             <w:r>
               <w:rPr>
-                <w:sz w:val="17"/>
+                <w:sz w:val="16"/>
               </w:rPr>
               <w:t>Week 9</w:t>
             </w:r>
@@ -874,7 +1212,7 @@
           <w:p>
             <w:r>
               <w:rPr>
-                <w:sz w:val="17"/>
+                <w:sz w:val="16"/>
               </w:rPr>
               <w:t>PLANNED</w:t>
             </w:r>
@@ -888,7 +1226,7 @@
           <w:p>
             <w:r>
               <w:rPr>
-                <w:sz w:val="17"/>
+                <w:sz w:val="16"/>
               </w:rPr>
               <w:t>XGBoost models (C1, C2) coupled with Pareto Optimizer (C3)</w:t>
             </w:r>
@@ -904,7 +1242,7 @@
           <w:p>
             <w:r>
               <w:rPr>
-                <w:sz w:val="17"/>
+                <w:sz w:val="16"/>
               </w:rPr>
               <w:t>Milestone 3 (M3)</w:t>
             </w:r>
@@ -918,7 +1256,7 @@
           <w:p>
             <w:r>
               <w:rPr>
-                <w:sz w:val="17"/>
+                <w:sz w:val="16"/>
               </w:rPr>
               <w:t>Week 13</w:t>
             </w:r>
@@ -932,7 +1270,7 @@
           <w:p>
             <w:r>
               <w:rPr>
-                <w:sz w:val="17"/>
+                <w:sz w:val="16"/>
               </w:rPr>
               <w:t>PLANNED</w:t>
             </w:r>
@@ -946,7 +1284,7 @@
           <w:p>
             <w:r>
               <w:rPr>
-                <w:sz w:val="17"/>
+                <w:sz w:val="16"/>
               </w:rPr>
               <w:t>Dual-system comparative evaluation &amp; Streamlit UI dashboard</w:t>
             </w:r>
@@ -962,7 +1300,7 @@
           <w:p>
             <w:r>
               <w:rPr>
-                <w:sz w:val="17"/>
+                <w:sz w:val="16"/>
               </w:rPr>
               <w:t>Milestone 4 (M4)</w:t>
             </w:r>
@@ -976,7 +1314,7 @@
           <w:p>
             <w:r>
               <w:rPr>
-                <w:sz w:val="17"/>
+                <w:sz w:val="16"/>
               </w:rPr>
               <w:t>Week 15</w:t>
             </w:r>
@@ -990,7 +1328,7 @@
           <w:p>
             <w:r>
               <w:rPr>
-                <w:sz w:val="17"/>
+                <w:sz w:val="16"/>
               </w:rPr>
               <w:t>PLANNED</w:t>
             </w:r>
@@ -1004,7 +1342,7 @@
           <w:p>
             <w:r>
               <w:rPr>
-                <w:sz w:val="17"/>
+                <w:sz w:val="16"/>
               </w:rPr>
               <w:t>Final MSc Dissertation, code repository, and Viva Voce</w:t>
             </w:r>
@@ -1014,26 +1352,26 @@
     </w:tbl>
     <w:p>
       <w:pPr>
-        <w:spacing w:after="200"/>
+        <w:spacing w:after="160"/>
       </w:pPr>
     </w:p>
     <w:p>
       <w:pPr>
-        <w:spacing w:before="240" w:after="80"/>
+        <w:spacing w:before="220" w:after="80"/>
       </w:pPr>
       <w:r>
         <w:rPr>
           <w:b/>
           <w:color w:val="102C57"/>
-          <w:sz w:val="23"/>
+          <w:sz w:val="22"/>
         </w:rPr>
-        <w:t>6. Formal Declaration &amp; Sign-Off</w:t>
+        <w:t>7. Formal Declaration &amp; Sign-Off</w:t>
       </w:r>
     </w:p>
     <w:p>
       <w:r>
         <w:rPr>
-          <w:sz w:val="19"/>
+          <w:sz w:val="18"/>
         </w:rPr>
         <w:t>Student Signature: Rohitkumar Amritlal Jaiswal                      Date: 29 September 2026</w:t>
         <w:br/>

</xml_diff>

<commit_message>
docs(week1): streamline weekly report into small, concise, easy-language version without prior submission items
</commit_message>
<xml_diff>
--- a/NCI_MSc_Data_Analytics_Weekly_Progress_Report_Week1.docx
+++ b/NCI_MSc_Data_Analytics_Weekly_Progress_Report_Week1.docx
@@ -4,32 +4,32 @@
   <w:body>
     <w:p>
       <w:pPr>
+        <w:spacing w:after="40"/>
         <w:jc w:val="center"/>
       </w:pPr>
       <w:r>
         <w:rPr>
           <w:b/>
           <w:color w:val="102C57"/>
-          <w:sz w:val="28"/>
+          <w:sz w:val="26"/>
         </w:rPr>
-        <w:t>NATIONAL COLLEGE OF IRELAND</w:t>
-        <w:br/>
-        <w:t>SCHOOL OF COMPUTING</w:t>
+        <w:t>NATIONAL COLLEGE OF IRELAND: SCHOOL OF COMPUTING</w:t>
       </w:r>
     </w:p>
     <w:p>
       <w:pPr>
+        <w:spacing w:after="160"/>
         <w:jc w:val="center"/>
       </w:pPr>
       <w:r>
         <w:rPr>
           <w:b/>
-          <w:color w:val="323232"/>
-          <w:sz w:val="22"/>
+          <w:color w:val="3C3C3C"/>
+          <w:sz w:val="21"/>
         </w:rPr>
-        <w:t>Master of Science in Data Analytics (MSCDAD)</w:t>
+        <w:t>MSc in Data Analytics: Research Practicum (MSCDAD_A_JAN26I)</w:t>
         <w:br/>
-        <w:t>RESEARCH PRACTICUM (MSCDAD_A_JAN26I): WEEKLY PROGRESS REPORT</w:t>
+        <w:t>WEEKLY PROGRESS REPORT: WEEK 1</w:t>
       </w:r>
     </w:p>
     <w:tbl>
@@ -40,20 +40,23 @@
         <w:tblLook w:firstColumn="1" w:firstRow="1" w:lastColumn="0" w:lastRow="0" w:noHBand="0" w:noVBand="1" w:val="04A0"/>
       </w:tblPr>
       <w:tblGrid>
-        <w:gridCol w:w="4968"/>
-        <w:gridCol w:w="4968"/>
+        <w:gridCol w:w="5112"/>
+        <w:gridCol w:w="5112"/>
       </w:tblGrid>
       <w:tr>
         <w:tc>
           <w:tcPr>
-            <w:tcW w:type="dxa" w:w="3168"/>
+            <w:tcW w:type="dxa" w:w="2592"/>
             <w:shd w:fill="F0F4F8"/>
           </w:tcPr>
           <w:p>
+            <w:pPr>
+              <w:spacing w:after="20"/>
+            </w:pPr>
             <w:r>
               <w:rPr>
                 <w:b/>
-                <w:sz w:val="19"/>
+                <w:sz w:val="18"/>
               </w:rPr>
               <w:t>Student Name:</w:t>
             </w:r>
@@ -61,13 +64,16 @@
         </w:tc>
         <w:tc>
           <w:tcPr>
-            <w:tcW w:type="dxa" w:w="6768"/>
+            <w:tcW w:type="dxa" w:w="7488"/>
             <w:shd w:fill="FFFFFF"/>
           </w:tcPr>
           <w:p>
+            <w:pPr>
+              <w:spacing w:after="20"/>
+            </w:pPr>
             <w:r>
               <w:rPr>
-                <w:sz w:val="19"/>
+                <w:sz w:val="18"/>
               </w:rPr>
               <w:t>Rohitkumar Amritlal Jaiswal</w:t>
             </w:r>
@@ -77,28 +83,34 @@
       <w:tr>
         <w:tc>
           <w:tcPr>
-            <w:tcW w:type="dxa" w:w="3168"/>
+            <w:tcW w:type="dxa" w:w="2592"/>
             <w:shd w:fill="F0F4F8"/>
           </w:tcPr>
           <w:p>
+            <w:pPr>
+              <w:spacing w:after="20"/>
+            </w:pPr>
             <w:r>
               <w:rPr>
                 <w:b/>
-                <w:sz w:val="19"/>
+                <w:sz w:val="18"/>
               </w:rPr>
-              <w:t>Student ID Number:</w:t>
+              <w:t>Student ID:</w:t>
             </w:r>
           </w:p>
         </w:tc>
         <w:tc>
           <w:tcPr>
-            <w:tcW w:type="dxa" w:w="6768"/>
+            <w:tcW w:type="dxa" w:w="7488"/>
             <w:shd w:fill="FFFFFF"/>
           </w:tcPr>
           <w:p>
+            <w:pPr>
+              <w:spacing w:after="20"/>
+            </w:pPr>
             <w:r>
               <w:rPr>
-                <w:sz w:val="19"/>
+                <w:sz w:val="18"/>
               </w:rPr>
               <w:t>x25119613</w:t>
             </w:r>
@@ -108,28 +120,34 @@
       <w:tr>
         <w:tc>
           <w:tcPr>
-            <w:tcW w:type="dxa" w:w="3168"/>
+            <w:tcW w:type="dxa" w:w="2592"/>
             <w:shd w:fill="F0F4F8"/>
           </w:tcPr>
           <w:p>
+            <w:pPr>
+              <w:spacing w:after="20"/>
+            </w:pPr>
             <w:r>
               <w:rPr>
                 <w:b/>
-                <w:sz w:val="19"/>
+                <w:sz w:val="18"/>
               </w:rPr>
-              <w:t>Academic Supervisor:</w:t>
+              <w:t>Supervisor:</w:t>
             </w:r>
           </w:p>
         </w:tc>
         <w:tc>
           <w:tcPr>
-            <w:tcW w:type="dxa" w:w="6768"/>
+            <w:tcW w:type="dxa" w:w="7488"/>
             <w:shd w:fill="FFFFFF"/>
           </w:tcPr>
           <w:p>
+            <w:pPr>
+              <w:spacing w:after="20"/>
+            </w:pPr>
             <w:r>
               <w:rPr>
-                <w:sz w:val="19"/>
+                <w:sz w:val="18"/>
               </w:rPr>
               <w:t>Dr. Thanos Staikopoulos</w:t>
             </w:r>
@@ -139,14 +157,17 @@
       <w:tr>
         <w:tc>
           <w:tcPr>
-            <w:tcW w:type="dxa" w:w="3168"/>
+            <w:tcW w:type="dxa" w:w="2592"/>
             <w:shd w:fill="F0F4F8"/>
           </w:tcPr>
           <w:p>
+            <w:pPr>
+              <w:spacing w:after="20"/>
+            </w:pPr>
             <w:r>
               <w:rPr>
                 <w:b/>
-                <w:sz w:val="19"/>
+                <w:sz w:val="18"/>
               </w:rPr>
               <w:t>Project Title:</w:t>
             </w:r>
@@ -154,13 +175,16 @@
         </w:tc>
         <w:tc>
           <w:tcPr>
-            <w:tcW w:type="dxa" w:w="6768"/>
+            <w:tcW w:type="dxa" w:w="7488"/>
             <w:shd w:fill="FFFFFF"/>
           </w:tcPr>
           <w:p>
+            <w:pPr>
+              <w:spacing w:after="20"/>
+            </w:pPr>
             <w:r>
               <w:rPr>
-                <w:sz w:val="19"/>
+                <w:sz w:val="18"/>
               </w:rPr>
               <w:t>Coupling Port Congestion and Customs Delay Prediction with Carbon-Aware Multi-Objective Route Optimisation for Post-Brexit Irish Freight Logistics</w:t>
             </w:r>
@@ -170,30 +194,36 @@
       <w:tr>
         <w:tc>
           <w:tcPr>
-            <w:tcW w:type="dxa" w:w="3168"/>
+            <w:tcW w:type="dxa" w:w="2592"/>
             <w:shd w:fill="F0F4F8"/>
           </w:tcPr>
           <w:p>
+            <w:pPr>
+              <w:spacing w:after="20"/>
+            </w:pPr>
             <w:r>
               <w:rPr>
                 <w:b/>
-                <w:sz w:val="19"/>
+                <w:sz w:val="18"/>
               </w:rPr>
-              <w:t>Reporting Period / Date:</w:t>
+              <w:t>Reporting Period:</w:t>
             </w:r>
           </w:p>
         </w:tc>
         <w:tc>
           <w:tcPr>
-            <w:tcW w:type="dxa" w:w="6768"/>
+            <w:tcW w:type="dxa" w:w="7488"/>
             <w:shd w:fill="FFFFFF"/>
           </w:tcPr>
           <w:p>
+            <w:pPr>
+              <w:spacing w:after="20"/>
+            </w:pPr>
             <w:r>
               <w:rPr>
-                <w:sz w:val="19"/>
+                <w:sz w:val="18"/>
               </w:rPr>
-              <w:t>Week 1 (Kickoff, Technical Initialization &amp; Baseline Benchmark) | Tuesday, 29 September 2026</w:t>
+              <w:t>Week 1 (Technical Kickoff &amp; Baseline Simulation)</w:t>
             </w:r>
           </w:p>
         </w:tc>
@@ -201,476 +231,36 @@
       <w:tr>
         <w:tc>
           <w:tcPr>
-            <w:tcW w:type="dxa" w:w="3168"/>
+            <w:tcW w:type="dxa" w:w="2592"/>
             <w:shd w:fill="F0F4F8"/>
           </w:tcPr>
           <w:p>
+            <w:pPr>
+              <w:spacing w:after="20"/>
+            </w:pPr>
             <w:r>
               <w:rPr>
                 <w:b/>
-                <w:sz w:val="19"/>
+                <w:sz w:val="18"/>
               </w:rPr>
-              <w:t>Meeting Mode &amp; Duration:</w:t>
+              <w:t>Submission Date:</w:t>
             </w:r>
           </w:p>
         </w:tc>
         <w:tc>
           <w:tcPr>
-            <w:tcW w:type="dxa" w:w="6768"/>
+            <w:tcW w:type="dxa" w:w="7488"/>
             <w:shd w:fill="FFFFFF"/>
           </w:tcPr>
           <w:p>
+            <w:pPr>
+              <w:spacing w:after="20"/>
+            </w:pPr>
             <w:r>
               <w:rPr>
-                <w:sz w:val="19"/>
+                <w:sz w:val="18"/>
               </w:rPr>
-              <w:t>Formal Submission &amp; Progress Review (45 Minutes)</w:t>
-            </w:r>
-          </w:p>
-        </w:tc>
-      </w:tr>
-    </w:tbl>
-    <w:p>
-      <w:pPr>
-        <w:spacing w:after="160"/>
-      </w:pPr>
-    </w:p>
-    <w:p>
-      <w:pPr>
-        <w:spacing w:before="220" w:after="80"/>
-      </w:pPr>
-      <w:r>
-        <w:rPr>
-          <w:b/>
-          <w:color w:val="102C57"/>
-          <w:sz w:val="22"/>
-        </w:rPr>
-        <w:t>1. Activities Completed This Week (What?)</w:t>
-      </w:r>
-    </w:p>
-    <w:p>
-      <w:pPr>
-        <w:pStyle w:val="ListBullet"/>
-        <w:spacing w:after="50"/>
-      </w:pPr>
-      <w:r>
-        <w:rPr>
-          <w:b/>
-          <w:sz w:val="18"/>
-        </w:rPr>
-        <w:t xml:space="preserve">Project Pitch Formulation: </w:t>
-      </w:r>
-      <w:r>
-        <w:rPr>
-          <w:sz w:val="18"/>
-        </w:rPr>
-        <w:t>Developed a structured 1-2 minute project pitch adhering to the required sequence (Problem -&gt; Gap -&gt; Idea -&gt; Method -&gt; Contribution) in preparation for the 1 October presentation.</w:t>
-      </w:r>
-    </w:p>
-    <w:p>
-      <w:pPr>
-        <w:pStyle w:val="ListBullet"/>
-        <w:spacing w:after="50"/>
-      </w:pPr>
-      <w:r>
-        <w:rPr>
-          <w:b/>
-          <w:sz w:val="18"/>
-        </w:rPr>
-        <w:t xml:space="preserve">Repository Architecture and Environment Setup: </w:t>
-      </w:r>
-      <w:r>
-        <w:rPr>
-          <w:sz w:val="18"/>
-        </w:rPr>
-        <w:t>Initialized the formal Git repository and structured the production-grade Python package (irishlogix) following modern PEP 621 packaging with pyproject.toml.</w:t>
-      </w:r>
-    </w:p>
-    <w:p>
-      <w:pPr>
-        <w:pStyle w:val="ListBullet"/>
-        <w:spacing w:after="50"/>
-      </w:pPr>
-      <w:r>
-        <w:rPr>
-          <w:b/>
-          <w:sz w:val="18"/>
-        </w:rPr>
-        <w:t xml:space="preserve">Automated Open Data Ingestion Pipeline (cso_loader.py): </w:t>
-      </w:r>
-      <w:r>
-        <w:rPr>
-          <w:sz w:val="18"/>
-        </w:rPr>
-        <w:t>Engineered and deployed an automated data ingestion client connecting directly to the Central Statistics Office (CSO) PxStat REST API. Successfully downloaded, cleaned, and cached: TBQ01 (444 vessel arrival records), TBQ04 (2,331 Ro-Ro freight unit traffic records), and TBQ05 (3,600 port tonnage records disaggregated by trade region - Great Britain vs. EU). Constructed the unified port activity matrix ready for C1 training.</w:t>
-      </w:r>
-    </w:p>
-    <w:p>
-      <w:pPr>
-        <w:pStyle w:val="ListBullet"/>
-        <w:spacing w:after="50"/>
-      </w:pPr>
-      <w:r>
-        <w:rPr>
-          <w:b/>
-          <w:sz w:val="18"/>
-        </w:rPr>
-        <w:t xml:space="preserve">Interactive Jupyter Notebook: </w:t>
-      </w:r>
-      <w:r>
-        <w:rPr>
-          <w:sz w:val="18"/>
-        </w:rPr>
-        <w:t>Created and executed notebooks/01_week1_data_ingestion_and_exploration.ipynb documenting live dataset downloads, longitudinal trend graphs (2017 to 2026), trade region shifts, and baseline routing metrics.</w:t>
-      </w:r>
-    </w:p>
-    <w:p>
-      <w:pPr>
-        <w:pStyle w:val="ListBullet"/>
-        <w:spacing w:after="50"/>
-      </w:pPr>
-      <w:r>
-        <w:rPr>
-          <w:b/>
-          <w:sz w:val="18"/>
-        </w:rPr>
-        <w:t xml:space="preserve">Irish Freight Corridor Road Network Graph (corridor_network.py): </w:t>
-      </w:r>
-      <w:r>
-        <w:rPr>
-          <w:sz w:val="18"/>
-        </w:rPr>
-        <w:t>Formulated a NetworkX graph modeling 11 strategic nodes (Dublin Port, Port of Cork, Rosslare Europort, M50 Logistics Hub, Athlone, Limerick/Shannon, Galway, Waterford, Dundalk) and 15 bidirectional corridor edges with road classifications, toll fees, HGV speed caps, and Dijkstra all-pairs distance matrices.</w:t>
-      </w:r>
-    </w:p>
-    <w:p>
-      <w:pPr>
-        <w:pStyle w:val="ListBullet"/>
-        <w:spacing w:after="50"/>
-      </w:pPr>
-      <w:r>
-        <w:rPr>
-          <w:b/>
-          <w:sz w:val="18"/>
-        </w:rPr>
-        <w:t xml:space="preserve">Baseline FIFO Dispatcher Simulation Engine (baseline_dispatcher.py): </w:t>
-      </w:r>
-      <w:r>
-        <w:rPr>
-          <w:sz w:val="18"/>
-        </w:rPr>
-        <w:t>Built and executed the First-In-First-Out empirical baseline simulation modeling traditional SME unbuffered scheduling across 50 benchmark consignments: 8,636.5 km transit distance; 104.4 driving hours; 63.5 idle waiting hours (averaging 1.27 hours wasted idling per consignment); 2,879.3 L diesel consumed; 7,601.3 kg CO2e emitted; total operational cost of €14,791.21 (avg €295.82 per trip).</w:t>
-      </w:r>
-    </w:p>
-    <w:p>
-      <w:pPr>
-        <w:pStyle w:val="ListBullet"/>
-        <w:spacing w:after="50"/>
-      </w:pPr>
-      <w:r>
-        <w:rPr>
-          <w:b/>
-          <w:sz w:val="18"/>
-        </w:rPr>
-        <w:t xml:space="preserve">Unit Testing Suite: </w:t>
-      </w:r>
-      <w:r>
-        <w:rPr>
-          <w:sz w:val="18"/>
-        </w:rPr>
-        <w:t>Authored 9 comprehensive unit tests across data ingestion, corridor routing, and simulation modules; achieved 100% test pass rate (pytest tests -v in 1.10s).</w:t>
-      </w:r>
-    </w:p>
-    <w:p>
-      <w:pPr>
-        <w:spacing w:before="220" w:after="80"/>
-      </w:pPr>
-      <w:r>
-        <w:rPr>
-          <w:b/>
-          <w:color w:val="102C57"/>
-          <w:sz w:val="22"/>
-        </w:rPr>
-        <w:t>2. Primary Public Dataset Sources &amp; URLs</w:t>
-      </w:r>
-    </w:p>
-    <w:tbl>
-      <w:tblPr>
-        <w:tblW w:type="auto" w:w="0"/>
-        <w:jc w:val="center"/>
-        <w:tblLook w:firstColumn="1" w:firstRow="1" w:lastColumn="0" w:lastRow="0" w:noHBand="0" w:noVBand="1" w:val="04A0"/>
-      </w:tblPr>
-      <w:tblGrid>
-        <w:gridCol w:w="3312"/>
-        <w:gridCol w:w="3312"/>
-        <w:gridCol w:w="3312"/>
-      </w:tblGrid>
-      <w:tr>
-        <w:tc>
-          <w:tcPr>
-            <w:tcW w:type="dxa" w:w="3312"/>
-            <w:shd w:fill="102C57"/>
-          </w:tcPr>
-          <w:p>
-            <w:r>
-              <w:rPr>
-                <w:b/>
-                <w:color w:val="FFFFFF"/>
-                <w:sz w:val="17"/>
-              </w:rPr>
-              <w:t>Dataset Source</w:t>
-            </w:r>
-          </w:p>
-        </w:tc>
-        <w:tc>
-          <w:tcPr>
-            <w:tcW w:type="dxa" w:w="3312"/>
-            <w:shd w:fill="102C57"/>
-          </w:tcPr>
-          <w:p>
-            <w:r>
-              <w:rPr>
-                <w:b/>
-                <w:color w:val="FFFFFF"/>
-                <w:sz w:val="17"/>
-              </w:rPr>
-              <w:t>Direct Public URL</w:t>
-            </w:r>
-          </w:p>
-        </w:tc>
-        <w:tc>
-          <w:tcPr>
-            <w:tcW w:type="dxa" w:w="3312"/>
-            <w:shd w:fill="102C57"/>
-          </w:tcPr>
-          <w:p>
-            <w:r>
-              <w:rPr>
-                <w:b/>
-                <w:color w:val="FFFFFF"/>
-                <w:sz w:val="17"/>
-              </w:rPr>
-              <w:t>Project Purpose</w:t>
-            </w:r>
-          </w:p>
-        </w:tc>
-      </w:tr>
-      <w:tr>
-        <w:tc>
-          <w:tcPr>
-            <w:tcW w:type="dxa" w:w="3312"/>
-            <w:shd w:fill="FFFFFF"/>
-          </w:tcPr>
-          <w:p>
-            <w:r>
-              <w:rPr>
-                <w:sz w:val="16"/>
-              </w:rPr>
-              <w:t>CSO Table TBQ01 (Vessel Arrivals)</w:t>
-            </w:r>
-          </w:p>
-        </w:tc>
-        <w:tc>
-          <w:tcPr>
-            <w:tcW w:type="dxa" w:w="3312"/>
-            <w:shd w:fill="FFFFFF"/>
-          </w:tcPr>
-          <w:p>
-            <w:r>
-              <w:rPr>
-                <w:sz w:val="16"/>
-              </w:rPr>
-              <w:t>https://data.cso.ie/table/TBQ01</w:t>
-            </w:r>
-          </w:p>
-        </w:tc>
-        <w:tc>
-          <w:tcPr>
-            <w:tcW w:type="dxa" w:w="3312"/>
-            <w:shd w:fill="FFFFFF"/>
-          </w:tcPr>
-          <w:p>
-            <w:r>
-              <w:rPr>
-                <w:sz w:val="16"/>
-              </w:rPr>
-              <w:t>Port ship traffic into Dublin, Cork, Rosslare (C1 Classifier)</w:t>
-            </w:r>
-          </w:p>
-        </w:tc>
-      </w:tr>
-      <w:tr>
-        <w:tc>
-          <w:tcPr>
-            <w:tcW w:type="dxa" w:w="3312"/>
-            <w:shd w:fill="F9FAFC"/>
-          </w:tcPr>
-          <w:p>
-            <w:r>
-              <w:rPr>
-                <w:sz w:val="16"/>
-              </w:rPr>
-              <w:t>CSO Table TBQ02 (Goods by Cargo)</w:t>
-            </w:r>
-          </w:p>
-        </w:tc>
-        <w:tc>
-          <w:tcPr>
-            <w:tcW w:type="dxa" w:w="3312"/>
-            <w:shd w:fill="F9FAFC"/>
-          </w:tcPr>
-          <w:p>
-            <w:r>
-              <w:rPr>
-                <w:sz w:val="16"/>
-              </w:rPr>
-              <w:t>https://data.cso.ie/table/TBQ02</w:t>
-            </w:r>
-          </w:p>
-        </w:tc>
-        <w:tc>
-          <w:tcPr>
-            <w:tcW w:type="dxa" w:w="3312"/>
-            <w:shd w:fill="F9FAFC"/>
-          </w:tcPr>
-          <w:p>
-            <w:r>
-              <w:rPr>
-                <w:sz w:val="16"/>
-              </w:rPr>
-              <w:t>Ro-Ro and Lo-Lo cargo tonnages across Irish ports</w:t>
-            </w:r>
-          </w:p>
-        </w:tc>
-      </w:tr>
-      <w:tr>
-        <w:tc>
-          <w:tcPr>
-            <w:tcW w:type="dxa" w:w="3312"/>
-            <w:shd w:fill="FFFFFF"/>
-          </w:tcPr>
-          <w:p>
-            <w:r>
-              <w:rPr>
-                <w:sz w:val="16"/>
-              </w:rPr>
-              <w:t>CSO Table TBQ04 (Ro-Ro Units)</w:t>
-            </w:r>
-          </w:p>
-        </w:tc>
-        <w:tc>
-          <w:tcPr>
-            <w:tcW w:type="dxa" w:w="3312"/>
-            <w:shd w:fill="FFFFFF"/>
-          </w:tcPr>
-          <w:p>
-            <w:r>
-              <w:rPr>
-                <w:sz w:val="16"/>
-              </w:rPr>
-              <w:t>https://data.cso.ie/table/TBQ04</w:t>
-            </w:r>
-          </w:p>
-        </w:tc>
-        <w:tc>
-          <w:tcPr>
-            <w:tcW w:type="dxa" w:w="3312"/>
-            <w:shd w:fill="FFFFFF"/>
-          </w:tcPr>
-          <w:p>
-            <w:r>
-              <w:rPr>
-                <w:sz w:val="16"/>
-              </w:rPr>
-              <w:t>Accompanied and unaccompanied trailer traffic (C1 Congestion)</w:t>
-            </w:r>
-          </w:p>
-        </w:tc>
-      </w:tr>
-      <w:tr>
-        <w:tc>
-          <w:tcPr>
-            <w:tcW w:type="dxa" w:w="3312"/>
-            <w:shd w:fill="F9FAFC"/>
-          </w:tcPr>
-          <w:p>
-            <w:r>
-              <w:rPr>
-                <w:sz w:val="16"/>
-              </w:rPr>
-              <w:t>CSO Table TBQ05 (Trade Regions)</w:t>
-            </w:r>
-          </w:p>
-        </w:tc>
-        <w:tc>
-          <w:tcPr>
-            <w:tcW w:type="dxa" w:w="3312"/>
-            <w:shd w:fill="F9FAFC"/>
-          </w:tcPr>
-          <w:p>
-            <w:r>
-              <w:rPr>
-                <w:sz w:val="16"/>
-              </w:rPr>
-              <w:t>https://data.cso.ie/table/TBQ05</w:t>
-            </w:r>
-          </w:p>
-        </w:tc>
-        <w:tc>
-          <w:tcPr>
-            <w:tcW w:type="dxa" w:w="3312"/>
-            <w:shd w:fill="F9FAFC"/>
-          </w:tcPr>
-          <w:p>
-            <w:r>
-              <w:rPr>
-                <w:sz w:val="16"/>
-              </w:rPr>
-              <w:t>Great Britain vs. EU trade flows for Post-Brexit delay calibration</w:t>
-            </w:r>
-          </w:p>
-        </w:tc>
-      </w:tr>
-      <w:tr>
-        <w:tc>
-          <w:tcPr>
-            <w:tcW w:type="dxa" w:w="3312"/>
-            <w:shd w:fill="FFFFFF"/>
-          </w:tcPr>
-          <w:p>
-            <w:r>
-              <w:rPr>
-                <w:sz w:val="16"/>
-              </w:rPr>
-              <w:t>EMODnet Marine Vessel Density</w:t>
-            </w:r>
-          </w:p>
-        </w:tc>
-        <w:tc>
-          <w:tcPr>
-            <w:tcW w:type="dxa" w:w="3312"/>
-            <w:shd w:fill="FFFFFF"/>
-          </w:tcPr>
-          <w:p>
-            <w:r>
-              <w:rPr>
-                <w:sz w:val="16"/>
-              </w:rPr>
-              <w:t>https://emodnet.ec.europa.eu/en/human-activities</w:t>
-            </w:r>
-          </w:p>
-        </w:tc>
-        <w:tc>
-          <w:tcPr>
-            <w:tcW w:type="dxa" w:w="3312"/>
-            <w:shd w:fill="FFFFFF"/>
-          </w:tcPr>
-          <w:p>
-            <w:r>
-              <w:rPr>
-                <w:sz w:val="16"/>
-              </w:rPr>
-              <w:t>AIS coastal shipping density grids around Irish waters</w:t>
+              <w:t>Tuesday, 29 September 2026</w:t>
             </w:r>
           </w:p>
         </w:tc>
@@ -683,174 +273,161 @@
     </w:p>
     <w:p>
       <w:pPr>
-        <w:spacing w:before="220" w:after="80"/>
+        <w:spacing w:before="160" w:after="60"/>
       </w:pPr>
       <w:r>
         <w:rPr>
           <w:b/>
           <w:color w:val="102C57"/>
-          <w:sz w:val="22"/>
+          <w:sz w:val="21"/>
         </w:rPr>
-        <w:t>3. Evaluation &amp; Critical Reflection (So What?)</w:t>
+        <w:t>1. Summary of Activities Completed This Week</w:t>
       </w:r>
     </w:p>
     <w:p>
       <w:pPr>
         <w:pStyle w:val="ListBullet"/>
-        <w:spacing w:after="50"/>
+        <w:spacing w:after="40"/>
       </w:pPr>
       <w:r>
         <w:rPr>
           <w:b/>
-          <w:sz w:val="18"/>
+          <w:sz w:val="17"/>
         </w:rPr>
-        <w:t xml:space="preserve">Validation of Research Problem: </w:t>
+        <w:t xml:space="preserve">Project Pitch Preparation: </w:t>
       </w:r>
       <w:r>
         <w:rPr>
-          <w:sz w:val="18"/>
+          <w:sz w:val="17"/>
         </w:rPr>
-        <w:t>The Week 1 baseline simulation empirically validates the core research rationale: without predictive delay awareness, freight hauliers waste an average of 1.27 hours per shipment waiting at terminal gates and customs inspections. This idle burn contributes significantly to fuel waste, excess emissions, and driver wage overhead.</w:t>
+        <w:t>Prepared a 1-2 minute spoken pitch following the required format: Problem -&gt; Gap -&gt; Idea -&gt; Method -&gt; Contribution, ready for presentation on 1 October.</w:t>
       </w:r>
     </w:p>
     <w:p>
       <w:pPr>
         <w:pStyle w:val="ListBullet"/>
-        <w:spacing w:after="50"/>
+        <w:spacing w:after="40"/>
       </w:pPr>
       <w:r>
         <w:rPr>
           <w:b/>
-          <w:sz w:val="18"/>
+          <w:sz w:val="17"/>
         </w:rPr>
-        <w:t xml:space="preserve">Data Availability &amp; Quality: </w:t>
+        <w:t xml:space="preserve">Code Repository Setup: </w:t>
       </w:r>
       <w:r>
         <w:rPr>
-          <w:sz w:val="18"/>
+          <w:sz w:val="17"/>
         </w:rPr>
-        <w:t>Connecting to the live CSO PxStat API confirmed that high-quality, longitudinal quarterly maritime traffic records (2017 to 2026) are openly available for all main Irish commercial ports. This removes a major data acquisition risk for Component 1.</w:t>
+        <w:t>Initialized the project Git repository and created a clean Python package structure named irishlogix using pyproject.toml.</w:t>
       </w:r>
     </w:p>
     <w:p>
       <w:pPr>
         <w:pStyle w:val="ListBullet"/>
-        <w:spacing w:after="50"/>
+        <w:spacing w:after="40"/>
       </w:pPr>
       <w:r>
         <w:rPr>
           <w:b/>
-          <w:sz w:val="18"/>
+          <w:sz w:val="17"/>
         </w:rPr>
-        <w:t xml:space="preserve">Methodological Readiness: </w:t>
+        <w:t xml:space="preserve">Public Data Ingestion (cso_loader.py): </w:t>
       </w:r>
       <w:r>
         <w:rPr>
-          <w:sz w:val="18"/>
+          <w:sz w:val="17"/>
         </w:rPr>
-        <w:t>Having both the road network graph and the baseline FIFO simulator operational in Week 1 provides an immediate benchmark platform against which the machine learning predictions and Pareto route optimizer can be systematically evaluated in subsequent phases.</w:t>
+        <w:t>Connected directly to the Central Statistics Office (CSO) PxStat API and downloaded quarterly maritime datasets from 2017 to 2026: TBQ01 (444 vessel arrival records), TBQ04 (2,331 Ro-Ro freight trailer units), and TBQ05 (3,600 trade region records). Built clean activity matrix in data/processed/cso_port_activity_matrix.csv.</w:t>
       </w:r>
     </w:p>
     <w:p>
       <w:pPr>
-        <w:spacing w:before="220" w:after="80"/>
+        <w:pStyle w:val="ListBullet"/>
+        <w:spacing w:after="40"/>
+      </w:pPr>
+      <w:r>
+        <w:rPr>
+          <w:b/>
+          <w:sz w:val="17"/>
+        </w:rPr>
+        <w:t xml:space="preserve">Jupyter Notebook: </w:t>
+      </w:r>
+      <w:r>
+        <w:rPr>
+          <w:sz w:val="17"/>
+        </w:rPr>
+        <w:t>Created and executed notebooks/01_week1_data_ingestion_and_exploration.ipynb which downloads the data, plots port arrival trends, shows post-Brexit trade shifts, and runs the baseline route simulation.</w:t>
+      </w:r>
+    </w:p>
+    <w:p>
+      <w:pPr>
+        <w:pStyle w:val="ListBullet"/>
+        <w:spacing w:after="40"/>
+      </w:pPr>
+      <w:r>
+        <w:rPr>
+          <w:b/>
+          <w:sz w:val="17"/>
+        </w:rPr>
+        <w:t xml:space="preserve">Irish Road Corridor Network (corridor_network.py): </w:t>
+      </w:r>
+      <w:r>
+        <w:rPr>
+          <w:sz w:val="17"/>
+        </w:rPr>
+        <w:t>Built a road network graph in NetworkX with 11 nodes (Dublin, Cork, Rosslare, Athlone, Limerick, Galway, Waterford, Dundalk) and 15 road corridors with travel distances, speed limits, and tolls.</w:t>
+      </w:r>
+    </w:p>
+    <w:p>
+      <w:pPr>
+        <w:pStyle w:val="ListBullet"/>
+        <w:spacing w:after="40"/>
+      </w:pPr>
+      <w:r>
+        <w:rPr>
+          <w:b/>
+          <w:sz w:val="17"/>
+        </w:rPr>
+        <w:t xml:space="preserve">Baseline Dispatch Simulation (baseline_dispatcher.py): </w:t>
+      </w:r>
+      <w:r>
+        <w:rPr>
+          <w:sz w:val="17"/>
+        </w:rPr>
+        <w:t>Built an empirical baseline simulation representing how small Irish hauliers plan routes using simple spreadsheets without delay forecasting. Ran a test of 50 freight trips: total distance 8,636.5 km; active driving time 104.4 hours; idle waiting time 63.5 hours (average 1.27 hours wasted idling per trip at port gates and customs); total diesel used 2,879.3 Litres; carbon emissions 7,601.3 kg CO2e; total transport cost €14,791.21 (average €295.82 per trip).</w:t>
+      </w:r>
+    </w:p>
+    <w:p>
+      <w:pPr>
+        <w:pStyle w:val="ListBullet"/>
+        <w:spacing w:after="40"/>
+      </w:pPr>
+      <w:r>
+        <w:rPr>
+          <w:b/>
+          <w:sz w:val="17"/>
+        </w:rPr>
+        <w:t xml:space="preserve">Unit Testing: </w:t>
+      </w:r>
+      <w:r>
+        <w:rPr>
+          <w:sz w:val="17"/>
+        </w:rPr>
+        <w:t>Created 9 unit tests across data loader, network graph, and simulator. All 9 tests passed.</w:t>
+      </w:r>
+    </w:p>
+    <w:p>
+      <w:pPr>
+        <w:spacing w:before="160" w:after="60"/>
       </w:pPr>
       <w:r>
         <w:rPr>
           <w:b/>
           <w:color w:val="102C57"/>
-          <w:sz w:val="22"/>
+          <w:sz w:val="21"/>
         </w:rPr>
-        <w:t>4. Action Plan &amp; Next Steps (Now What?)</w:t>
-      </w:r>
-    </w:p>
-    <w:p>
-      <w:pPr>
-        <w:pStyle w:val="ListBullet"/>
-        <w:spacing w:after="50"/>
-      </w:pPr>
-      <w:r>
-        <w:rPr>
-          <w:b/>
-          <w:sz w:val="18"/>
-        </w:rPr>
-        <w:t xml:space="preserve">Oral Pitch Delivery (1 October): </w:t>
-      </w:r>
-      <w:r>
-        <w:rPr>
-          <w:sz w:val="18"/>
-        </w:rPr>
-        <w:t>Deliver the timed 1-2 minute project idea pitch to the academic panel and technical peers adhering to the 5-stage framework.</w:t>
-      </w:r>
-    </w:p>
-    <w:p>
-      <w:pPr>
-        <w:pStyle w:val="ListBullet"/>
-        <w:spacing w:after="50"/>
-      </w:pPr>
-      <w:r>
-        <w:rPr>
-          <w:b/>
-          <w:sz w:val="18"/>
-        </w:rPr>
-        <w:t xml:space="preserve">Supervisory Review with Dr. Thanos Staikopoulos: </w:t>
-      </w:r>
-      <w:r>
-        <w:rPr>
-          <w:sz w:val="18"/>
-        </w:rPr>
-        <w:t>Present the Week 1 technical accomplishments (CSO data pipeline, corridor graph, baseline simulation benchmark results, and Jupyter notebook) and align on refined SMART objectives.</w:t>
-      </w:r>
-    </w:p>
-    <w:p>
-      <w:pPr>
-        <w:pStyle w:val="ListBullet"/>
-        <w:spacing w:after="50"/>
-      </w:pPr>
-      <w:r>
-        <w:rPr>
-          <w:b/>
-          <w:sz w:val="18"/>
-        </w:rPr>
-        <w:t xml:space="preserve">EMODnet &amp; AIS Maritime Ingestion (Week 2): </w:t>
-      </w:r>
-      <w:r>
-        <w:rPr>
-          <w:sz w:val="18"/>
-        </w:rPr>
-        <w:t>Incorporate EMODnet vessel density metrics to augment CSO quarterly data with spatial maritime congestion signals.</w:t>
-      </w:r>
-    </w:p>
-    <w:p>
-      <w:pPr>
-        <w:pStyle w:val="ListBullet"/>
-        <w:spacing w:after="50"/>
-      </w:pPr>
-      <w:r>
-        <w:rPr>
-          <w:b/>
-          <w:sz w:val="18"/>
-        </w:rPr>
-        <w:t xml:space="preserve">Customs Generator Calibration (Week 3 / M1): </w:t>
-      </w:r>
-      <w:r>
-        <w:rPr>
-          <w:sz w:val="18"/>
-        </w:rPr>
-        <w:t>Calibrate the synthetic customs clearance delay generator using published CSO trade statistics and literature validation ranges.</w:t>
-      </w:r>
-    </w:p>
-    <w:p>
-      <w:pPr>
-        <w:spacing w:before="220" w:after="80"/>
-      </w:pPr>
-      <w:r>
-        <w:rPr>
-          <w:b/>
-          <w:color w:val="102C57"/>
-          <w:sz w:val="22"/>
-        </w:rPr>
-        <w:t>5. Supervisor Meeting Log &amp; Agreed Actions</w:t>
+        <w:t>2. Primary Public Dataset Sources &amp; URLs</w:t>
       </w:r>
     </w:p>
     <w:tbl>
@@ -860,40 +437,56 @@
         <w:tblLook w:firstColumn="1" w:firstRow="1" w:lastColumn="0" w:lastRow="0" w:noHBand="0" w:noVBand="1" w:val="04A0"/>
       </w:tblPr>
       <w:tblGrid>
-        <w:gridCol w:w="4968"/>
-        <w:gridCol w:w="4968"/>
+        <w:gridCol w:w="3408"/>
+        <w:gridCol w:w="3408"/>
+        <w:gridCol w:w="3408"/>
       </w:tblGrid>
       <w:tr>
         <w:tc>
           <w:tcPr>
-            <w:tcW w:type="dxa" w:w="3168"/>
-            <w:shd w:fill="F0F4F8"/>
+            <w:tcW w:type="dxa" w:w="3408"/>
+            <w:shd w:fill="102C57"/>
           </w:tcPr>
           <w:p>
             <w:r>
               <w:rPr>
                 <w:b/>
-                <w:sz w:val="17"/>
+                <w:color w:val="FFFFFF"/>
+                <w:sz w:val="16"/>
               </w:rPr>
-              <w:t>Agenda Items Discussed:</w:t>
+              <w:t>Dataset Name</w:t>
             </w:r>
           </w:p>
         </w:tc>
         <w:tc>
           <w:tcPr>
-            <w:tcW w:type="dxa" w:w="6768"/>
-            <w:shd w:fill="FFFFFF"/>
+            <w:tcW w:type="dxa" w:w="3408"/>
+            <w:shd w:fill="102C57"/>
           </w:tcPr>
           <w:p>
             <w:r>
               <w:rPr>
-                <w:sz w:val="17"/>
+                <w:b/>
+                <w:color w:val="FFFFFF"/>
+                <w:sz w:val="16"/>
               </w:rPr>
-              <w:t>1. Review of CA2 Proposal, Literature Reference Archive &amp; Ethics Declaration.</w:t>
-              <w:br/>
-              <w:t>2. Rehearsal and structure of the 1 October Project Pitch.</w:t>
-              <w:br/>
-              <w:t>3. Demonstration of Week 1 technical deliverables: Git repo, CSO data pipeline, Jupyter notebook, and baseline FIFO simulation benchmark.</w:t>
+              <w:t>Source and Direct URL</w:t>
+            </w:r>
+          </w:p>
+        </w:tc>
+        <w:tc>
+          <w:tcPr>
+            <w:tcW w:type="dxa" w:w="3408"/>
+            <w:shd w:fill="102C57"/>
+          </w:tcPr>
+          <w:p>
+            <w:r>
+              <w:rPr>
+                <w:b/>
+                <w:color w:val="FFFFFF"/>
+                <w:sz w:val="16"/>
+              </w:rPr>
+              <w:t>Role in Project</w:t>
             </w:r>
           </w:p>
         </w:tc>
@@ -901,34 +494,52 @@
       <w:tr>
         <w:tc>
           <w:tcPr>
-            <w:tcW w:type="dxa" w:w="3168"/>
-            <w:shd w:fill="F0F4F8"/>
+            <w:tcW w:type="dxa" w:w="3408"/>
+            <w:shd w:fill="FFFFFF"/>
           </w:tcPr>
           <w:p>
+            <w:pPr>
+              <w:spacing w:after="20"/>
+            </w:pPr>
             <w:r>
               <w:rPr>
-                <w:b/>
-                <w:sz w:val="17"/>
+                <w:sz w:val="15"/>
               </w:rPr>
-              <w:t>Supervisor Guidance &amp; Feedback:</w:t>
+              <w:t>CSO Table TBQ01</w:t>
             </w:r>
           </w:p>
         </w:tc>
         <w:tc>
           <w:tcPr>
-            <w:tcW w:type="dxa" w:w="6768"/>
+            <w:tcW w:type="dxa" w:w="3408"/>
             <w:shd w:fill="FFFFFF"/>
           </w:tcPr>
           <w:p>
+            <w:pPr>
+              <w:spacing w:after="20"/>
+            </w:pPr>
             <w:r>
               <w:rPr>
-                <w:sz w:val="17"/>
+                <w:sz w:val="15"/>
               </w:rPr>
-              <w:t>- Emphasize the empirical gap between unbuffered spreadsheet planning and predictive optimization.</w:t>
-              <w:br/>
-              <w:t>- Maintain clean modular separation across the 3 core components.</w:t>
-              <w:br/>
-              <w:t>- Ensure baseline simulation parameters are transparently grounded in Irish logistics costs.</w:t>
+              <w:t>https://data.cso.ie/table/TBQ01</w:t>
+            </w:r>
+          </w:p>
+        </w:tc>
+        <w:tc>
+          <w:tcPr>
+            <w:tcW w:type="dxa" w:w="3408"/>
+            <w:shd w:fill="FFFFFF"/>
+          </w:tcPr>
+          <w:p>
+            <w:pPr>
+              <w:spacing w:after="20"/>
+            </w:pPr>
+            <w:r>
+              <w:rPr>
+                <w:sz w:val="15"/>
+              </w:rPr>
+              <w:t>Ship arrivals for Dublin, Cork, and Rosslare ports</w:t>
             </w:r>
           </w:p>
         </w:tc>
@@ -936,34 +547,52 @@
       <w:tr>
         <w:tc>
           <w:tcPr>
-            <w:tcW w:type="dxa" w:w="3168"/>
-            <w:shd w:fill="F0F4F8"/>
+            <w:tcW w:type="dxa" w:w="3408"/>
+            <w:shd w:fill="F9FAFC"/>
           </w:tcPr>
           <w:p>
+            <w:pPr>
+              <w:spacing w:after="20"/>
+            </w:pPr>
             <w:r>
               <w:rPr>
-                <w:b/>
-                <w:sz w:val="17"/>
+                <w:sz w:val="15"/>
               </w:rPr>
-              <w:t>Agreed Action Items &amp; Deadlines:</w:t>
+              <w:t>CSO Table TBQ02</w:t>
             </w:r>
           </w:p>
         </w:tc>
         <w:tc>
           <w:tcPr>
-            <w:tcW w:type="dxa" w:w="6768"/>
-            <w:shd w:fill="FFFFFF"/>
+            <w:tcW w:type="dxa" w:w="3408"/>
+            <w:shd w:fill="F9FAFC"/>
           </w:tcPr>
           <w:p>
+            <w:pPr>
+              <w:spacing w:after="20"/>
+            </w:pPr>
             <w:r>
               <w:rPr>
-                <w:sz w:val="17"/>
+                <w:sz w:val="15"/>
               </w:rPr>
-              <w:t>1. Deliver 1-2 minute pitch on 1 October 2026.</w:t>
-              <w:br/>
-              <w:t>2. Submit weekly progress updates every Tuesday.</w:t>
-              <w:br/>
-              <w:t>3. Begin Phase 1 feature engineering on ingested CSO port traffic data.</w:t>
+              <w:t>https://data.cso.ie/table/TBQ02</w:t>
+            </w:r>
+          </w:p>
+        </w:tc>
+        <w:tc>
+          <w:tcPr>
+            <w:tcW w:type="dxa" w:w="3408"/>
+            <w:shd w:fill="F9FAFC"/>
+          </w:tcPr>
+          <w:p>
+            <w:pPr>
+              <w:spacing w:after="20"/>
+            </w:pPr>
+            <w:r>
+              <w:rPr>
+                <w:sz w:val="15"/>
+              </w:rPr>
+              <w:t>Cargo tonnage categories (Ro-Ro and Lo-Lo)</w:t>
             </w:r>
           </w:p>
         </w:tc>
@@ -971,30 +600,745 @@
       <w:tr>
         <w:tc>
           <w:tcPr>
-            <w:tcW w:type="dxa" w:w="3168"/>
-            <w:shd w:fill="F0F4F8"/>
+            <w:tcW w:type="dxa" w:w="3408"/>
+            <w:shd w:fill="FFFFFF"/>
+          </w:tcPr>
+          <w:p>
+            <w:pPr>
+              <w:spacing w:after="20"/>
+            </w:pPr>
+            <w:r>
+              <w:rPr>
+                <w:sz w:val="15"/>
+              </w:rPr>
+              <w:t>CSO Table TBQ04</w:t>
+            </w:r>
+          </w:p>
+        </w:tc>
+        <w:tc>
+          <w:tcPr>
+            <w:tcW w:type="dxa" w:w="3408"/>
+            <w:shd w:fill="FFFFFF"/>
+          </w:tcPr>
+          <w:p>
+            <w:pPr>
+              <w:spacing w:after="20"/>
+            </w:pPr>
+            <w:r>
+              <w:rPr>
+                <w:sz w:val="15"/>
+              </w:rPr>
+              <w:t>https://data.cso.ie/table/TBQ04</w:t>
+            </w:r>
+          </w:p>
+        </w:tc>
+        <w:tc>
+          <w:tcPr>
+            <w:tcW w:type="dxa" w:w="3408"/>
+            <w:shd w:fill="FFFFFF"/>
+          </w:tcPr>
+          <w:p>
+            <w:pPr>
+              <w:spacing w:after="20"/>
+            </w:pPr>
+            <w:r>
+              <w:rPr>
+                <w:sz w:val="15"/>
+              </w:rPr>
+              <w:t>Freight trailer counts across Irish ports</w:t>
+            </w:r>
+          </w:p>
+        </w:tc>
+      </w:tr>
+      <w:tr>
+        <w:tc>
+          <w:tcPr>
+            <w:tcW w:type="dxa" w:w="3408"/>
+            <w:shd w:fill="F9FAFC"/>
+          </w:tcPr>
+          <w:p>
+            <w:pPr>
+              <w:spacing w:after="20"/>
+            </w:pPr>
+            <w:r>
+              <w:rPr>
+                <w:sz w:val="15"/>
+              </w:rPr>
+              <w:t>CSO Table TBQ05</w:t>
+            </w:r>
+          </w:p>
+        </w:tc>
+        <w:tc>
+          <w:tcPr>
+            <w:tcW w:type="dxa" w:w="3408"/>
+            <w:shd w:fill="F9FAFC"/>
+          </w:tcPr>
+          <w:p>
+            <w:pPr>
+              <w:spacing w:after="20"/>
+            </w:pPr>
+            <w:r>
+              <w:rPr>
+                <w:sz w:val="15"/>
+              </w:rPr>
+              <w:t>https://data.cso.ie/table/TBQ05</w:t>
+            </w:r>
+          </w:p>
+        </w:tc>
+        <w:tc>
+          <w:tcPr>
+            <w:tcW w:type="dxa" w:w="3408"/>
+            <w:shd w:fill="F9FAFC"/>
+          </w:tcPr>
+          <w:p>
+            <w:pPr>
+              <w:spacing w:after="20"/>
+            </w:pPr>
+            <w:r>
+              <w:rPr>
+                <w:sz w:val="15"/>
+              </w:rPr>
+              <w:t>Post-Brexit trade volumes: Great Britain vs. EU</w:t>
+            </w:r>
+          </w:p>
+        </w:tc>
+      </w:tr>
+      <w:tr>
+        <w:tc>
+          <w:tcPr>
+            <w:tcW w:type="dxa" w:w="3408"/>
+            <w:shd w:fill="FFFFFF"/>
+          </w:tcPr>
+          <w:p>
+            <w:pPr>
+              <w:spacing w:after="20"/>
+            </w:pPr>
+            <w:r>
+              <w:rPr>
+                <w:sz w:val="15"/>
+              </w:rPr>
+              <w:t>EMODnet Vessel Density</w:t>
+            </w:r>
+          </w:p>
+        </w:tc>
+        <w:tc>
+          <w:tcPr>
+            <w:tcW w:type="dxa" w:w="3408"/>
+            <w:shd w:fill="FFFFFF"/>
+          </w:tcPr>
+          <w:p>
+            <w:pPr>
+              <w:spacing w:after="20"/>
+            </w:pPr>
+            <w:r>
+              <w:rPr>
+                <w:sz w:val="15"/>
+              </w:rPr>
+              <w:t>https://emodnet.ec.europa.eu/en/human-activities</w:t>
+            </w:r>
+          </w:p>
+        </w:tc>
+        <w:tc>
+          <w:tcPr>
+            <w:tcW w:type="dxa" w:w="3408"/>
+            <w:shd w:fill="FFFFFF"/>
+          </w:tcPr>
+          <w:p>
+            <w:pPr>
+              <w:spacing w:after="20"/>
+            </w:pPr>
+            <w:r>
+              <w:rPr>
+                <w:sz w:val="15"/>
+              </w:rPr>
+              <w:t>AIS marine traffic density maps</w:t>
+            </w:r>
+          </w:p>
+        </w:tc>
+      </w:tr>
+      <w:tr>
+        <w:tc>
+          <w:tcPr>
+            <w:tcW w:type="dxa" w:w="3408"/>
+            <w:shd w:fill="F9FAFC"/>
+          </w:tcPr>
+          <w:p>
+            <w:pPr>
+              <w:spacing w:after="20"/>
+            </w:pPr>
+            <w:r>
+              <w:rPr>
+                <w:sz w:val="15"/>
+              </w:rPr>
+              <w:t>OpenStreetMap Ireland</w:t>
+            </w:r>
+          </w:p>
+        </w:tc>
+        <w:tc>
+          <w:tcPr>
+            <w:tcW w:type="dxa" w:w="3408"/>
+            <w:shd w:fill="F9FAFC"/>
+          </w:tcPr>
+          <w:p>
+            <w:pPr>
+              <w:spacing w:after="20"/>
+            </w:pPr>
+            <w:r>
+              <w:rPr>
+                <w:sz w:val="15"/>
+              </w:rPr>
+              <w:t>https://download.geofabrik.de/europe/ireland-and-northern-ireland.html</w:t>
+            </w:r>
+          </w:p>
+        </w:tc>
+        <w:tc>
+          <w:tcPr>
+            <w:tcW w:type="dxa" w:w="3408"/>
+            <w:shd w:fill="F9FAFC"/>
+          </w:tcPr>
+          <w:p>
+            <w:pPr>
+              <w:spacing w:after="20"/>
+            </w:pPr>
+            <w:r>
+              <w:rPr>
+                <w:sz w:val="15"/>
+              </w:rPr>
+              <w:t>Road distances and speeds for Irish corridors</w:t>
+            </w:r>
+          </w:p>
+        </w:tc>
+      </w:tr>
+    </w:tbl>
+    <w:p>
+      <w:pPr>
+        <w:spacing w:after="80"/>
+      </w:pPr>
+    </w:p>
+    <w:p>
+      <w:pPr>
+        <w:spacing w:before="160" w:after="60"/>
+      </w:pPr>
+      <w:r>
+        <w:rPr>
+          <w:b/>
+          <w:color w:val="102C57"/>
+          <w:sz w:val="21"/>
+        </w:rPr>
+        <w:t>3. Reflection and Key Findings</w:t>
+      </w:r>
+    </w:p>
+    <w:p>
+      <w:pPr>
+        <w:pStyle w:val="ListBullet"/>
+        <w:spacing w:after="40"/>
+      </w:pPr>
+      <w:r>
+        <w:rPr>
+          <w:b/>
+          <w:sz w:val="17"/>
+        </w:rPr>
+        <w:t xml:space="preserve">The Problem is Real: </w:t>
+      </w:r>
+      <w:r>
+        <w:rPr>
+          <w:sz w:val="17"/>
+        </w:rPr>
+        <w:t>The baseline simulation shows that without delay prediction, trucks waste an average of 1.27 hours per shipment waiting at gates and customs. This proves that coupling delay prediction with route optimization can save real fuel, money, and emissions.</w:t>
+      </w:r>
+    </w:p>
+    <w:p>
+      <w:pPr>
+        <w:pStyle w:val="ListBullet"/>
+        <w:spacing w:after="40"/>
+      </w:pPr>
+      <w:r>
+        <w:rPr>
+          <w:b/>
+          <w:sz w:val="17"/>
+        </w:rPr>
+        <w:t xml:space="preserve">Data is Verified: </w:t>
+      </w:r>
+      <w:r>
+        <w:rPr>
+          <w:sz w:val="17"/>
+        </w:rPr>
+        <w:t>The CSO PxStat API provides clean, continuous historical data from 2017 to 2026, ensuring we have solid numbers to train the machine learning models.</w:t>
+      </w:r>
+    </w:p>
+    <w:p>
+      <w:pPr>
+        <w:pStyle w:val="ListBullet"/>
+        <w:spacing w:after="40"/>
+      </w:pPr>
+      <w:r>
+        <w:rPr>
+          <w:b/>
+          <w:sz w:val="17"/>
+        </w:rPr>
+        <w:t xml:space="preserve">Benchmark is Set: </w:t>
+      </w:r>
+      <w:r>
+        <w:rPr>
+          <w:sz w:val="17"/>
+        </w:rPr>
+        <w:t>Having this baseline simulator running in Week 1 gives us a clear benchmark to compare our future machine learning models against.</w:t>
+      </w:r>
+    </w:p>
+    <w:p>
+      <w:pPr>
+        <w:spacing w:before="160" w:after="60"/>
+      </w:pPr>
+      <w:r>
+        <w:rPr>
+          <w:b/>
+          <w:color w:val="102C57"/>
+          <w:sz w:val="21"/>
+        </w:rPr>
+        <w:t>4. Planned Activities for Next Week</w:t>
+      </w:r>
+    </w:p>
+    <w:p>
+      <w:pPr>
+        <w:spacing w:after="30"/>
+      </w:pPr>
+      <w:r>
+        <w:rPr>
+          <w:b/>
+          <w:sz w:val="17"/>
+        </w:rPr>
+        <w:t xml:space="preserve">1. </w:t>
+      </w:r>
+      <w:r>
+        <w:rPr>
+          <w:sz w:val="17"/>
+        </w:rPr>
+        <w:t>Deliver the 1-2 minute oral pitch on 1 October.</w:t>
+      </w:r>
+    </w:p>
+    <w:p>
+      <w:pPr>
+        <w:spacing w:after="30"/>
+      </w:pPr>
+      <w:r>
+        <w:rPr>
+          <w:b/>
+          <w:sz w:val="17"/>
+        </w:rPr>
+        <w:t xml:space="preserve">2. </w:t>
+      </w:r>
+      <w:r>
+        <w:rPr>
+          <w:sz w:val="17"/>
+        </w:rPr>
+        <w:t>Review the Week 1 baseline results and refined project plan with Dr. Thanos Staikopoulos during our meeting.</w:t>
+      </w:r>
+    </w:p>
+    <w:p>
+      <w:pPr>
+        <w:spacing w:after="30"/>
+      </w:pPr>
+      <w:r>
+        <w:rPr>
+          <w:b/>
+          <w:sz w:val="17"/>
+        </w:rPr>
+        <w:t xml:space="preserve">3. </w:t>
+      </w:r>
+      <w:r>
+        <w:rPr>
+          <w:sz w:val="17"/>
+        </w:rPr>
+        <w:t>Ingest EMODnet AIS vessel density data for Irish waters.</w:t>
+      </w:r>
+    </w:p>
+    <w:p>
+      <w:pPr>
+        <w:spacing w:after="30"/>
+      </w:pPr>
+      <w:r>
+        <w:rPr>
+          <w:b/>
+          <w:sz w:val="17"/>
+        </w:rPr>
+        <w:t xml:space="preserve">4. </w:t>
+      </w:r>
+      <w:r>
+        <w:rPr>
+          <w:sz w:val="17"/>
+        </w:rPr>
+        <w:t>Start feature engineering for the Component 1 Port Congestion Classifier.</w:t>
+      </w:r>
+    </w:p>
+    <w:p>
+      <w:pPr>
+        <w:spacing w:before="160" w:after="60"/>
+      </w:pPr>
+      <w:r>
+        <w:rPr>
+          <w:b/>
+          <w:color w:val="102C57"/>
+          <w:sz w:val="21"/>
+        </w:rPr>
+        <w:t>5. Milestone Tracking</w:t>
+      </w:r>
+    </w:p>
+    <w:tbl>
+      <w:tblPr>
+        <w:tblW w:type="auto" w:w="0"/>
+        <w:jc w:val="center"/>
+        <w:tblLook w:firstColumn="1" w:firstRow="1" w:lastColumn="0" w:lastRow="0" w:noHBand="0" w:noVBand="1" w:val="04A0"/>
+      </w:tblPr>
+      <w:tblGrid>
+        <w:gridCol w:w="2556"/>
+        <w:gridCol w:w="2556"/>
+        <w:gridCol w:w="2556"/>
+        <w:gridCol w:w="2556"/>
+      </w:tblGrid>
+      <w:tr>
+        <w:tc>
+          <w:tcPr>
+            <w:tcW w:type="dxa" w:w="2556"/>
+            <w:shd w:fill="102C57"/>
           </w:tcPr>
           <w:p>
             <w:r>
               <w:rPr>
                 <w:b/>
-                <w:sz w:val="17"/>
+                <w:color w:val="FFFFFF"/>
+                <w:sz w:val="16"/>
               </w:rPr>
-              <w:t>Target Date for Next Meeting:</w:t>
+              <w:t>Milestone</w:t>
             </w:r>
           </w:p>
         </w:tc>
         <w:tc>
           <w:tcPr>
-            <w:tcW w:type="dxa" w:w="6768"/>
-            <w:shd w:fill="FFFFFF"/>
+            <w:tcW w:type="dxa" w:w="2556"/>
+            <w:shd w:fill="102C57"/>
           </w:tcPr>
           <w:p>
             <w:r>
               <w:rPr>
-                <w:sz w:val="17"/>
+                <w:b/>
+                <w:color w:val="FFFFFF"/>
+                <w:sz w:val="16"/>
               </w:rPr>
-              <w:t>Week 2 Scheduled Supervision Review (Tuesday, 6 October 2026)</w:t>
+              <w:t>Target</w:t>
+            </w:r>
+          </w:p>
+        </w:tc>
+        <w:tc>
+          <w:tcPr>
+            <w:tcW w:type="dxa" w:w="2556"/>
+            <w:shd w:fill="102C57"/>
+          </w:tcPr>
+          <w:p>
+            <w:r>
+              <w:rPr>
+                <w:b/>
+                <w:color w:val="FFFFFF"/>
+                <w:sz w:val="16"/>
+              </w:rPr>
+              <w:t>Status</w:t>
+            </w:r>
+          </w:p>
+        </w:tc>
+        <w:tc>
+          <w:tcPr>
+            <w:tcW w:type="dxa" w:w="2556"/>
+            <w:shd w:fill="102C57"/>
+          </w:tcPr>
+          <w:p>
+            <w:r>
+              <w:rPr>
+                <w:b/>
+                <w:color w:val="FFFFFF"/>
+                <w:sz w:val="16"/>
+              </w:rPr>
+              <w:t>Summary</w:t>
+            </w:r>
+          </w:p>
+        </w:tc>
+      </w:tr>
+      <w:tr>
+        <w:tc>
+          <w:tcPr>
+            <w:tcW w:type="dxa" w:w="2556"/>
+            <w:shd w:fill="FFFFFF"/>
+          </w:tcPr>
+          <w:p>
+            <w:pPr>
+              <w:spacing w:after="20"/>
+            </w:pPr>
+            <w:r>
+              <w:rPr>
+                <w:sz w:val="15"/>
+              </w:rPr>
+              <w:t>M1</w:t>
+            </w:r>
+          </w:p>
+        </w:tc>
+        <w:tc>
+          <w:tcPr>
+            <w:tcW w:type="dxa" w:w="2556"/>
+            <w:shd w:fill="FFFFFF"/>
+          </w:tcPr>
+          <w:p>
+            <w:pPr>
+              <w:spacing w:after="20"/>
+            </w:pPr>
+            <w:r>
+              <w:rPr>
+                <w:sz w:val="15"/>
+              </w:rPr>
+              <w:t>Week 3</w:t>
+            </w:r>
+          </w:p>
+        </w:tc>
+        <w:tc>
+          <w:tcPr>
+            <w:tcW w:type="dxa" w:w="2556"/>
+            <w:shd w:fill="FFFFFF"/>
+          </w:tcPr>
+          <w:p>
+            <w:pPr>
+              <w:spacing w:after="20"/>
+            </w:pPr>
+            <w:r>
+              <w:rPr>
+                <w:b/>
+                <w:color w:val="008000"/>
+                <w:sz w:val="15"/>
+              </w:rPr>
+              <w:t>Ahead of Schedule</w:t>
+            </w:r>
+          </w:p>
+        </w:tc>
+        <w:tc>
+          <w:tcPr>
+            <w:tcW w:type="dxa" w:w="2556"/>
+            <w:shd w:fill="FFFFFF"/>
+          </w:tcPr>
+          <w:p>
+            <w:pPr>
+              <w:spacing w:after="20"/>
+            </w:pPr>
+            <w:r>
+              <w:rPr>
+                <w:sz w:val="15"/>
+              </w:rPr>
+              <w:t>Baseline simulator working, CSO data ingested, road network built</w:t>
+            </w:r>
+          </w:p>
+        </w:tc>
+      </w:tr>
+      <w:tr>
+        <w:tc>
+          <w:tcPr>
+            <w:tcW w:type="dxa" w:w="2556"/>
+            <w:shd w:fill="F9FAFC"/>
+          </w:tcPr>
+          <w:p>
+            <w:pPr>
+              <w:spacing w:after="20"/>
+            </w:pPr>
+            <w:r>
+              <w:rPr>
+                <w:sz w:val="15"/>
+              </w:rPr>
+              <w:t>M2</w:t>
+            </w:r>
+          </w:p>
+        </w:tc>
+        <w:tc>
+          <w:tcPr>
+            <w:tcW w:type="dxa" w:w="2556"/>
+            <w:shd w:fill="F9FAFC"/>
+          </w:tcPr>
+          <w:p>
+            <w:pPr>
+              <w:spacing w:after="20"/>
+            </w:pPr>
+            <w:r>
+              <w:rPr>
+                <w:sz w:val="15"/>
+              </w:rPr>
+              <w:t>Week 9</w:t>
+            </w:r>
+          </w:p>
+        </w:tc>
+        <w:tc>
+          <w:tcPr>
+            <w:tcW w:type="dxa" w:w="2556"/>
+            <w:shd w:fill="F9FAFC"/>
+          </w:tcPr>
+          <w:p>
+            <w:pPr>
+              <w:spacing w:after="20"/>
+            </w:pPr>
+            <w:r>
+              <w:rPr>
+                <w:sz w:val="15"/>
+              </w:rPr>
+              <w:t>Planned</w:t>
+            </w:r>
+          </w:p>
+        </w:tc>
+        <w:tc>
+          <w:tcPr>
+            <w:tcW w:type="dxa" w:w="2556"/>
+            <w:shd w:fill="F9FAFC"/>
+          </w:tcPr>
+          <w:p>
+            <w:pPr>
+              <w:spacing w:after="20"/>
+            </w:pPr>
+            <w:r>
+              <w:rPr>
+                <w:sz w:val="15"/>
+              </w:rPr>
+              <w:t>Train XGBoost delay models and connect to Pareto optimizer</w:t>
+            </w:r>
+          </w:p>
+        </w:tc>
+      </w:tr>
+      <w:tr>
+        <w:tc>
+          <w:tcPr>
+            <w:tcW w:type="dxa" w:w="2556"/>
+            <w:shd w:fill="FFFFFF"/>
+          </w:tcPr>
+          <w:p>
+            <w:pPr>
+              <w:spacing w:after="20"/>
+            </w:pPr>
+            <w:r>
+              <w:rPr>
+                <w:sz w:val="15"/>
+              </w:rPr>
+              <w:t>M3</w:t>
+            </w:r>
+          </w:p>
+        </w:tc>
+        <w:tc>
+          <w:tcPr>
+            <w:tcW w:type="dxa" w:w="2556"/>
+            <w:shd w:fill="FFFFFF"/>
+          </w:tcPr>
+          <w:p>
+            <w:pPr>
+              <w:spacing w:after="20"/>
+            </w:pPr>
+            <w:r>
+              <w:rPr>
+                <w:sz w:val="15"/>
+              </w:rPr>
+              <w:t>Week 13</w:t>
+            </w:r>
+          </w:p>
+        </w:tc>
+        <w:tc>
+          <w:tcPr>
+            <w:tcW w:type="dxa" w:w="2556"/>
+            <w:shd w:fill="FFFFFF"/>
+          </w:tcPr>
+          <w:p>
+            <w:pPr>
+              <w:spacing w:after="20"/>
+            </w:pPr>
+            <w:r>
+              <w:rPr>
+                <w:sz w:val="15"/>
+              </w:rPr>
+              <w:t>Planned</w:t>
+            </w:r>
+          </w:p>
+        </w:tc>
+        <w:tc>
+          <w:tcPr>
+            <w:tcW w:type="dxa" w:w="2556"/>
+            <w:shd w:fill="FFFFFF"/>
+          </w:tcPr>
+          <w:p>
+            <w:pPr>
+              <w:spacing w:after="20"/>
+            </w:pPr>
+            <w:r>
+              <w:rPr>
+                <w:sz w:val="15"/>
+              </w:rPr>
+              <w:t>Complete comparison against baseline and build Streamlit dashboard</w:t>
+            </w:r>
+          </w:p>
+        </w:tc>
+      </w:tr>
+      <w:tr>
+        <w:tc>
+          <w:tcPr>
+            <w:tcW w:type="dxa" w:w="2556"/>
+            <w:shd w:fill="F9FAFC"/>
+          </w:tcPr>
+          <w:p>
+            <w:pPr>
+              <w:spacing w:after="20"/>
+            </w:pPr>
+            <w:r>
+              <w:rPr>
+                <w:sz w:val="15"/>
+              </w:rPr>
+              <w:t>M4</w:t>
+            </w:r>
+          </w:p>
+        </w:tc>
+        <w:tc>
+          <w:tcPr>
+            <w:tcW w:type="dxa" w:w="2556"/>
+            <w:shd w:fill="F9FAFC"/>
+          </w:tcPr>
+          <w:p>
+            <w:pPr>
+              <w:spacing w:after="20"/>
+            </w:pPr>
+            <w:r>
+              <w:rPr>
+                <w:sz w:val="15"/>
+              </w:rPr>
+              <w:t>Week 15</w:t>
+            </w:r>
+          </w:p>
+        </w:tc>
+        <w:tc>
+          <w:tcPr>
+            <w:tcW w:type="dxa" w:w="2556"/>
+            <w:shd w:fill="F9FAFC"/>
+          </w:tcPr>
+          <w:p>
+            <w:pPr>
+              <w:spacing w:after="20"/>
+            </w:pPr>
+            <w:r>
+              <w:rPr>
+                <w:sz w:val="15"/>
+              </w:rPr>
+              <w:t>Planned</w:t>
+            </w:r>
+          </w:p>
+        </w:tc>
+        <w:tc>
+          <w:tcPr>
+            <w:tcW w:type="dxa" w:w="2556"/>
+            <w:shd w:fill="F9FAFC"/>
+          </w:tcPr>
+          <w:p>
+            <w:pPr>
+              <w:spacing w:after="20"/>
+            </w:pPr>
+            <w:r>
+              <w:rPr>
+                <w:sz w:val="15"/>
+              </w:rPr>
+              <w:t>Final dissertation, code repository, and viva presentation</w:t>
             </w:r>
           </w:p>
         </w:tc>
@@ -1007,352 +1351,21 @@
     </w:p>
     <w:p>
       <w:pPr>
-        <w:spacing w:before="220" w:after="80"/>
+        <w:spacing w:before="160" w:after="60"/>
       </w:pPr>
       <w:r>
         <w:rPr>
           <w:b/>
           <w:color w:val="102C57"/>
-          <w:sz w:val="22"/>
+          <w:sz w:val="21"/>
         </w:rPr>
-        <w:t>6. Project Milestone &amp; Gantt Tracking</w:t>
-      </w:r>
-    </w:p>
-    <w:tbl>
-      <w:tblPr>
-        <w:tblW w:type="auto" w:w="0"/>
-        <w:jc w:val="center"/>
-        <w:tblLook w:firstColumn="1" w:firstRow="1" w:lastColumn="0" w:lastRow="0" w:noHBand="0" w:noVBand="1" w:val="04A0"/>
-      </w:tblPr>
-      <w:tblGrid>
-        <w:gridCol w:w="2484"/>
-        <w:gridCol w:w="2484"/>
-        <w:gridCol w:w="2484"/>
-        <w:gridCol w:w="2484"/>
-      </w:tblGrid>
-      <w:tr>
-        <w:tc>
-          <w:tcPr>
-            <w:tcW w:type="dxa" w:w="2484"/>
-            <w:shd w:fill="102C57"/>
-          </w:tcPr>
-          <w:p>
-            <w:r>
-              <w:rPr>
-                <w:b/>
-                <w:color w:val="FFFFFF"/>
-                <w:sz w:val="17"/>
-              </w:rPr>
-              <w:t>Milestone</w:t>
-            </w:r>
-          </w:p>
-        </w:tc>
-        <w:tc>
-          <w:tcPr>
-            <w:tcW w:type="dxa" w:w="2484"/>
-            <w:shd w:fill="102C57"/>
-          </w:tcPr>
-          <w:p>
-            <w:r>
-              <w:rPr>
-                <w:b/>
-                <w:color w:val="FFFFFF"/>
-                <w:sz w:val="17"/>
-              </w:rPr>
-              <w:t>Target Week</w:t>
-            </w:r>
-          </w:p>
-        </w:tc>
-        <w:tc>
-          <w:tcPr>
-            <w:tcW w:type="dxa" w:w="2484"/>
-            <w:shd w:fill="102C57"/>
-          </w:tcPr>
-          <w:p>
-            <w:r>
-              <w:rPr>
-                <w:b/>
-                <w:color w:val="FFFFFF"/>
-                <w:sz w:val="17"/>
-              </w:rPr>
-              <w:t>Current Status</w:t>
-            </w:r>
-          </w:p>
-        </w:tc>
-        <w:tc>
-          <w:tcPr>
-            <w:tcW w:type="dxa" w:w="2484"/>
-            <w:shd w:fill="102C57"/>
-          </w:tcPr>
-          <w:p>
-            <w:r>
-              <w:rPr>
-                <w:b/>
-                <w:color w:val="FFFFFF"/>
-                <w:sz w:val="17"/>
-              </w:rPr>
-              <w:t>Deliverable Summary</w:t>
-            </w:r>
-          </w:p>
-        </w:tc>
-      </w:tr>
-      <w:tr>
-        <w:tc>
-          <w:tcPr>
-            <w:tcW w:type="dxa" w:w="2484"/>
-            <w:shd w:fill="FFFFFF"/>
-          </w:tcPr>
-          <w:p>
-            <w:r>
-              <w:rPr>
-                <w:sz w:val="16"/>
-              </w:rPr>
-              <w:t>Milestone 1 (M1)</w:t>
-            </w:r>
-          </w:p>
-        </w:tc>
-        <w:tc>
-          <w:tcPr>
-            <w:tcW w:type="dxa" w:w="2484"/>
-            <w:shd w:fill="FFFFFF"/>
-          </w:tcPr>
-          <w:p>
-            <w:r>
-              <w:rPr>
-                <w:sz w:val="16"/>
-              </w:rPr>
-              <w:t>Week 3</w:t>
-            </w:r>
-          </w:p>
-        </w:tc>
-        <w:tc>
-          <w:tcPr>
-            <w:tcW w:type="dxa" w:w="2484"/>
-            <w:shd w:fill="FFFFFF"/>
-          </w:tcPr>
-          <w:p>
-            <w:r>
-              <w:rPr>
-                <w:b/>
-                <w:color w:val="008000"/>
-                <w:sz w:val="16"/>
-              </w:rPr>
-              <w:t>ADVANCED / ON SCHEDULE</w:t>
-            </w:r>
-          </w:p>
-        </w:tc>
-        <w:tc>
-          <w:tcPr>
-            <w:tcW w:type="dxa" w:w="2484"/>
-            <w:shd w:fill="FFFFFF"/>
-          </w:tcPr>
-          <w:p>
-            <w:r>
-              <w:rPr>
-                <w:sz w:val="16"/>
-              </w:rPr>
-              <w:t>Baseline FIFO model operational; CSO maritime data ingested; corridor graph built</w:t>
-            </w:r>
-          </w:p>
-        </w:tc>
-      </w:tr>
-      <w:tr>
-        <w:tc>
-          <w:tcPr>
-            <w:tcW w:type="dxa" w:w="2484"/>
-            <w:shd w:fill="F9FAFC"/>
-          </w:tcPr>
-          <w:p>
-            <w:r>
-              <w:rPr>
-                <w:sz w:val="16"/>
-              </w:rPr>
-              <w:t>Milestone 2 (M2)</w:t>
-            </w:r>
-          </w:p>
-        </w:tc>
-        <w:tc>
-          <w:tcPr>
-            <w:tcW w:type="dxa" w:w="2484"/>
-            <w:shd w:fill="F9FAFC"/>
-          </w:tcPr>
-          <w:p>
-            <w:r>
-              <w:rPr>
-                <w:sz w:val="16"/>
-              </w:rPr>
-              <w:t>Week 9</w:t>
-            </w:r>
-          </w:p>
-        </w:tc>
-        <w:tc>
-          <w:tcPr>
-            <w:tcW w:type="dxa" w:w="2484"/>
-            <w:shd w:fill="F9FAFC"/>
-          </w:tcPr>
-          <w:p>
-            <w:r>
-              <w:rPr>
-                <w:sz w:val="16"/>
-              </w:rPr>
-              <w:t>PLANNED</w:t>
-            </w:r>
-          </w:p>
-        </w:tc>
-        <w:tc>
-          <w:tcPr>
-            <w:tcW w:type="dxa" w:w="2484"/>
-            <w:shd w:fill="F9FAFC"/>
-          </w:tcPr>
-          <w:p>
-            <w:r>
-              <w:rPr>
-                <w:sz w:val="16"/>
-              </w:rPr>
-              <w:t>XGBoost models (C1, C2) coupled with Pareto Optimizer (C3)</w:t>
-            </w:r>
-          </w:p>
-        </w:tc>
-      </w:tr>
-      <w:tr>
-        <w:tc>
-          <w:tcPr>
-            <w:tcW w:type="dxa" w:w="2484"/>
-            <w:shd w:fill="FFFFFF"/>
-          </w:tcPr>
-          <w:p>
-            <w:r>
-              <w:rPr>
-                <w:sz w:val="16"/>
-              </w:rPr>
-              <w:t>Milestone 3 (M3)</w:t>
-            </w:r>
-          </w:p>
-        </w:tc>
-        <w:tc>
-          <w:tcPr>
-            <w:tcW w:type="dxa" w:w="2484"/>
-            <w:shd w:fill="FFFFFF"/>
-          </w:tcPr>
-          <w:p>
-            <w:r>
-              <w:rPr>
-                <w:sz w:val="16"/>
-              </w:rPr>
-              <w:t>Week 13</w:t>
-            </w:r>
-          </w:p>
-        </w:tc>
-        <w:tc>
-          <w:tcPr>
-            <w:tcW w:type="dxa" w:w="2484"/>
-            <w:shd w:fill="FFFFFF"/>
-          </w:tcPr>
-          <w:p>
-            <w:r>
-              <w:rPr>
-                <w:sz w:val="16"/>
-              </w:rPr>
-              <w:t>PLANNED</w:t>
-            </w:r>
-          </w:p>
-        </w:tc>
-        <w:tc>
-          <w:tcPr>
-            <w:tcW w:type="dxa" w:w="2484"/>
-            <w:shd w:fill="FFFFFF"/>
-          </w:tcPr>
-          <w:p>
-            <w:r>
-              <w:rPr>
-                <w:sz w:val="16"/>
-              </w:rPr>
-              <w:t>Dual-system comparative evaluation &amp; Streamlit UI dashboard</w:t>
-            </w:r>
-          </w:p>
-        </w:tc>
-      </w:tr>
-      <w:tr>
-        <w:tc>
-          <w:tcPr>
-            <w:tcW w:type="dxa" w:w="2484"/>
-            <w:shd w:fill="F9FAFC"/>
-          </w:tcPr>
-          <w:p>
-            <w:r>
-              <w:rPr>
-                <w:sz w:val="16"/>
-              </w:rPr>
-              <w:t>Milestone 4 (M4)</w:t>
-            </w:r>
-          </w:p>
-        </w:tc>
-        <w:tc>
-          <w:tcPr>
-            <w:tcW w:type="dxa" w:w="2484"/>
-            <w:shd w:fill="F9FAFC"/>
-          </w:tcPr>
-          <w:p>
-            <w:r>
-              <w:rPr>
-                <w:sz w:val="16"/>
-              </w:rPr>
-              <w:t>Week 15</w:t>
-            </w:r>
-          </w:p>
-        </w:tc>
-        <w:tc>
-          <w:tcPr>
-            <w:tcW w:type="dxa" w:w="2484"/>
-            <w:shd w:fill="F9FAFC"/>
-          </w:tcPr>
-          <w:p>
-            <w:r>
-              <w:rPr>
-                <w:sz w:val="16"/>
-              </w:rPr>
-              <w:t>PLANNED</w:t>
-            </w:r>
-          </w:p>
-        </w:tc>
-        <w:tc>
-          <w:tcPr>
-            <w:tcW w:type="dxa" w:w="2484"/>
-            <w:shd w:fill="F9FAFC"/>
-          </w:tcPr>
-          <w:p>
-            <w:r>
-              <w:rPr>
-                <w:sz w:val="16"/>
-              </w:rPr>
-              <w:t>Final MSc Dissertation, code repository, and Viva Voce</w:t>
-            </w:r>
-          </w:p>
-        </w:tc>
-      </w:tr>
-    </w:tbl>
-    <w:p>
-      <w:pPr>
-        <w:spacing w:after="160"/>
-      </w:pPr>
-    </w:p>
-    <w:p>
-      <w:pPr>
-        <w:spacing w:before="220" w:after="80"/>
-      </w:pPr>
-      <w:r>
-        <w:rPr>
-          <w:b/>
-          <w:color w:val="102C57"/>
-          <w:sz w:val="22"/>
-        </w:rPr>
-        <w:t>7. Formal Declaration &amp; Sign-Off</w:t>
+        <w:t>6. Sign-Off</w:t>
       </w:r>
     </w:p>
     <w:p>
       <w:r>
         <w:rPr>
-          <w:sz w:val="18"/>
+          <w:sz w:val="17"/>
         </w:rPr>
         <w:t>Student Signature: Rohitkumar Amritlal Jaiswal                      Date: 29 September 2026</w:t>
         <w:br/>
@@ -1362,7 +1375,7 @@
     </w:p>
     <w:sectPr>
       <w:pgSz w:w="12240" w:h="15840"/>
-      <w:pgMar w:top="1080" w:right="1152" w:bottom="1080" w:left="1152" w:header="720" w:footer="720" w:gutter="0"/>
+      <w:pgMar w:top="864" w:right="1008" w:bottom="864" w:left="1008" w:header="720" w:footer="720" w:gutter="0"/>
       <w:cols w:space="720"/>
       <w:docGrid w:linePitch="360"/>
     </w:sectPr>

</xml_diff>

<commit_message>
docs(week1): remove pitch mention from weekly report to keep it strictly technical
</commit_message>
<xml_diff>
--- a/NCI_MSc_Data_Analytics_Weekly_Progress_Report_Week1.docx
+++ b/NCI_MSc_Data_Analytics_Weekly_Progress_Report_Week1.docx
@@ -282,25 +282,6 @@
           <w:sz w:val="21"/>
         </w:rPr>
         <w:t>1. Summary of Activities Completed This Week</w:t>
-      </w:r>
-    </w:p>
-    <w:p>
-      <w:pPr>
-        <w:pStyle w:val="ListBullet"/>
-        <w:spacing w:after="40"/>
-      </w:pPr>
-      <w:r>
-        <w:rPr>
-          <w:b/>
-          <w:sz w:val="17"/>
-        </w:rPr>
-        <w:t xml:space="preserve">Project Pitch Preparation: </w:t>
-      </w:r>
-      <w:r>
-        <w:rPr>
-          <w:sz w:val="17"/>
-        </w:rPr>
-        <w:t>Prepared a 1-2 minute spoken pitch following the required format: Problem -&gt; Gap -&gt; Idea -&gt; Method -&gt; Contribution, ready for presentation on 1 October.</w:t>
       </w:r>
     </w:p>
     <w:p>
@@ -913,7 +894,7 @@
         <w:rPr>
           <w:sz w:val="17"/>
         </w:rPr>
-        <w:t>Deliver the 1-2 minute oral pitch on 1 October.</w:t>
+        <w:t>Review Week 1 baseline results and refined project plan with Dr. Thanos Staikopoulos during our meeting.</w:t>
       </w:r>
     </w:p>
     <w:p>
@@ -931,7 +912,7 @@
         <w:rPr>
           <w:sz w:val="17"/>
         </w:rPr>
-        <w:t>Review the Week 1 baseline results and refined project plan with Dr. Thanos Staikopoulos during our meeting.</w:t>
+        <w:t>Ingest EMODnet AIS vessel density data for Irish coastal shipping corridors.</w:t>
       </w:r>
     </w:p>
     <w:p>
@@ -949,7 +930,7 @@
         <w:rPr>
           <w:sz w:val="17"/>
         </w:rPr>
-        <w:t>Ingest EMODnet AIS vessel density data for Irish waters.</w:t>
+        <w:t>Start feature engineering for the Component 1 Port Congestion Classifier.</w:t>
       </w:r>
     </w:p>
     <w:p>
@@ -967,7 +948,7 @@
         <w:rPr>
           <w:sz w:val="17"/>
         </w:rPr>
-        <w:t>Start feature engineering for the Component 1 Port Congestion Classifier.</w:t>
+        <w:t>Begin parameter calibration for the synthetic customs clearance delay generator.</w:t>
       </w:r>
     </w:p>
     <w:p>

</xml_diff>